<commit_message>
Add missing Criterion 10 documents from tracker v4
Adds 16 documents (13 Word, 3 Excel) for tracker gaps the existing pack
did not cover, in the same letterhead and table format, and adds them to
the 00-01 index:

- 00-06 corrective action plan, 00-07 explanatory note, 00-08 annex cover
  sheet, 00-09 annex exclusion and sample selection record, 00-10 photo
  log, 00-11 records search and gap disclosure log
- 10.1-07 IAP member register, 10.1-08 IAP establishment chronology
- 10.2-07 alumni name/constitution/committee resolution, 10.2-08 web page
  evidence record
- 10.3-06 survey analysis report, 10.3-07 syllabus before/after comparison
- 10.4.1-05 industrial training course outline (draft), 10.4.1-06 mark
  sheet and attainment
- 10.4.2-07 industry examiner invitation and declaration
- 10.4.3-06 visit assessment mark sheet and attainment

Co-Authored-By: Claude Opus 5.5 <noreply@anthropic.com>
Claude-Session: https://claude.ai/code/session_01TcasD1vQvAMHS5gtvT5oNP
</commit_message>
<xml_diff>
--- a/C10_Missing_Documents_OFFICIAL/00_General/00-01_README_Index_of_Documents.docx
+++ b/C10_Missing_Documents_OFFICIAL/00_General/00-01_README_Index_of_Documents.docx
@@ -1082,7 +1082,7 @@
                 <w:sz w:val="16"/>
                 <w:szCs w:val="16"/>
               </w:rPr>
-              <w:t xml:space="preserve">10.1_Industrial_Advisory_Panel\10.1-01_IAP_Office_Memorandum_and_Terms_of_Reference.docx</w:t>
+              <w:t xml:space="preserve">00_General\00-06_C10_Corrective_Action_Plan.docx</w:t>
             </w:r>
           </w:p>
         </w:tc>
@@ -1108,7 +1108,7 @@
                 <w:sz w:val="16"/>
                 <w:szCs w:val="16"/>
               </w:rPr>
-              <w:t xml:space="preserve">Formally notifies the VC-approved panel and its terms of reference.</w:t>
+              <w:t xml:space="preserve">Dated action plan for every open gap: action, document, owner, target date, status; semester coverage table (Manual 7.2).</w:t>
             </w:r>
           </w:p>
         </w:tc>
@@ -1134,52 +1134,21 @@
                 <w:sz w:val="16"/>
                 <w:szCs w:val="16"/>
               </w:rPr>
-              <w:t xml:space="preserve">- Issue with today's date. It refers to the existing VC approval of 23/07/2025; it does not replace or back-date it.</w:t>
-            </w:r>
-          </w:p>
-          <w:p>
-            <w:pPr>
-              <w:spacing w:after="30" w:before="0" w:line="240"/>
-              <w:jc w:val="left"/>
-            </w:pPr>
-            <w:r>
-              <w:rPr>
-                <w:rFonts w:ascii="Times New Roman" w:cs="Times New Roman" w:eastAsia="Times New Roman" w:hAnsi="Times New Roman"/>
-                <w:sz w:val="16"/>
-                <w:szCs w:val="16"/>
-              </w:rPr>
-              <w:t xml:space="preserve">- Confirm each member's current designation and consent (form 10.1-02) before issuing. Add or remove members only with approval.</w:t>
-            </w:r>
-          </w:p>
-          <w:p>
-            <w:pPr>
-              <w:spacing w:after="30" w:before="0" w:line="240"/>
-              <w:jc w:val="left"/>
-            </w:pPr>
-            <w:r>
-              <w:rPr>
-                <w:rFonts w:ascii="Times New Roman" w:cs="Times New Roman" w:eastAsia="Times New Roman" w:hAnsi="Times New Roman"/>
-                <w:sz w:val="16"/>
-                <w:szCs w:val="16"/>
-              </w:rPr>
-              <w:t xml:space="preserve">- Items marked </w:t>
-            </w:r>
-            <w:r>
-              <w:rPr>
-                <w:rFonts w:ascii="Times New Roman" w:cs="Times New Roman" w:eastAsia="Times New Roman" w:hAnsi="Times New Roman"/>
-                <w:sz w:val="16"/>
-                <w:szCs w:val="16"/>
-                <w:highlight w:val="yellow"/>
-              </w:rPr>
-              <w:t xml:space="preserve">[proposed]</w:t>
-            </w:r>
-            <w:r>
-              <w:rPr>
-                <w:rFonts w:ascii="Times New Roman" w:cs="Times New Roman" w:eastAsia="Times New Roman" w:hAnsi="Times New Roman"/>
-                <w:sz w:val="16"/>
-                <w:szCs w:val="16"/>
-              </w:rPr>
-              <w:t xml:space="preserve"> are suggestions for the Head to decide.</w:t>
+              <w:t xml:space="preserve">- Rows and dates come from the C10 tracker (v4, 17/10/2026). Update the status column at each review; close an item only when the signed document is in the annex.</w:t>
+            </w:r>
+          </w:p>
+          <w:p>
+            <w:pPr>
+              <w:spacing w:after="30" w:before="0" w:line="240"/>
+              <w:jc w:val="left"/>
+            </w:pPr>
+            <w:r>
+              <w:rPr>
+                <w:rFonts w:ascii="Times New Roman" w:cs="Times New Roman" w:eastAsia="Times New Roman" w:hAnsi="Times New Roman"/>
+                <w:sz w:val="16"/>
+                <w:szCs w:val="16"/>
+              </w:rPr>
+              <w:t xml:space="preserve">- Show this plan at the exit meeting when asked how the gaps will be fixed.</w:t>
             </w:r>
           </w:p>
         </w:tc>
@@ -1205,16 +1174,7 @@
                 <w:sz w:val="16"/>
                 <w:szCs w:val="16"/>
               </w:rPr>
-              <w:t xml:space="preserve">Issued by </w:t>
-            </w:r>
-            <w:r>
-              <w:rPr>
-                <w:rFonts w:ascii="Times New Roman" w:cs="Times New Roman" w:eastAsia="Times New Roman" w:hAnsi="Times New Roman"/>
-                <w:sz w:val="16"/>
-                <w:szCs w:val="16"/>
-                <w:highlight w:val="yellow"/>
-              </w:rPr>
-              <w:t xml:space="preserve">[Registrar or Head - per DIU practice]</w:t>
+              <w:t xml:space="preserve">C10 Lead prepares; Head approves</w:t>
             </w:r>
           </w:p>
         </w:tc>
@@ -1240,7 +1200,7 @@
                 <w:sz w:val="16"/>
                 <w:szCs w:val="16"/>
               </w:rPr>
-              <w:t xml:space="preserve">Now (dated on the day of issue)</w:t>
+              <w:t xml:space="preserve">Now; revise at each review</w:t>
             </w:r>
           </w:p>
         </w:tc>
@@ -1266,7 +1226,7 @@
                 <w:sz w:val="16"/>
                 <w:szCs w:val="16"/>
               </w:rPr>
-              <w:t xml:space="preserve">IQAC 10.1 'Memorandum'; ToR</w:t>
+              <w:t xml:space="preserve">Exit-meeting question; Manual 7.2 deviations; all sections</w:t>
             </w:r>
           </w:p>
         </w:tc>
@@ -1298,7 +1258,7 @@
                 <w:sz w:val="16"/>
                 <w:szCs w:val="16"/>
               </w:rPr>
-              <w:t xml:space="preserve">10.1_Industrial_Advisory_Panel\10.1-02_IAP_Member_Consent_and_Profile_Form.docx</w:t>
+              <w:t xml:space="preserve">00_General\00-07_Explanatory_Note_on_Existing_Record.docx</w:t>
             </w:r>
           </w:p>
         </w:tc>
@@ -1324,7 +1284,7 @@
                 <w:sz w:val="16"/>
                 <w:szCs w:val="16"/>
               </w:rPr>
-              <w:t xml:space="preserve">Collects each member's designation, professional qualifications and consent (template 10.1).</w:t>
+              <w:t xml:space="preserve">Dated, signed explanation of a point in an existing record, filed next to it (the original stays unchanged).</w:t>
             </w:r>
           </w:p>
         </w:tc>
@@ -1350,7 +1310,21 @@
                 <w:sz w:val="16"/>
                 <w:szCs w:val="16"/>
               </w:rPr>
-              <w:t xml:space="preserve">- Send one copy to each member. Use the details exactly as the member gives them in the SAR.</w:t>
+              <w:t xml:space="preserve">- Part B lists the 12 points from the file audit that need a note (attendance mismatch, designations, file authors, dates, identities, dual roles).</w:t>
+            </w:r>
+          </w:p>
+          <w:p>
+            <w:pPr>
+              <w:spacing w:after="30" w:before="0" w:line="240"/>
+              <w:jc w:val="left"/>
+            </w:pPr>
+            <w:r>
+              <w:rPr>
+                <w:rFonts w:ascii="Times New Roman" w:cs="Times New Roman" w:eastAsia="Times New Roman" w:hAnsi="Times New Roman"/>
+                <w:sz w:val="16"/>
+                <w:szCs w:val="16"/>
+              </w:rPr>
+              <w:t xml:space="preserve">- Write facts only, after asking the people concerned. One note per point.</w:t>
             </w:r>
           </w:p>
         </w:tc>
@@ -1376,7 +1350,7 @@
                 <w:sz w:val="16"/>
                 <w:szCs w:val="16"/>
               </w:rPr>
-              <w:t xml:space="preserve">Each IAP member fills and signs</w:t>
+              <w:t xml:space="preserve">Person with direct knowledge; Head sees</w:t>
             </w:r>
           </w:p>
         </w:tc>
@@ -1402,7 +1376,7 @@
                 <w:sz w:val="16"/>
                 <w:szCs w:val="16"/>
               </w:rPr>
-              <w:t xml:space="preserve">Before or at the first meeting</w:t>
+              <w:t xml:space="preserve">Now</w:t>
             </w:r>
           </w:p>
         </w:tc>
@@ -1428,7 +1402,7 @@
                 <w:sz w:val="16"/>
                 <w:szCs w:val="16"/>
               </w:rPr>
-              <w:t xml:space="preserve">Template 10.1 qualifications; designation consistency</w:t>
+              <w:t>File audit items 1-5, 15, 18, 21-22, 27, 30, 37, 39; visit questions 3-4</w:t>
             </w:r>
           </w:p>
         </w:tc>
@@ -1460,7 +1434,7 @@
                 <w:sz w:val="16"/>
                 <w:szCs w:val="16"/>
               </w:rPr>
-              <w:t xml:space="preserve">10.1_Industrial_Advisory_Panel\10.1-03_IAP_Meeting_Notice.docx</w:t>
+              <w:t xml:space="preserve">00_General\00-08_Annex_Cover_Sheet.docx</w:t>
             </w:r>
           </w:p>
         </w:tc>
@@ -1486,7 +1460,7 @@
                 <w:sz w:val="16"/>
                 <w:szCs w:val="16"/>
               </w:rPr>
-              <w:t xml:space="preserve">Notice of each IAP meeting (template 10.1 asks for copies of notices).</w:t>
+              <w:t xml:space="preserve">Cover page for each annex: ID, source, semester, where the original is kept, page range, limitations, certification.</w:t>
             </w:r>
           </w:p>
         </w:tc>
@@ -1512,7 +1486,21 @@
                 <w:sz w:val="16"/>
                 <w:szCs w:val="16"/>
               </w:rPr>
-              <w:t xml:space="preserve">- One notice per meeting, numbered in sequence (1st, 2nd, ...). The first genuine meeting is the 1st meeting.</w:t>
+              <w:t xml:space="preserve">- Use for every annex, including undated or partial records (e.g. the training slides), so the evaluator sees what each record shows and its limits.</w:t>
+            </w:r>
+          </w:p>
+          <w:p>
+            <w:pPr>
+              <w:spacing w:after="30" w:before="0" w:line="240"/>
+              <w:jc w:val="left"/>
+            </w:pPr>
+            <w:r>
+              <w:rPr>
+                <w:rFonts w:ascii="Times New Roman" w:cs="Times New Roman" w:eastAsia="Times New Roman" w:hAnsi="Times New Roman"/>
+                <w:sz w:val="16"/>
+                <w:szCs w:val="16"/>
+              </w:rPr>
+              <w:t xml:space="preserve">- Fill the page range after the annex volume is numbered.</w:t>
             </w:r>
           </w:p>
         </w:tc>
@@ -1538,7 +1526,7 @@
                 <w:sz w:val="16"/>
                 <w:szCs w:val="16"/>
               </w:rPr>
-              <w:t xml:space="preserve">Member-Secretary issues</w:t>
+              <w:t xml:space="preserve">C10 Lead certifies; Head sees</w:t>
             </w:r>
           </w:p>
         </w:tc>
@@ -1564,7 +1552,7 @@
                 <w:sz w:val="16"/>
                 <w:szCs w:val="16"/>
               </w:rPr>
-              <w:t xml:space="preserve">At least 7 days before each meeting</w:t>
+              <w:t xml:space="preserve">When assembling the annex</w:t>
             </w:r>
           </w:p>
         </w:tc>
@@ -1590,7 +1578,7 @@
                 <w:sz w:val="16"/>
                 <w:szCs w:val="16"/>
               </w:rPr>
-              <w:t xml:space="preserve">IQAC 10.1 meeting notices</w:t>
+              <w:t xml:space="preserve">IQAC 10.1 'properly indexed annexures'; Manual 7.4</w:t>
             </w:r>
           </w:p>
         </w:tc>
@@ -1622,7 +1610,7 @@
                 <w:sz w:val="16"/>
                 <w:szCs w:val="16"/>
               </w:rPr>
-              <w:t xml:space="preserve">10.1_Industrial_Advisory_Panel\10.1-04_IAP_Meeting_Attendance_Sheet.docx</w:t>
+              <w:t xml:space="preserve">00_General\00-09_Annex_Exclusion_and_Sample_Selection_Record.docx</w:t>
             </w:r>
           </w:p>
         </w:tc>
@@ -1648,7 +1636,7 @@
                 <w:sz w:val="16"/>
                 <w:szCs w:val="16"/>
               </w:rPr>
-              <w:t xml:space="preserve">Attendee list of each IAP meeting (template 10.1).</w:t>
+              <w:t xml:space="preserve">Records which files are left out of the annex and which student work is used as samples, with reasons.</w:t>
             </w:r>
           </w:p>
         </w:tc>
@@ -1674,7 +1662,21 @@
                 <w:sz w:val="16"/>
                 <w:szCs w:val="16"/>
               </w:rPr>
-              <w:t xml:space="preserve">- In-person attendees sign in ink. For online attendees write the joining time and attach the meeting platform's attendance export or a dated screenshot. Never insert or copy signature images.</w:t>
+              <w:t xml:space="preserve">- Pre-filled from the file audit: password file, logo file, link-only file, Cisco certificates, ETE forms, merged PDF; integrity screening of training submissions.</w:t>
+            </w:r>
+          </w:p>
+          <w:p>
+            <w:pPr>
+              <w:spacing w:after="30" w:before="0" w:line="240"/>
+              <w:jc w:val="left"/>
+            </w:pPr>
+            <w:r>
+              <w:rPr>
+                <w:rFonts w:ascii="Times New Roman" w:cs="Times New Roman" w:eastAsia="Times New Roman" w:hAnsi="Times New Roman"/>
+                <w:sz w:val="16"/>
+                <w:szCs w:val="16"/>
+              </w:rPr>
+              <w:t xml:space="preserve">- Part C: state what was actually done about the identical submissions.</w:t>
             </w:r>
           </w:p>
         </w:tc>
@@ -1700,7 +1702,7 @@
                 <w:sz w:val="16"/>
                 <w:szCs w:val="16"/>
               </w:rPr>
-              <w:t xml:space="preserve">Each attendee signs in person; Member-Secretary certifies</w:t>
+              <w:t xml:space="preserve">C10 Lead; Industrial Convener checks; Head approves</w:t>
             </w:r>
           </w:p>
         </w:tc>
@@ -1726,7 +1728,7 @@
                 <w:sz w:val="16"/>
                 <w:szCs w:val="16"/>
               </w:rPr>
-              <w:t xml:space="preserve">At each meeting</w:t>
+              <w:t xml:space="preserve">Before the annex is rebuilt</w:t>
             </w:r>
           </w:p>
         </w:tc>
@@ -1752,7 +1754,7 @@
                 <w:sz w:val="16"/>
                 <w:szCs w:val="16"/>
               </w:rPr>
-              <w:t xml:space="preserve">IQAC 10.1 attendance records</w:t>
+              <w:t xml:space="preserve">Tracker 10.4.1 identical work; 10.4.2 ETE forms; 10.4.3 Cisco certificates</w:t>
             </w:r>
           </w:p>
         </w:tc>
@@ -1784,7 +1786,7 @@
                 <w:sz w:val="16"/>
                 <w:szCs w:val="16"/>
               </w:rPr>
-              <w:t xml:space="preserve">10.1_Industrial_Advisory_Panel\10.1-05_IAP_Meeting_Minutes.docx</w:t>
+              <w:t xml:space="preserve">00_General\00-10_Photograph_Evidence_Log.docx</w:t>
             </w:r>
           </w:p>
         </w:tc>
@@ -1810,7 +1812,7 @@
                 <w:sz w:val="16"/>
                 <w:szCs w:val="16"/>
               </w:rPr>
-              <w:t xml:space="preserve">Records recommendations and the department's response for each IAP meeting.</w:t>
+              <w:t xml:space="preserve">Log of original photographs for IAP meetings, alumni meetings, visits and training.</w:t>
             </w:r>
           </w:p>
         </w:tc>
@@ -1836,21 +1838,7 @@
                 <w:sz w:val="16"/>
                 <w:szCs w:val="16"/>
               </w:rPr>
-              <w:t xml:space="preserve">- Names under 'Present' must match the signed attendance sheet (or the online attendance export).</w:t>
-            </w:r>
-          </w:p>
-          <w:p>
-            <w:pPr>
-              <w:spacing w:after="30" w:before="0" w:line="240"/>
-              <w:jc w:val="left"/>
-            </w:pPr>
-            <w:r>
-              <w:rPr>
-                <w:rFonts w:ascii="Times New Roman" w:cs="Times New Roman" w:eastAsia="Times New Roman" w:hAnsi="Times New Roman"/>
-                <w:sz w:val="16"/>
-                <w:szCs w:val="16"/>
-              </w:rPr>
-              <w:t xml:space="preserve">- Write recommendations in the members' own words where possible and record who made them.</w:t>
+              <w:t xml:space="preserve">- Keep the original camera files with their date information. Print the file name under each photograph in the annex.</w:t>
             </w:r>
           </w:p>
         </w:tc>
@@ -1876,7 +1864,7 @@
                 <w:sz w:val="16"/>
                 <w:szCs w:val="16"/>
               </w:rPr>
-              <w:t xml:space="preserve">Member-Secretary prepares; Chair approves</w:t>
+              <w:t xml:space="preserve">Organiser of each activity</w:t>
             </w:r>
           </w:p>
         </w:tc>
@@ -1902,7 +1890,7 @@
                 <w:sz w:val="16"/>
                 <w:szCs w:val="16"/>
               </w:rPr>
-              <w:t xml:space="preserve">Within 7 days of each meeting</w:t>
+              <w:t xml:space="preserve">At each activity</w:t>
             </w:r>
           </w:p>
         </w:tc>
@@ -1928,7 +1916,7 @@
                 <w:sz w:val="16"/>
                 <w:szCs w:val="16"/>
               </w:rPr>
-              <w:t xml:space="preserve">IQAC 10.1 minutes; 10.3 industry participation</w:t>
+              <w:t xml:space="preserve">IQAC 10.1 'photographs as properly indexed annexures'</w:t>
             </w:r>
           </w:p>
         </w:tc>
@@ -1960,7 +1948,7 @@
                 <w:sz w:val="16"/>
                 <w:szCs w:val="16"/>
               </w:rPr>
-              <w:t xml:space="preserve">10.1_Industrial_Advisory_Panel\10.1-06_IAP_Action_Taken_Report.docx</w:t>
+              <w:t xml:space="preserve">00_General\00-11_Records_Search_and_Gap_Disclosure_Log.docx</w:t>
             </w:r>
           </w:p>
         </w:tc>
@@ -1986,7 +1974,7 @@
                 <w:sz w:val="16"/>
                 <w:szCs w:val="16"/>
               </w:rPr>
-              <w:t xml:space="preserve">Closes the loop: what happened to each IAP recommendation (improvement mechanism, Manual 7.2).</w:t>
+              <w:t xml:space="preserve">Where genuine originals of past activities were looked for, what was found, and the SAR wording for any gap.</w:t>
             </w:r>
           </w:p>
         </w:tc>
@@ -2012,7 +2000,21 @@
                 <w:sz w:val="16"/>
                 <w:szCs w:val="16"/>
               </w:rPr>
-              <w:t xml:space="preserve">- One row per recommendation from the minutes. 'Not accepted' is a valid status - give the reason.</w:t>
+              <w:t xml:space="preserve">- 14 searches are pre-listed (pre-2026 alumni records, signed Report_1 page, Somoy TV/Walton visits, Riseup Labs records, course outlines, calendars, etc.).</w:t>
+            </w:r>
+          </w:p>
+          <w:p>
+            <w:pPr>
+              <w:spacing w:after="30" w:before="0" w:line="240"/>
+              <w:jc w:val="left"/>
+            </w:pPr>
+            <w:r>
+              <w:rPr>
+                <w:rFonts w:ascii="Times New Roman" w:cs="Times New Roman" w:eastAsia="Times New Roman" w:hAnsi="Times New Roman"/>
+                <w:sz w:val="16"/>
+                <w:szCs w:val="16"/>
+              </w:rPr>
+              <w:t xml:space="preserve">- If nothing is found, disclose the gap; never create the record now.</w:t>
             </w:r>
           </w:p>
         </w:tc>
@@ -2038,7 +2040,7 @@
                 <w:sz w:val="16"/>
                 <w:szCs w:val="16"/>
               </w:rPr>
-              <w:t xml:space="preserve">Member-Secretary prepares; Head signs</w:t>
+              <w:t xml:space="preserve">C10 Lead with the owners named in the tracker</w:t>
             </w:r>
           </w:p>
         </w:tc>
@@ -2064,7 +2066,7 @@
                 <w:sz w:val="16"/>
                 <w:szCs w:val="16"/>
               </w:rPr>
-              <w:t xml:space="preserve">Before each IAP meeting</w:t>
+              <w:t xml:space="preserve">Now</w:t>
             </w:r>
           </w:p>
         </w:tc>
@@ -2090,7 +2092,7 @@
                 <w:sz w:val="16"/>
                 <w:szCs w:val="16"/>
               </w:rPr>
-              <w:t xml:space="preserve">10.1 'what happened next'; 10.3 chain</w:t>
+              <w:t xml:space="preserve">Tracker 10.2 earlier records; 10.4.2 Report_1; 10.4.3 visits; visit questions 15, 17</w:t>
             </w:r>
           </w:p>
         </w:tc>
@@ -2122,7 +2124,7 @@
                 <w:sz w:val="16"/>
                 <w:szCs w:val="16"/>
               </w:rPr>
-              <w:t xml:space="preserve">10.2_Alumni_Association\10.2-01_Request_for_ICE_Alumni_Election_Result_and_Recognition.docx</w:t>
+              <w:t xml:space="preserve">10.1_Industrial_Advisory_Panel\10.1-01_IAP_Office_Memorandum_and_Terms_of_Reference.docx</w:t>
             </w:r>
           </w:p>
         </w:tc>
@@ -2148,7 +2150,7 @@
                 <w:sz w:val="16"/>
                 <w:szCs w:val="16"/>
               </w:rPr>
-              <w:t xml:space="preserve">Obtains the official approval/affiliation document for the ICE alumni committee.</w:t>
+              <w:t xml:space="preserve">Formally notifies the VC-approved panel and its terms of reference.</w:t>
             </w:r>
           </w:p>
         </w:tc>
@@ -2174,7 +2176,52 @@
                 <w:sz w:val="16"/>
                 <w:szCs w:val="16"/>
               </w:rPr>
-              <w:t xml:space="preserve">- Send to the DIU Alumni Association Election Commission (or the office named by the Registrar).</w:t>
+              <w:t xml:space="preserve">- Issue with today's date. It refers to the existing VC approval of 23/07/2025; it does not replace or back-date it.</w:t>
+            </w:r>
+          </w:p>
+          <w:p>
+            <w:pPr>
+              <w:spacing w:after="30" w:before="0" w:line="240"/>
+              <w:jc w:val="left"/>
+            </w:pPr>
+            <w:r>
+              <w:rPr>
+                <w:rFonts w:ascii="Times New Roman" w:cs="Times New Roman" w:eastAsia="Times New Roman" w:hAnsi="Times New Roman"/>
+                <w:sz w:val="16"/>
+                <w:szCs w:val="16"/>
+              </w:rPr>
+              <w:t xml:space="preserve">- Confirm each member's current designation and consent (form 10.1-02) before issuing. Add or remove members only with approval.</w:t>
+            </w:r>
+          </w:p>
+          <w:p>
+            <w:pPr>
+              <w:spacing w:after="30" w:before="0" w:line="240"/>
+              <w:jc w:val="left"/>
+            </w:pPr>
+            <w:r>
+              <w:rPr>
+                <w:rFonts w:ascii="Times New Roman" w:cs="Times New Roman" w:eastAsia="Times New Roman" w:hAnsi="Times New Roman"/>
+                <w:sz w:val="16"/>
+                <w:szCs w:val="16"/>
+              </w:rPr>
+              <w:t xml:space="preserve">- Items marked </w:t>
+            </w:r>
+            <w:r>
+              <w:rPr>
+                <w:rFonts w:ascii="Times New Roman" w:cs="Times New Roman" w:eastAsia="Times New Roman" w:hAnsi="Times New Roman"/>
+                <w:sz w:val="16"/>
+                <w:szCs w:val="16"/>
+                <w:highlight w:val="yellow"/>
+              </w:rPr>
+              <w:t xml:space="preserve">[proposed]</w:t>
+            </w:r>
+            <w:r>
+              <w:rPr>
+                <w:rFonts w:ascii="Times New Roman" w:cs="Times New Roman" w:eastAsia="Times New Roman" w:hAnsi="Times New Roman"/>
+                <w:sz w:val="16"/>
+                <w:szCs w:val="16"/>
+              </w:rPr>
+              <w:t xml:space="preserve"> are suggestions for the Head to decide.</w:t>
             </w:r>
           </w:p>
         </w:tc>
@@ -2200,7 +2247,16 @@
                 <w:sz w:val="16"/>
                 <w:szCs w:val="16"/>
               </w:rPr>
-              <w:t xml:space="preserve">Head signs</w:t>
+              <w:t xml:space="preserve">Issued by </w:t>
+            </w:r>
+            <w:r>
+              <w:rPr>
+                <w:rFonts w:ascii="Times New Roman" w:cs="Times New Roman" w:eastAsia="Times New Roman" w:hAnsi="Times New Roman"/>
+                <w:sz w:val="16"/>
+                <w:szCs w:val="16"/>
+                <w:highlight w:val="yellow"/>
+              </w:rPr>
+              <w:t xml:space="preserve">[Registrar or Head - per DIU practice]</w:t>
             </w:r>
           </w:p>
         </w:tc>
@@ -2226,7 +2282,7 @@
                 <w:sz w:val="16"/>
                 <w:szCs w:val="16"/>
               </w:rPr>
-              <w:t xml:space="preserve">Now</w:t>
+              <w:t xml:space="preserve">Now (dated on the day of issue)</w:t>
             </w:r>
           </w:p>
         </w:tc>
@@ -2252,7 +2308,7 @@
                 <w:sz w:val="16"/>
                 <w:szCs w:val="16"/>
               </w:rPr>
-              <w:t xml:space="preserve">IQAC 10.2 'no official approval'; 'without verified institutional affiliation'</w:t>
+              <w:t xml:space="preserve">IQAC 10.1 'Memorandum'; ToR</w:t>
             </w:r>
           </w:p>
         </w:tc>
@@ -2284,7 +2340,7 @@
                 <w:sz w:val="16"/>
                 <w:szCs w:val="16"/>
               </w:rPr>
-              <w:t xml:space="preserve">10.2_Alumni_Association\10.2-02_Corrigendum_for_Alumni_Records.docx</w:t>
+              <w:t xml:space="preserve">10.1_Industrial_Advisory_Panel\10.1-02_IAP_Member_Consent_and_Profile_Form.docx</w:t>
             </w:r>
           </w:p>
         </w:tc>
@@ -2310,7 +2366,7 @@
                 <w:sz w:val="16"/>
                 <w:szCs w:val="16"/>
               </w:rPr>
-              <w:t xml:space="preserve">Honest, dated correction of errors in the 2026 alumni notices/minutes without altering the originals.</w:t>
+              <w:t xml:space="preserve">Collects each member's designation, professional qualifications and consent (template 10.1).</w:t>
             </w:r>
           </w:p>
         </w:tc>
@@ -2336,35 +2392,7 @@
                 <w:sz w:val="16"/>
                 <w:szCs w:val="16"/>
               </w:rPr>
-              <w:t xml:space="preserve">- The 'Original text' column is copied from the existing documents. Fill 'Corrected text' only with what is true, and confirm it with the people concerned.</w:t>
-            </w:r>
-          </w:p>
-          <w:p>
-            <w:pPr>
-              <w:spacing w:after="30" w:before="0" w:line="240"/>
-              <w:jc w:val="left"/>
-            </w:pPr>
-            <w:r>
-              <w:rPr>
-                <w:rFonts w:ascii="Times New Roman" w:cs="Times New Roman" w:eastAsia="Times New Roman" w:hAnsi="Times New Roman"/>
-                <w:sz w:val="16"/>
-                <w:szCs w:val="16"/>
-              </w:rPr>
-              <w:t xml:space="preserve">- Keep the original documents unchanged; file this corrigendum with them.</w:t>
-            </w:r>
-          </w:p>
-          <w:p>
-            <w:pPr>
-              <w:spacing w:after="30" w:before="0" w:line="240"/>
-              <w:jc w:val="left"/>
-            </w:pPr>
-            <w:r>
-              <w:rPr>
-                <w:rFonts w:ascii="Times New Roman" w:cs="Times New Roman" w:eastAsia="Times New Roman" w:hAnsi="Times New Roman"/>
-                <w:sz w:val="16"/>
-                <w:szCs w:val="16"/>
-              </w:rPr>
-              <w:t xml:space="preserve">- Describe truthfully how attendance was recorded at each meeting (e.g. stored signature images were placed on the sheet). Do not sign the old sheets now.</w:t>
+              <w:t xml:space="preserve">- Send one copy to each member. Use the details exactly as the member gives them in the SAR.</w:t>
             </w:r>
           </w:p>
         </w:tc>
@@ -2390,7 +2418,7 @@
                 <w:sz w:val="16"/>
                 <w:szCs w:val="16"/>
               </w:rPr>
-              <w:t xml:space="preserve">General Secretary prepares; President and Head sign</w:t>
+              <w:t xml:space="preserve">Each IAP member fills and signs</w:t>
             </w:r>
           </w:p>
         </w:tc>
@@ -2416,7 +2444,7 @@
                 <w:sz w:val="16"/>
                 <w:szCs w:val="16"/>
               </w:rPr>
-              <w:t xml:space="preserve">Now</w:t>
+              <w:t xml:space="preserve">Before or at the first meeting</w:t>
             </w:r>
           </w:p>
         </w:tc>
@@ -2442,7 +2470,7 @@
                 <w:sz w:val="16"/>
                 <w:szCs w:val="16"/>
               </w:rPr>
-              <w:t xml:space="preserve">IQAC 10.2 records; integrity findings on alumni records</w:t>
+              <w:t xml:space="preserve">Template 10.1 qualifications; designation consistency</w:t>
             </w:r>
           </w:p>
         </w:tc>
@@ -2474,7 +2502,7 @@
                 <w:sz w:val="16"/>
                 <w:szCs w:val="16"/>
               </w:rPr>
-              <w:t xml:space="preserve">10.2_Alumni_Association\10.2-03_Alumni_Meeting_Attendance_Sheet.docx</w:t>
+              <w:t xml:space="preserve">10.1_Industrial_Advisory_Panel\10.1-03_IAP_Meeting_Notice.docx</w:t>
             </w:r>
           </w:p>
         </w:tc>
@@ -2500,7 +2528,7 @@
                 <w:sz w:val="16"/>
                 <w:szCs w:val="16"/>
               </w:rPr>
-              <w:t xml:space="preserve">Genuine attendance record for alumni association meetings (wet ink or online log).</w:t>
+              <w:t xml:space="preserve">Notice of each IAP meeting (template 10.1 asks for copies of notices).</w:t>
             </w:r>
           </w:p>
         </w:tc>
@@ -2526,7 +2554,7 @@
                 <w:sz w:val="16"/>
                 <w:szCs w:val="16"/>
               </w:rPr>
-              <w:t xml:space="preserve">- In person: each member signs in ink on the day. Online: record joining time and attach the platform attendance export. Never paste stored signature images.</w:t>
+              <w:t xml:space="preserve">- One notice per meeting, numbered in sequence (1st, 2nd, ...). The first genuine meeting is the 1st meeting.</w:t>
             </w:r>
           </w:p>
         </w:tc>
@@ -2552,7 +2580,7 @@
                 <w:sz w:val="16"/>
                 <w:szCs w:val="16"/>
               </w:rPr>
-              <w:t xml:space="preserve">Attendees sign; General Secretary certifies</w:t>
+              <w:t xml:space="preserve">Member-Secretary issues</w:t>
             </w:r>
           </w:p>
         </w:tc>
@@ -2578,7 +2606,7 @@
                 <w:sz w:val="16"/>
                 <w:szCs w:val="16"/>
               </w:rPr>
-              <w:t xml:space="preserve">At each meeting</w:t>
+              <w:t xml:space="preserve">At least 7 days before each meeting</w:t>
             </w:r>
           </w:p>
         </w:tc>
@@ -2604,7 +2632,7 @@
                 <w:sz w:val="16"/>
                 <w:szCs w:val="16"/>
               </w:rPr>
-              <w:t xml:space="preserve">IQAC 10.2 'digital signatures'; systematic records</w:t>
+              <w:t xml:space="preserve">IQAC 10.1 meeting notices</w:t>
             </w:r>
           </w:p>
         </w:tc>
@@ -2636,7 +2664,7 @@
                 <w:sz w:val="16"/>
                 <w:szCs w:val="16"/>
               </w:rPr>
-              <w:t xml:space="preserve">10.2_Alumni_Association\10.2-04_Alumni_Department_Feedback_Meeting_Notice_and_Minutes.docx</w:t>
+              <w:t xml:space="preserve">10.1_Industrial_Advisory_Panel\10.1-04_IAP_Meeting_Attendance_Sheet.docx</w:t>
             </w:r>
           </w:p>
         </w:tc>
@@ -2662,7 +2690,7 @@
                 <w:sz w:val="16"/>
                 <w:szCs w:val="16"/>
               </w:rPr>
-              <w:t xml:space="preserve">Alumni give feedback to the department on PEOs and the curriculum (Manual 4.10(ii); C9.3.1).</w:t>
+              <w:t xml:space="preserve">Attendee list of each IAP meeting (template 10.1).</w:t>
             </w:r>
           </w:p>
         </w:tc>
@@ -2688,7 +2716,7 @@
                 <w:sz w:val="16"/>
                 <w:szCs w:val="16"/>
               </w:rPr>
-              <w:t xml:space="preserve">- Part A is the notice; Part B the minutes. Use attendance sheet 10.2-03.</w:t>
+              <w:t xml:space="preserve">- In-person attendees sign in ink. For online attendees write the joining time and attach the meeting platform's attendance export or a dated screenshot. Never insert or copy signature images.</w:t>
             </w:r>
           </w:p>
         </w:tc>
@@ -2714,7 +2742,7 @@
                 <w:sz w:val="16"/>
                 <w:szCs w:val="16"/>
               </w:rPr>
-              <w:t xml:space="preserve">Head and AA President</w:t>
+              <w:t xml:space="preserve">Each attendee signs in person; Member-Secretary certifies</w:t>
             </w:r>
           </w:p>
         </w:tc>
@@ -2740,16 +2768,7 @@
                 <w:sz w:val="16"/>
                 <w:szCs w:val="16"/>
               </w:rPr>
-              <w:t xml:space="preserve">Once per semester </w:t>
-            </w:r>
-            <w:r>
-              <w:rPr>
-                <w:rFonts w:ascii="Times New Roman" w:cs="Times New Roman" w:eastAsia="Times New Roman" w:hAnsi="Times New Roman"/>
-                <w:sz w:val="16"/>
-                <w:szCs w:val="16"/>
-                <w:highlight w:val="yellow"/>
-              </w:rPr>
-              <w:t xml:space="preserve">[proposed]</w:t>
+              <w:t xml:space="preserve">At each meeting</w:t>
             </w:r>
           </w:p>
         </w:tc>
@@ -2775,7 +2794,7 @@
                 <w:sz w:val="16"/>
                 <w:szCs w:val="16"/>
               </w:rPr>
-              <w:t xml:space="preserve">10.2 operating process; 9.3.1 alumni feedback</w:t>
+              <w:t xml:space="preserve">IQAC 10.1 attendance records</w:t>
             </w:r>
           </w:p>
         </w:tc>
@@ -2807,7 +2826,7 @@
                 <w:sz w:val="16"/>
                 <w:szCs w:val="16"/>
               </w:rPr>
-              <w:t xml:space="preserve">10.2_Alumni_Association\10.2-05_Alumni_Survey_Form.docx</w:t>
+              <w:t xml:space="preserve">10.1_Industrial_Advisory_Panel\10.1-05_IAP_Meeting_Minutes.docx</w:t>
             </w:r>
           </w:p>
         </w:tc>
@@ -2833,7 +2852,7 @@
                 <w:sz w:val="16"/>
                 <w:szCs w:val="16"/>
               </w:rPr>
-              <w:t xml:space="preserve">Alumni feedback on PEO/PO achievement and curriculum (also SAR 9.3.1).</w:t>
+              <w:t xml:space="preserve">Records recommendations and the department's response for each IAP meeting.</w:t>
             </w:r>
           </w:p>
         </w:tc>
@@ -2859,7 +2878,21 @@
                 <w:sz w:val="16"/>
                 <w:szCs w:val="16"/>
               </w:rPr>
-              <w:t xml:space="preserve">- Copy the PEO statements exactly from SAR 7.2. Keep all raw responses (paper or online export) and write a short analysis.</w:t>
+              <w:t xml:space="preserve">- Names under 'Present' must match the signed attendance sheet (or the online attendance export).</w:t>
+            </w:r>
+          </w:p>
+          <w:p>
+            <w:pPr>
+              <w:spacing w:after="30" w:before="0" w:line="240"/>
+              <w:jc w:val="left"/>
+            </w:pPr>
+            <w:r>
+              <w:rPr>
+                <w:rFonts w:ascii="Times New Roman" w:cs="Times New Roman" w:eastAsia="Times New Roman" w:hAnsi="Times New Roman"/>
+                <w:sz w:val="16"/>
+                <w:szCs w:val="16"/>
+              </w:rPr>
+              <w:t xml:space="preserve">- Write recommendations in the members' own words where possible and record who made them.</w:t>
             </w:r>
           </w:p>
         </w:tc>
@@ -2885,7 +2918,7 @@
                 <w:sz w:val="16"/>
                 <w:szCs w:val="16"/>
               </w:rPr>
-              <w:t xml:space="preserve">Alumni respond; C10 Lead analyses</w:t>
+              <w:t xml:space="preserve">Member-Secretary prepares; Chair approves</w:t>
             </w:r>
           </w:p>
         </w:tc>
@@ -2911,16 +2944,7 @@
                 <w:sz w:val="16"/>
                 <w:szCs w:val="16"/>
               </w:rPr>
-              <w:t xml:space="preserve">Once per year </w:t>
-            </w:r>
-            <w:r>
-              <w:rPr>
-                <w:rFonts w:ascii="Times New Roman" w:cs="Times New Roman" w:eastAsia="Times New Roman" w:hAnsi="Times New Roman"/>
-                <w:sz w:val="16"/>
-                <w:szCs w:val="16"/>
-                <w:highlight w:val="yellow"/>
-              </w:rPr>
-              <w:t xml:space="preserve">[proposed]</w:t>
+              <w:t xml:space="preserve">Within 7 days of each meeting</w:t>
             </w:r>
           </w:p>
         </w:tc>
@@ -2946,7 +2970,7 @@
                 <w:sz w:val="16"/>
                 <w:szCs w:val="16"/>
               </w:rPr>
-              <w:t xml:space="preserve">10.2 feedback; 9.3.1; 10.3 inputs</w:t>
+              <w:t xml:space="preserve">IQAC 10.1 minutes; 10.3 industry participation</w:t>
             </w:r>
           </w:p>
         </w:tc>
@@ -2978,7 +3002,7 @@
                 <w:sz w:val="16"/>
                 <w:szCs w:val="16"/>
               </w:rPr>
-              <w:t xml:space="preserve">10.2_Alumni_Association\10.2-06_Alumni_Membership_Register.xlsx</w:t>
+              <w:t xml:space="preserve">10.1_Industrial_Advisory_Panel\10.1-06_IAP_Action_Taken_Report.docx</w:t>
             </w:r>
           </w:p>
         </w:tc>
@@ -3004,7 +3028,7 @@
                 <w:sz w:val="16"/>
                 <w:szCs w:val="16"/>
               </w:rPr>
-              <w:t xml:space="preserve">Membership register (template 10.2 'membership').</w:t>
+              <w:t xml:space="preserve">Closes the loop: what happened to each IAP recommendation (improvement mechanism, Manual 7.2).</w:t>
             </w:r>
           </w:p>
         </w:tc>
@@ -3030,7 +3054,7 @@
                 <w:sz w:val="16"/>
                 <w:szCs w:val="16"/>
               </w:rPr>
-              <w:t xml:space="preserve">- Fill only from real membership records (DIUAA portal, forms, receipts).</w:t>
+              <w:t xml:space="preserve">- One row per recommendation from the minutes. 'Not accepted' is a valid status - give the reason.</w:t>
             </w:r>
           </w:p>
         </w:tc>
@@ -3056,7 +3080,7 @@
                 <w:sz w:val="16"/>
                 <w:szCs w:val="16"/>
               </w:rPr>
-              <w:t xml:space="preserve">General Secretary / Alumni focal faculty</w:t>
+              <w:t xml:space="preserve">Member-Secretary prepares; Head signs</w:t>
             </w:r>
           </w:p>
         </w:tc>
@@ -3082,7 +3106,7 @@
                 <w:sz w:val="16"/>
                 <w:szCs w:val="16"/>
               </w:rPr>
-              <w:t xml:space="preserve">Ongoing</w:t>
+              <w:t xml:space="preserve">Before each IAP meeting</w:t>
             </w:r>
           </w:p>
         </w:tc>
@@ -3108,7 +3132,7 @@
                 <w:sz w:val="16"/>
                 <w:szCs w:val="16"/>
               </w:rPr>
-              <w:t xml:space="preserve">Template 10.2 membership information</w:t>
+              <w:t xml:space="preserve">10.1 'what happened next'; 10.3 chain</w:t>
             </w:r>
           </w:p>
         </w:tc>
@@ -3140,7 +3164,7 @@
                 <w:sz w:val="16"/>
                 <w:szCs w:val="16"/>
               </w:rPr>
-              <w:t xml:space="preserve">10.3_Industry_in_Curriculum\10.3-01_Employer_Industry_Feedback_Survey.docx</w:t>
+              <w:t xml:space="preserve">10.1_Industrial_Advisory_Panel\10.1-07_IAP_Member_Register.xlsx</w:t>
             </w:r>
           </w:p>
         </w:tc>
@@ -3166,7 +3190,7 @@
                 <w:sz w:val="16"/>
                 <w:szCs w:val="16"/>
               </w:rPr>
-              <w:t xml:space="preserve">Industry feedback on graduates and curriculum (Manual 4.10 preamble; SAR 9.3.2).</w:t>
+              <w:t xml:space="preserve">Register of IAP members with each designation exactly as it appears in every record, the confirmed designation, qualifications, consent and other roles.</w:t>
             </w:r>
           </w:p>
         </w:tc>
@@ -3192,7 +3216,7 @@
                 <w:sz w:val="16"/>
                 <w:szCs w:val="16"/>
               </w:rPr>
-              <w:t xml:space="preserve">- Send to employers of ICE graduates and to IAP members. Keep every raw response (paper or online export) and a short analysis with the number of responses.</w:t>
+              <w:t xml:space="preserve">- Columns D-G are copied from the minutes and the letter of 21/07/2025. Fill H-L only from the signed form 10.1-02.</w:t>
             </w:r>
           </w:p>
         </w:tc>
@@ -3218,7 +3242,7 @@
                 <w:sz w:val="16"/>
                 <w:szCs w:val="16"/>
               </w:rPr>
-              <w:t xml:space="preserve">Employers respond; C10 Lead analyses</w:t>
+              <w:t xml:space="preserve">Member-Secretary / C10 Lead</w:t>
             </w:r>
           </w:p>
         </w:tc>
@@ -3244,16 +3268,7 @@
                 <w:sz w:val="16"/>
                 <w:szCs w:val="16"/>
               </w:rPr>
-              <w:t xml:space="preserve">Once per year </w:t>
-            </w:r>
-            <w:r>
-              <w:rPr>
-                <w:rFonts w:ascii="Times New Roman" w:cs="Times New Roman" w:eastAsia="Times New Roman" w:hAnsi="Times New Roman"/>
-                <w:sz w:val="16"/>
-                <w:szCs w:val="16"/>
-                <w:highlight w:val="yellow"/>
-              </w:rPr>
-              <w:t xml:space="preserve">[proposed]</w:t>
+              <w:t xml:space="preserve">Now, then at each change</w:t>
             </w:r>
           </w:p>
         </w:tc>
@@ -3279,7 +3294,7 @@
                 <w:sz w:val="16"/>
                 <w:szCs w:val="16"/>
               </w:rPr>
-              <w:t xml:space="preserve">IQAC 10.3 industry participation; 9.3.2</w:t>
+              <w:t xml:space="preserve">Template 10.1 qualifications; designation consistency; independence question</w:t>
             </w:r>
           </w:p>
         </w:tc>
@@ -3311,7 +3326,7 @@
                 <w:sz w:val="16"/>
                 <w:szCs w:val="16"/>
               </w:rPr>
-              <w:t xml:space="preserve">10.3_Industry_in_Curriculum\10.3-02_Curriculum_Review_Form_for_Industry_Experts.docx</w:t>
+              <w:t xml:space="preserve">10.1_Industrial_Advisory_Panel\10.1-08_IAP_Establishment_Record_and_Chronology.docx</w:t>
             </w:r>
           </w:p>
         </w:tc>
@@ -3337,7 +3352,7 @@
                 <w:sz w:val="16"/>
                 <w:szCs w:val="16"/>
               </w:rPr>
-              <w:t xml:space="preserve">Course-by-course written comments from IAP/industry experts on the curriculum.</w:t>
+              <w:t xml:space="preserve">Dated chronology of the IAP's establishment from the records (05/02/2023 to VC approval 23/07/2025) and membership at each stage.</w:t>
             </w:r>
           </w:p>
         </w:tc>
@@ -3363,7 +3378,21 @@
                 <w:sz w:val="16"/>
                 <w:szCs w:val="16"/>
               </w:rPr>
-              <w:t xml:space="preserve">- Attach the current approved syllabus and state its version. Take the completed forms to the Syllabus Modification Committee and record the decisions in 10.3-03.</w:t>
+              <w:t xml:space="preserve">- Head confirms the establishment date stated in the SAR and the explanation of 'formed' (2023) and 'finalized' (2025).</w:t>
+            </w:r>
+          </w:p>
+          <w:p>
+            <w:pPr>
+              <w:spacing w:after="30" w:before="0" w:line="240"/>
+              <w:jc w:val="left"/>
+            </w:pPr>
+            <w:r>
+              <w:rPr>
+                <w:rFonts w:ascii="Times New Roman" w:cs="Times New Roman" w:eastAsia="Times New Roman" w:hAnsi="Times New Roman"/>
+                <w:sz w:val="16"/>
+                <w:szCs w:val="16"/>
+              </w:rPr>
+              <w:t xml:space="preserve">- States plainly that the department meetings were not IAP meetings.</w:t>
             </w:r>
           </w:p>
         </w:tc>
@@ -3389,7 +3418,7 @@
                 <w:sz w:val="16"/>
                 <w:szCs w:val="16"/>
               </w:rPr>
-              <w:t xml:space="preserve">IAP member / industry expert</w:t>
+              <w:t xml:space="preserve">C10 Lead prepares; Head approves</w:t>
             </w:r>
           </w:p>
         </w:tc>
@@ -3415,7 +3444,7 @@
                 <w:sz w:val="16"/>
                 <w:szCs w:val="16"/>
               </w:rPr>
-              <w:t xml:space="preserve">At each curriculum review</w:t>
+              <w:t xml:space="preserve">Now</w:t>
             </w:r>
           </w:p>
         </w:tc>
@@ -3441,7 +3470,7 @@
                 <w:sz w:val="16"/>
                 <w:szCs w:val="16"/>
               </w:rPr>
-              <w:t xml:space="preserve">IQAC 10.3 'participation of industry experts in curriculum review'</w:t>
+              <w:t xml:space="preserve">IQAC 10.1 'establishment date not mentioned'; visit question 3</w:t>
             </w:r>
           </w:p>
         </w:tc>
@@ -3473,7 +3502,7 @@
                 <w:sz w:val="16"/>
                 <w:szCs w:val="16"/>
               </w:rPr>
-              <w:t xml:space="preserve">10.3_Industry_in_Curriculum\10.3-03_Curriculum_Change_Trace_Record.docx</w:t>
+              <w:t xml:space="preserve">10.2_Alumni_Association\10.2-01_Request_for_ICE_Alumni_Election_Result_and_Recognition.docx</w:t>
             </w:r>
           </w:p>
         </w:tc>
@@ -3499,7 +3528,7 @@
                 <w:sz w:val="16"/>
                 <w:szCs w:val="16"/>
               </w:rPr>
-              <w:t xml:space="preserve">Shows the full chain for each industry-driven change: input -&gt; minutes -&gt; decision -&gt; approval -&gt; syllabus version -&gt; review.</w:t>
+              <w:t xml:space="preserve">Obtains the official approval/affiliation document for the ICE alumni committee.</w:t>
             </w:r>
           </w:p>
         </w:tc>
@@ -3525,7 +3554,7 @@
                 <w:sz w:val="16"/>
                 <w:szCs w:val="16"/>
               </w:rPr>
-              <w:t xml:space="preserve">- One row per change. Every column must point to a real document (Annex ID and page). Leave a column blank until that step has really happened.</w:t>
+              <w:t xml:space="preserve">- Send to the DIU Alumni Association Election Commission (or the office named by the Registrar).</w:t>
             </w:r>
           </w:p>
         </w:tc>
@@ -3551,7 +3580,7 @@
                 <w:sz w:val="16"/>
                 <w:szCs w:val="16"/>
               </w:rPr>
-              <w:t xml:space="preserve">Syllabus Modification Committee convener</w:t>
+              <w:t xml:space="preserve">Head signs</w:t>
             </w:r>
           </w:p>
         </w:tc>
@@ -3577,7 +3606,7 @@
                 <w:sz w:val="16"/>
                 <w:szCs w:val="16"/>
               </w:rPr>
-              <w:t xml:space="preserve">Updated after each review</w:t>
+              <w:t xml:space="preserve">Now</w:t>
             </w:r>
           </w:p>
         </w:tc>
@@ -3603,7 +3632,7 @@
                 <w:sz w:val="16"/>
                 <w:szCs w:val="16"/>
               </w:rPr>
-              <w:t xml:space="preserve">IQAC 10.3; Manual 4.10(i)</w:t>
+              <w:t xml:space="preserve">IQAC 10.2 'no official approval'; 'without verified institutional affiliation'</w:t>
             </w:r>
           </w:p>
         </w:tc>
@@ -3635,7 +3664,7 @@
                 <w:sz w:val="16"/>
                 <w:szCs w:val="16"/>
               </w:rPr>
-              <w:t xml:space="preserve">10.3_Industry_in_Curriculum\10.3-04_MoU_Addendum.docx</w:t>
+              <w:t xml:space="preserve">10.2_Alumni_Association\10.2-02_Corrigendum_for_Alumni_Records.docx</w:t>
             </w:r>
           </w:p>
         </w:tc>
@@ -3661,7 +3690,7 @@
                 <w:sz w:val="16"/>
                 <w:szCs w:val="16"/>
               </w:rPr>
-              <w:t xml:space="preserve">Records validity, signatories and agreed activities for an existing MoU (e.g. undated Daffodil Online MoU; Atova renewal).</w:t>
+              <w:t xml:space="preserve">Honest, dated correction of errors in the 2026 alumni notices/minutes without altering the originals.</w:t>
             </w:r>
           </w:p>
         </w:tc>
@@ -3687,21 +3716,35 @@
                 <w:sz w:val="16"/>
                 <w:szCs w:val="16"/>
               </w:rPr>
-              <w:t xml:space="preserve">- Each party dates its own signature on the day it signs. The addendum does not change the date of the original MoU.</w:t>
-            </w:r>
-          </w:p>
-          <w:p>
-            <w:pPr>
-              <w:spacing w:after="30" w:before="0" w:line="240"/>
-              <w:jc w:val="left"/>
-            </w:pPr>
-            <w:r>
-              <w:rPr>
-                <w:rFonts w:ascii="Times New Roman" w:cs="Times New Roman" w:eastAsia="Times New Roman" w:hAnsi="Times New Roman"/>
-                <w:sz w:val="16"/>
-                <w:szCs w:val="16"/>
-              </w:rPr>
-              <w:t xml:space="preserve">- Use for: the Daffodil Online MoU (date line blank, signatory unnamed); renewal of the Atova MoU (dated 25/08/2021, check expiry).</w:t>
+              <w:t xml:space="preserve">- The 'Original text' column is copied from the existing documents. Fill 'Corrected text' only with what is true, and confirm it with the people concerned.</w:t>
+            </w:r>
+          </w:p>
+          <w:p>
+            <w:pPr>
+              <w:spacing w:after="30" w:before="0" w:line="240"/>
+              <w:jc w:val="left"/>
+            </w:pPr>
+            <w:r>
+              <w:rPr>
+                <w:rFonts w:ascii="Times New Roman" w:cs="Times New Roman" w:eastAsia="Times New Roman" w:hAnsi="Times New Roman"/>
+                <w:sz w:val="16"/>
+                <w:szCs w:val="16"/>
+              </w:rPr>
+              <w:t xml:space="preserve">- Keep the original documents unchanged; file this corrigendum with them.</w:t>
+            </w:r>
+          </w:p>
+          <w:p>
+            <w:pPr>
+              <w:spacing w:after="30" w:before="0" w:line="240"/>
+              <w:jc w:val="left"/>
+            </w:pPr>
+            <w:r>
+              <w:rPr>
+                <w:rFonts w:ascii="Times New Roman" w:cs="Times New Roman" w:eastAsia="Times New Roman" w:hAnsi="Times New Roman"/>
+                <w:sz w:val="16"/>
+                <w:szCs w:val="16"/>
+              </w:rPr>
+              <w:t xml:space="preserve">- Describe truthfully how attendance was recorded at each meeting (e.g. stored signature images were placed on the sheet). Do not sign the old sheets now.</w:t>
             </w:r>
           </w:p>
         </w:tc>
@@ -3727,7 +3770,7 @@
                 <w:sz w:val="16"/>
                 <w:szCs w:val="16"/>
               </w:rPr>
-              <w:t xml:space="preserve">Head and company's authorised signatory</w:t>
+              <w:t xml:space="preserve">General Secretary prepares; President and Head sign</w:t>
             </w:r>
           </w:p>
         </w:tc>
@@ -3753,7 +3796,7 @@
                 <w:sz w:val="16"/>
                 <w:szCs w:val="16"/>
               </w:rPr>
-              <w:t xml:space="preserve">Now, dated on signing</w:t>
+              <w:t xml:space="preserve">Now</w:t>
             </w:r>
           </w:p>
         </w:tc>
@@ -3779,7 +3822,7 @@
                 <w:sz w:val="16"/>
                 <w:szCs w:val="16"/>
               </w:rPr>
-              <w:t xml:space="preserve">IQAC 10.3 'role of MoU-based collaboration'</w:t>
+              <w:t xml:space="preserve">IQAC 10.2 records; integrity findings on alumni records</w:t>
             </w:r>
           </w:p>
         </w:tc>
@@ -3811,7 +3854,7 @@
                 <w:sz w:val="16"/>
                 <w:szCs w:val="16"/>
               </w:rPr>
-              <w:t xml:space="preserve">10.3_Industry_in_Curriculum\10.3-05_MoU_Activity_Log.docx</w:t>
+              <w:t xml:space="preserve">10.2_Alumni_Association\10.2-03_Alumni_Meeting_Attendance_Sheet.docx</w:t>
             </w:r>
           </w:p>
         </w:tc>
@@ -3837,7 +3880,7 @@
                 <w:sz w:val="16"/>
                 <w:szCs w:val="16"/>
               </w:rPr>
-              <w:t xml:space="preserve">Shows what each MoU actually delivered.</w:t>
+              <w:t xml:space="preserve">Genuine attendance record for alumni association meetings (wet ink or online log).</w:t>
             </w:r>
           </w:p>
         </w:tc>
@@ -3863,7 +3906,7 @@
                 <w:sz w:val="16"/>
                 <w:szCs w:val="16"/>
               </w:rPr>
-              <w:t xml:space="preserve">- Add a row only for activities that took place, with evidence.</w:t>
+              <w:t xml:space="preserve">- In person: each member signs in ink on the day. Online: record joining time and attach the platform attendance export. Never paste stored signature images.</w:t>
             </w:r>
           </w:p>
         </w:tc>
@@ -3889,7 +3932,7 @@
                 <w:sz w:val="16"/>
                 <w:szCs w:val="16"/>
               </w:rPr>
-              <w:t xml:space="preserve">Industrial Convener</w:t>
+              <w:t xml:space="preserve">Attendees sign; General Secretary certifies</w:t>
             </w:r>
           </w:p>
         </w:tc>
@@ -3915,7 +3958,7 @@
                 <w:sz w:val="16"/>
                 <w:szCs w:val="16"/>
               </w:rPr>
-              <w:t xml:space="preserve">After each activity</w:t>
+              <w:t xml:space="preserve">At each meeting</w:t>
             </w:r>
           </w:p>
         </w:tc>
@@ -3941,7 +3984,7 @@
                 <w:sz w:val="16"/>
                 <w:szCs w:val="16"/>
               </w:rPr>
-              <w:t xml:space="preserve">IQAC 10.3 MoU role</w:t>
+              <w:t xml:space="preserve">IQAC 10.2 'digital signatures'; systematic records</w:t>
             </w:r>
           </w:p>
         </w:tc>
@@ -3973,7 +4016,7 @@
                 <w:sz w:val="16"/>
                 <w:szCs w:val="16"/>
               </w:rPr>
-              <w:t xml:space="preserve">10.4.1_Internship_Industrial_Training\10.4.1-01_Industrial_Training_Internship_Guideline_DRAFT.docx</w:t>
+              <w:t xml:space="preserve">10.2_Alumni_Association\10.2-04_Alumni_Department_Feedback_Meeting_Notice_and_Minutes.docx</w:t>
             </w:r>
           </w:p>
         </w:tc>
@@ -3999,7 +4042,7 @@
                 <w:sz w:val="16"/>
                 <w:szCs w:val="16"/>
               </w:rPr>
-              <w:t xml:space="preserve">States requirement, nature, duration, supervision and assessment (template 10.4.1).</w:t>
+              <w:t xml:space="preserve">Alumni give feedback to the department on PEOs and the curriculum (Manual 4.10(ii); C9.3.1).</w:t>
             </w:r>
           </w:p>
         </w:tc>
@@ -4025,21 +4068,7 @@
                 <w:sz w:val="16"/>
                 <w:szCs w:val="16"/>
               </w:rPr>
-              <w:t xml:space="preserve">- Copy course codes, titles, credits and duration exactly from the approved curriculum. Do not change them here.</w:t>
-            </w:r>
-          </w:p>
-          <w:p>
-            <w:pPr>
-              <w:spacing w:after="30" w:before="0" w:line="240"/>
-              <w:jc w:val="left"/>
-            </w:pPr>
-            <w:r>
-              <w:rPr>
-                <w:rFonts w:ascii="Times New Roman" w:cs="Times New Roman" w:eastAsia="Times New Roman" w:hAnsi="Times New Roman"/>
-                <w:sz w:val="16"/>
-                <w:szCs w:val="16"/>
-              </w:rPr>
-              <w:t xml:space="preserve">- Note: IQAC's '4-8 weeks / 8-12 weeks' is IQAC's benchmark, not a BAETE Manual v2.1 rule; state the duration the approved curriculum sets.</w:t>
+              <w:t xml:space="preserve">- Part A is the notice; Part B the minutes. Use attendance sheet 10.2-03.</w:t>
             </w:r>
           </w:p>
         </w:tc>
@@ -4065,7 +4094,7 @@
                 <w:sz w:val="16"/>
                 <w:szCs w:val="16"/>
               </w:rPr>
-              <w:t xml:space="preserve">Industrial Convener drafts; department approves</w:t>
+              <w:t xml:space="preserve">Head and AA President</w:t>
             </w:r>
           </w:p>
         </w:tc>
@@ -4091,7 +4120,16 @@
                 <w:sz w:val="16"/>
                 <w:szCs w:val="16"/>
               </w:rPr>
-              <w:t xml:space="preserve">Approve at the next department meeting</w:t>
+              <w:t xml:space="preserve">Once per semester </w:t>
+            </w:r>
+            <w:r>
+              <w:rPr>
+                <w:rFonts w:ascii="Times New Roman" w:cs="Times New Roman" w:eastAsia="Times New Roman" w:hAnsi="Times New Roman"/>
+                <w:sz w:val="16"/>
+                <w:szCs w:val="16"/>
+                <w:highlight w:val="yellow"/>
+              </w:rPr>
+              <w:t xml:space="preserve">[proposed]</w:t>
             </w:r>
           </w:p>
         </w:tc>
@@ -4117,7 +4155,7 @@
                 <w:sz w:val="16"/>
                 <w:szCs w:val="16"/>
               </w:rPr>
-              <w:t xml:space="preserve">IQAC 10.4.1 duration; rubric approval</w:t>
+              <w:t xml:space="preserve">10.2 operating process; 9.3.1 alumni feedback</w:t>
             </w:r>
           </w:p>
         </w:tc>
@@ -4149,7 +4187,7 @@
                 <w:sz w:val="16"/>
                 <w:szCs w:val="16"/>
               </w:rPr>
-              <w:t xml:space="preserve">10.4.1_Internship_Industrial_Training\10.4.1-02_Industrial_Training_Rubric_CO-PO_DRAFT.docx</w:t>
+              <w:t xml:space="preserve">10.2_Alumni_Association\10.2-05_Alumni_Survey_Form.docx</w:t>
             </w:r>
           </w:p>
         </w:tc>
@@ -4175,7 +4213,7 @@
                 <w:sz w:val="16"/>
                 <w:szCs w:val="16"/>
               </w:rPr>
-              <w:t xml:space="preserve">Existing 50-mark rubric with level descriptors and proposed CO/PO mapping, for approval.</w:t>
+              <w:t xml:space="preserve">Alumni feedback on PEO/PO achievement and curriculum (also SAR 9.3.1).</w:t>
             </w:r>
           </w:p>
         </w:tc>
@@ -4201,21 +4239,7 @@
                 <w:sz w:val="16"/>
                 <w:szCs w:val="16"/>
               </w:rPr>
-              <w:t xml:space="preserve">- Criteria and marks are taken from the existing rubric (A10.4.1-01, total 50). The PO mapping is a PROPOSAL; fill the CO column from the approved course outline.</w:t>
-            </w:r>
-          </w:p>
-          <w:p>
-            <w:pPr>
-              <w:spacing w:after="30" w:before="0" w:line="240"/>
-              <w:jc w:val="left"/>
-            </w:pPr>
-            <w:r>
-              <w:rPr>
-                <w:rFonts w:ascii="Times New Roman" w:cs="Times New Roman" w:eastAsia="Times New Roman" w:hAnsi="Times New Roman"/>
-                <w:sz w:val="16"/>
-                <w:szCs w:val="16"/>
-              </w:rPr>
-              <w:t xml:space="preserve">- Attendance is a condition of eligibility rather than a learning outcome. Consider moving its 10 marks to outcome-based criteria before approval.</w:t>
+              <w:t xml:space="preserve">- Copy the PEO statements exactly from SAR 7.2. Keep all raw responses (paper or online export) and write a short analysis.</w:t>
             </w:r>
           </w:p>
         </w:tc>
@@ -4241,7 +4265,7 @@
                 <w:sz w:val="16"/>
                 <w:szCs w:val="16"/>
               </w:rPr>
-              <w:t xml:space="preserve">Industrial Convener drafts; department approves</w:t>
+              <w:t xml:space="preserve">Alumni respond; C10 Lead analyses</w:t>
             </w:r>
           </w:p>
         </w:tc>
@@ -4267,7 +4291,16 @@
                 <w:sz w:val="16"/>
                 <w:szCs w:val="16"/>
               </w:rPr>
-              <w:t xml:space="preserve">Approve before the next offering</w:t>
+              <w:t xml:space="preserve">Once per year </w:t>
+            </w:r>
+            <w:r>
+              <w:rPr>
+                <w:rFonts w:ascii="Times New Roman" w:cs="Times New Roman" w:eastAsia="Times New Roman" w:hAnsi="Times New Roman"/>
+                <w:sz w:val="16"/>
+                <w:szCs w:val="16"/>
+                <w:highlight w:val="yellow"/>
+              </w:rPr>
+              <w:t xml:space="preserve">[proposed]</w:t>
             </w:r>
           </w:p>
         </w:tc>
@@ -4293,7 +4326,7 @@
                 <w:sz w:val="16"/>
                 <w:szCs w:val="16"/>
               </w:rPr>
-              <w:t xml:space="preserve">IQAC 10.4.1 rubric approval; outcome assessment</w:t>
+              <w:t xml:space="preserve">10.2 feedback; 9.3.1; 10.3 inputs</w:t>
             </w:r>
           </w:p>
         </w:tc>
@@ -4325,7 +4358,7 @@
                 <w:sz w:val="16"/>
                 <w:szCs w:val="16"/>
               </w:rPr>
-              <w:t xml:space="preserve">10.4.1_Internship_Industrial_Training\10.4.1-03_Host_Organisation_Supervisor_Evaluation_Form.docx</w:t>
+              <w:t xml:space="preserve">10.2_Alumni_Association\10.2-06_Alumni_Membership_Register.xlsx</w:t>
             </w:r>
           </w:p>
         </w:tc>
@@ -4351,7 +4384,7 @@
                 <w:sz w:val="16"/>
                 <w:szCs w:val="16"/>
               </w:rPr>
-              <w:t xml:space="preserve">Industry supervisor's assessment of each trainee (direct evidence from industry).</w:t>
+              <w:t xml:space="preserve">Membership register (template 10.2 'membership').</w:t>
             </w:r>
           </w:p>
         </w:tc>
@@ -4377,7 +4410,7 @@
                 <w:sz w:val="16"/>
                 <w:szCs w:val="16"/>
               </w:rPr>
-              <w:t xml:space="preserve">- The host fills this in, then signs, stamps and dates it. Keep the original; do not complete it on the host's behalf.</w:t>
+              <w:t xml:space="preserve">- Fill only from real membership records (DIUAA portal, forms, receipts).</w:t>
             </w:r>
           </w:p>
         </w:tc>
@@ -4403,7 +4436,7 @@
                 <w:sz w:val="16"/>
                 <w:szCs w:val="16"/>
               </w:rPr>
-              <w:t xml:space="preserve">Host supervisor fills, signs and stamps</w:t>
+              <w:t xml:space="preserve">General Secretary / Alumni focal faculty</w:t>
             </w:r>
           </w:p>
         </w:tc>
@@ -4429,7 +4462,7 @@
                 <w:sz w:val="16"/>
                 <w:szCs w:val="16"/>
               </w:rPr>
-              <w:t xml:space="preserve">At the end of each placement</w:t>
+              <w:t xml:space="preserve">Ongoing</w:t>
             </w:r>
           </w:p>
         </w:tc>
@@ -4455,7 +4488,7 @@
                 <w:sz w:val="16"/>
                 <w:szCs w:val="16"/>
               </w:rPr>
-              <w:t xml:space="preserve">10.4.1 performance assessment; Manual 4.10(iii)</w:t>
+              <w:t xml:space="preserve">Template 10.2 membership information</w:t>
             </w:r>
           </w:p>
         </w:tc>
@@ -4487,7 +4520,7 @@
                 <w:sz w:val="16"/>
                 <w:szCs w:val="16"/>
               </w:rPr>
-              <w:t xml:space="preserve">10.4.1_Internship_Industrial_Training\10.4.1-04_Placement_Request_Letter.docx</w:t>
+              <w:t xml:space="preserve">10.2_Alumni_Association\10.2-07_Alumni_Name_Constitution_and_Committee_Resolution.docx</w:t>
             </w:r>
           </w:p>
         </w:tc>
@@ -4513,7 +4546,7 @@
                 <w:sz w:val="16"/>
                 <w:szCs w:val="16"/>
               </w:rPr>
-              <w:t xml:space="preserve">Department's request for placements and the host's acceptance (placement evidence).</w:t>
+              <w:t xml:space="preserve">Resolution adopting one official name, a signed and dated constitution and a committee composition that matches the DIU rules; declares other roles.</w:t>
             </w:r>
           </w:p>
         </w:tc>
@@ -4539,7 +4572,21 @@
                 <w:sz w:val="16"/>
                 <w:szCs w:val="16"/>
               </w:rPr>
-              <w:t xml:space="preserve">- Attach the list of students (name, ID). File the returned acceptance slip with this letter.</w:t>
+              <w:t xml:space="preserve">- Use the name DIUAA confirms in reply to 10.2-01. Fill the 11 posts exactly as listed in the DIU Rules (Version 2).</w:t>
+            </w:r>
+          </w:p>
+          <w:p>
+            <w:pPr>
+              <w:spacing w:after="30" w:before="0" w:line="240"/>
+              <w:jc w:val="left"/>
+            </w:pPr>
+            <w:r>
+              <w:rPr>
+                <w:rFonts w:ascii="Times New Roman" w:cs="Times New Roman" w:eastAsia="Times New Roman" w:hAnsi="Times New Roman"/>
+                <w:sz w:val="16"/>
+                <w:szCs w:val="16"/>
+              </w:rPr>
+              <w:t xml:space="preserve">- Hold it at a real meeting with attendance sheet 10.2-03.</w:t>
             </w:r>
           </w:p>
         </w:tc>
@@ -4565,7 +4612,7 @@
                 <w:sz w:val="16"/>
                 <w:szCs w:val="16"/>
               </w:rPr>
-              <w:t xml:space="preserve">Head signs; host returns the acceptance slip</w:t>
+              <w:t xml:space="preserve">General Secretary prepares; President approves; Head sees</w:t>
             </w:r>
           </w:p>
         </w:tc>
@@ -4591,7 +4638,7 @@
                 <w:sz w:val="16"/>
                 <w:szCs w:val="16"/>
               </w:rPr>
-              <w:t xml:space="preserve">Before each placement</w:t>
+              <w:t xml:space="preserve">After the reply to 10.2-01</w:t>
             </w:r>
           </w:p>
         </w:tc>
@@ -4617,7 +4664,7 @@
                 <w:sz w:val="16"/>
                 <w:szCs w:val="16"/>
               </w:rPr>
-              <w:t xml:space="preserve">10.4.1 supporting documents</w:t>
+              <w:t xml:space="preserve">IQAC 10.2 inconsistent name; constitution unsigned; 10 vs 11 posts</w:t>
             </w:r>
           </w:p>
         </w:tc>
@@ -4649,7 +4696,7 @@
                 <w:sz w:val="16"/>
                 <w:szCs w:val="16"/>
               </w:rPr>
-              <w:t xml:space="preserve">10.4.2_Final_Year_Design_Project\10.4.2-01_Final_Year_Project_Proposal_Form_ICE.docx</w:t>
+              <w:t xml:space="preserve">10.2_Alumni_Association\10.2-08_Alumni_Web_Page_Evidence_Record.docx</w:t>
             </w:r>
           </w:p>
         </w:tc>
@@ -4675,7 +4722,7 @@
                 <w:sz w:val="16"/>
                 <w:szCs w:val="16"/>
               </w:rPr>
-              <w:t xml:space="preserve">Same layout as the department's existing proposal form (Capstone Project/Thesis/Internship Proposal Form), with industry partner, co-supervisor and complex-problem fields added; no ETE headings.</w:t>
+              <w:t xml:space="preserve">Records the working web link of the association with a dated screenshot (template 10.2 web link).</w:t>
             </w:r>
           </w:p>
         </w:tc>
@@ -4701,21 +4748,7 @@
                 <w:sz w:val="16"/>
                 <w:szCs w:val="16"/>
               </w:rPr>
-              <w:t xml:space="preserve">- Program: B.Sc. in Information and Communication Engineering. Use for new proposals only; do not refill or re-sign old forms.</w:t>
-            </w:r>
-          </w:p>
-          <w:p>
-            <w:pPr>
-              <w:spacing w:after="30" w:before="0" w:line="240"/>
-              <w:jc w:val="left"/>
-            </w:pPr>
-            <w:r>
-              <w:rPr>
-                <w:rFonts w:ascii="Times New Roman" w:cs="Times New Roman" w:eastAsia="Times New Roman" w:hAnsi="Times New Roman"/>
-                <w:sz w:val="16"/>
-                <w:szCs w:val="16"/>
-              </w:rPr>
-              <w:t xml:space="preserve">- Keep the existing serial-number system (e.g. SP25001).</w:t>
+              <w:t xml:space="preserve">- Take a full-page screenshot showing the address bar and the date. Re-check before submission and before the visit.</w:t>
             </w:r>
           </w:p>
         </w:tc>
@@ -4741,7 +4774,7 @@
                 <w:sz w:val="16"/>
                 <w:szCs w:val="16"/>
               </w:rPr>
-              <w:t xml:space="preserve">Students fill; supervisor, committee and Head sign</w:t>
+              <w:t xml:space="preserve">Alumni focal faculty</w:t>
             </w:r>
           </w:p>
         </w:tc>
@@ -4767,7 +4800,7 @@
                 <w:sz w:val="16"/>
                 <w:szCs w:val="16"/>
               </w:rPr>
-              <w:t xml:space="preserve">From the next semester</w:t>
+              <w:t xml:space="preserve">Now; re-check before the visit</w:t>
             </w:r>
           </w:p>
         </w:tc>
@@ -4793,7 +4826,7 @@
                 <w:sz w:val="16"/>
                 <w:szCs w:val="16"/>
               </w:rPr>
-              <w:t xml:space="preserve">IQAC 10.4.2 topic selection / supervision; ETE leftovers</w:t>
+              <w:t xml:space="preserve">Template 10.2 web link</w:t>
             </w:r>
           </w:p>
         </w:tc>
@@ -4825,7 +4858,7 @@
                 <w:sz w:val="16"/>
                 <w:szCs w:val="16"/>
               </w:rPr>
-              <w:t xml:space="preserve">10.4.2_Final_Year_Design_Project\10.4.2-02_Industry_Topic_Proposal_Form.docx</w:t>
+              <w:t xml:space="preserve">10.3_Industry_in_Curriculum\10.3-01_Employer_Industry_Feedback_Survey.docx</w:t>
             </w:r>
           </w:p>
         </w:tc>
@@ -4851,7 +4884,7 @@
                 <w:sz w:val="16"/>
                 <w:szCs w:val="16"/>
               </w:rPr>
-              <w:t xml:space="preserve">Evidence that a company proposed a project topic.</w:t>
+              <w:t xml:space="preserve">Industry feedback on graduates and curriculum (Manual 4.10 preamble; SAR 9.3.2).</w:t>
             </w:r>
           </w:p>
         </w:tc>
@@ -4877,7 +4910,7 @@
                 <w:sz w:val="16"/>
                 <w:szCs w:val="16"/>
               </w:rPr>
-              <w:t xml:space="preserve">- Filled and signed by the company. File with the student group's proposal form.</w:t>
+              <w:t xml:space="preserve">- Send to employers of ICE graduates and to IAP members. Keep every raw response (paper or online export) and a short analysis with the number of responses.</w:t>
             </w:r>
           </w:p>
         </w:tc>
@@ -4903,7 +4936,7 @@
                 <w:sz w:val="16"/>
                 <w:szCs w:val="16"/>
               </w:rPr>
-              <w:t xml:space="preserve">Company representative signs and stamps</w:t>
+              <w:t xml:space="preserve">Employers respond; C10 Lead analyses</w:t>
             </w:r>
           </w:p>
         </w:tc>
@@ -4929,7 +4962,16 @@
                 <w:sz w:val="16"/>
                 <w:szCs w:val="16"/>
               </w:rPr>
-              <w:t xml:space="preserve">Before topic allocation</w:t>
+              <w:t xml:space="preserve">Once per year </w:t>
+            </w:r>
+            <w:r>
+              <w:rPr>
+                <w:rFonts w:ascii="Times New Roman" w:cs="Times New Roman" w:eastAsia="Times New Roman" w:hAnsi="Times New Roman"/>
+                <w:sz w:val="16"/>
+                <w:szCs w:val="16"/>
+                <w:highlight w:val="yellow"/>
+              </w:rPr>
+              <w:t xml:space="preserve">[proposed]</w:t>
             </w:r>
           </w:p>
         </w:tc>
@@ -4955,7 +4997,7 @@
                 <w:sz w:val="16"/>
                 <w:szCs w:val="16"/>
               </w:rPr>
-              <w:t xml:space="preserve">IQAC 10.4.2 'project topic selection'</w:t>
+              <w:t xml:space="preserve">IQAC 10.3 industry participation; 9.3.2</w:t>
             </w:r>
           </w:p>
         </w:tc>
@@ -4987,7 +5029,7 @@
                 <w:sz w:val="16"/>
                 <w:szCs w:val="16"/>
               </w:rPr>
-              <w:t xml:space="preserve">10.4.2_Final_Year_Design_Project\10.4.2-03_Industry_Co-Supervisor_Appointment_Letter.docx</w:t>
+              <w:t xml:space="preserve">10.3_Industry_in_Curriculum\10.3-02_Curriculum_Review_Form_for_Industry_Experts.docx</w:t>
             </w:r>
           </w:p>
         </w:tc>
@@ -5013,7 +5055,7 @@
                 <w:sz w:val="16"/>
                 <w:szCs w:val="16"/>
               </w:rPr>
-              <w:t xml:space="preserve">Formal appointment, consent and meeting log for industry co-supervision.</w:t>
+              <w:t xml:space="preserve">Course-by-course written comments from IAP/industry experts on the curriculum.</w:t>
             </w:r>
           </w:p>
         </w:tc>
@@ -5039,7 +5081,7 @@
                 <w:sz w:val="16"/>
                 <w:szCs w:val="16"/>
               </w:rPr>
-              <w:t xml:space="preserve">- Keep the signed consent and the meeting log with the project file.</w:t>
+              <w:t xml:space="preserve">- Attach the current approved syllabus and state its version. Take the completed forms to the Syllabus Modification Committee and record the decisions in 10.3-03.</w:t>
             </w:r>
           </w:p>
         </w:tc>
@@ -5065,7 +5107,7 @@
                 <w:sz w:val="16"/>
                 <w:szCs w:val="16"/>
               </w:rPr>
-              <w:t xml:space="preserve">Head signs; co-supervisor accepts</w:t>
+              <w:t xml:space="preserve">IAP member / industry expert</w:t>
             </w:r>
           </w:p>
         </w:tc>
@@ -5091,7 +5133,7 @@
                 <w:sz w:val="16"/>
                 <w:szCs w:val="16"/>
               </w:rPr>
-              <w:t xml:space="preserve">At project start</w:t>
+              <w:t xml:space="preserve">At each curriculum review</w:t>
             </w:r>
           </w:p>
         </w:tc>
@@ -5117,7 +5159,7 @@
                 <w:sz w:val="16"/>
                 <w:szCs w:val="16"/>
               </w:rPr>
-              <w:t xml:space="preserve">IQAC 10.4.2 'supervision of project activities'</w:t>
+              <w:t xml:space="preserve">IQAC 10.3 'participation of industry experts in curriculum review'</w:t>
             </w:r>
           </w:p>
         </w:tc>
@@ -5149,7 +5191,7 @@
                 <w:sz w:val="16"/>
                 <w:szCs w:val="16"/>
               </w:rPr>
-              <w:t xml:space="preserve">10.4.2_Final_Year_Design_Project\10.4.2-04_Capstone_Rubric_Full_CO-PO_DRAFT.docx</w:t>
+              <w:t xml:space="preserve">10.3_Industry_in_Curriculum\10.3-03_Curriculum_Change_Trace_Record.docx</w:t>
             </w:r>
           </w:p>
         </w:tc>
@@ -5175,7 +5217,7 @@
                 <w:sz w:val="16"/>
                 <w:szCs w:val="16"/>
               </w:rPr>
-              <w:t xml:space="preserve">Completes the existing 30/30/40 split with rubrics for the report and defence, a proposed PO mapping and an industry examiner role.</w:t>
+              <w:t xml:space="preserve">Shows the full chain for each industry-driven change: input -&gt; minutes -&gt; decision -&gt; approval -&gt; syllabus version -&gt; review.</w:t>
             </w:r>
           </w:p>
         </w:tc>
@@ -5201,21 +5243,7 @@
                 <w:sz w:val="16"/>
                 <w:szCs w:val="16"/>
               </w:rPr>
-              <w:t xml:space="preserve">- Part A keeps the existing supervisor rubric (A10.4.2-01: Teamwork 10, Communication 10, Time Management 10). Parts B and C, and all PO mappings, are PROPOSALS to approve or edit.</w:t>
-            </w:r>
-          </w:p>
-          <w:p>
-            <w:pPr>
-              <w:spacing w:after="30" w:before="0" w:line="240"/>
-              <w:jc w:val="left"/>
-            </w:pPr>
-            <w:r>
-              <w:rPr>
-                <w:rFonts w:ascii="Times New Roman" w:cs="Times New Roman" w:eastAsia="Times New Roman" w:hAnsi="Times New Roman"/>
-                <w:sz w:val="16"/>
-                <w:szCs w:val="16"/>
-              </w:rPr>
-              <w:t xml:space="preserve">- Where the board includes an industry examiner, that examiner scores Part C on the evaluation sheet 10.4.2-05.</w:t>
+              <w:t xml:space="preserve">- One row per change. Every column must point to a real document (Annex ID and page). Leave a column blank until that step has really happened.</w:t>
             </w:r>
           </w:p>
         </w:tc>
@@ -5241,7 +5269,7 @@
                 <w:sz w:val="16"/>
                 <w:szCs w:val="16"/>
               </w:rPr>
-              <w:t xml:space="preserve">Capstone Coordinator drafts; department approves</w:t>
+              <w:t xml:space="preserve">Syllabus Modification Committee convener</w:t>
             </w:r>
           </w:p>
         </w:tc>
@@ -5267,7 +5295,7 @@
                 <w:sz w:val="16"/>
                 <w:szCs w:val="16"/>
               </w:rPr>
-              <w:t xml:space="preserve">Approve before the next defence</w:t>
+              <w:t xml:space="preserve">Updated after each review</w:t>
             </w:r>
           </w:p>
         </w:tc>
@@ -5293,7 +5321,7 @@
                 <w:sz w:val="16"/>
                 <w:szCs w:val="16"/>
               </w:rPr>
-              <w:t xml:space="preserve">IQAC 10.4.2 'project assessment'; capstone rubric gaps</w:t>
+              <w:t xml:space="preserve">IQAC 10.3; Manual 4.10(i)</w:t>
             </w:r>
           </w:p>
         </w:tc>
@@ -5325,7 +5353,7 @@
                 <w:sz w:val="16"/>
                 <w:szCs w:val="16"/>
               </w:rPr>
-              <w:t xml:space="preserve">10.4.2_Final_Year_Design_Project\10.4.2-05_Defence_Evaluation_Sheet.docx</w:t>
+              <w:t xml:space="preserve">10.3_Industry_in_Curriculum\10.3-04_MoU_Addendum.docx</w:t>
             </w:r>
           </w:p>
         </w:tc>
@@ -5351,7 +5379,7 @@
                 <w:sz w:val="16"/>
                 <w:szCs w:val="16"/>
               </w:rPr>
-              <w:t xml:space="preserve">Dated, signed board record with examiner names, roles and marks (replaces undated, unsigned sheets).</w:t>
+              <w:t xml:space="preserve">Records validity, signatories and agreed activities for an existing MoU (e.g. undated Daffodil Online MoU; Atova renewal).</w:t>
             </w:r>
           </w:p>
         </w:tc>
@@ -5377,7 +5405,21 @@
                 <w:sz w:val="16"/>
                 <w:szCs w:val="16"/>
               </w:rPr>
-              <w:t xml:space="preserve">- Write examiner names and roles in full. Each examiner signs and dates on the day. Students sign their own attendance.</w:t>
+              <w:t xml:space="preserve">- Each party dates its own signature on the day it signs. The addendum does not change the date of the original MoU.</w:t>
+            </w:r>
+          </w:p>
+          <w:p>
+            <w:pPr>
+              <w:spacing w:after="30" w:before="0" w:line="240"/>
+              <w:jc w:val="left"/>
+            </w:pPr>
+            <w:r>
+              <w:rPr>
+                <w:rFonts w:ascii="Times New Roman" w:cs="Times New Roman" w:eastAsia="Times New Roman" w:hAnsi="Times New Roman"/>
+                <w:sz w:val="16"/>
+                <w:szCs w:val="16"/>
+              </w:rPr>
+              <w:t xml:space="preserve">- Use for: the Daffodil Online MoU (date line blank, signatory unnamed); renewal of the Atova MoU (dated 25/08/2021, check expiry).</w:t>
             </w:r>
           </w:p>
         </w:tc>
@@ -5403,7 +5445,7 @@
                 <w:sz w:val="16"/>
                 <w:szCs w:val="16"/>
               </w:rPr>
-              <w:t xml:space="preserve">Each board member signs; coordinator files</w:t>
+              <w:t xml:space="preserve">Head and company's authorised signatory</w:t>
             </w:r>
           </w:p>
         </w:tc>
@@ -5429,7 +5471,7 @@
                 <w:sz w:val="16"/>
                 <w:szCs w:val="16"/>
               </w:rPr>
-              <w:t xml:space="preserve">At each pre-defence/defence</w:t>
+              <w:t xml:space="preserve">Now, dated on signing</w:t>
             </w:r>
           </w:p>
         </w:tc>
@@ -5455,7 +5497,7 @@
                 <w:sz w:val="16"/>
                 <w:szCs w:val="16"/>
               </w:rPr>
-              <w:t xml:space="preserve">IQAC 10.4.2 assessment; integrity findings on pre-defence sheets</w:t>
+              <w:t xml:space="preserve">IQAC 10.3 'role of MoU-based collaboration'</w:t>
             </w:r>
           </w:p>
         </w:tc>
@@ -5487,7 +5529,7 @@
                 <w:sz w:val="16"/>
                 <w:szCs w:val="16"/>
               </w:rPr>
-              <w:t xml:space="preserve">10.4.2_Final_Year_Design_Project\10.4.2-06_Project_List_Spring2023-Fall2025.xlsx</w:t>
+              <w:t xml:space="preserve">10.3_Industry_in_Curriculum\10.3-05_MoU_Activity_Log.docx</w:t>
             </w:r>
           </w:p>
         </w:tc>
@@ -5513,7 +5555,7 @@
                 <w:sz w:val="16"/>
                 <w:szCs w:val="16"/>
               </w:rPr>
-              <w:t xml:space="preserve">Semester-wise list of final-year projects in SAR 6.3 format, with industry involvement.</w:t>
+              <w:t xml:space="preserve">Shows what each MoU actually delivered.</w:t>
             </w:r>
           </w:p>
         </w:tc>
@@ -5539,7 +5581,7 @@
                 <w:sz w:val="16"/>
                 <w:szCs w:val="16"/>
               </w:rPr>
-              <w:t xml:space="preserve">- Two rows are pre-filled from the reports in the annex folder; fill the rest from registration and result records.</w:t>
+              <w:t xml:space="preserve">- Add a row only for activities that took place, with evidence.</w:t>
             </w:r>
           </w:p>
         </w:tc>
@@ -5565,7 +5607,7 @@
                 <w:sz w:val="16"/>
                 <w:szCs w:val="16"/>
               </w:rPr>
-              <w:t xml:space="preserve">Capstone Coordinator (from registration records)</w:t>
+              <w:t xml:space="preserve">Industrial Convener</w:t>
             </w:r>
           </w:p>
         </w:tc>
@@ -5591,7 +5633,7 @@
                 <w:sz w:val="16"/>
                 <w:szCs w:val="16"/>
               </w:rPr>
-              <w:t xml:space="preserve">Now</w:t>
+              <w:t xml:space="preserve">After each activity</w:t>
             </w:r>
           </w:p>
         </w:tc>
@@ -5617,7 +5659,7 @@
                 <w:sz w:val="16"/>
                 <w:szCs w:val="16"/>
               </w:rPr>
-              <w:t xml:space="preserve">SAR 6.3; 10.4.2 numbers per semester</w:t>
+              <w:t xml:space="preserve">IQAC 10.3 MoU role</w:t>
             </w:r>
           </w:p>
         </w:tc>
@@ -5649,7 +5691,7 @@
                 <w:sz w:val="16"/>
                 <w:szCs w:val="16"/>
               </w:rPr>
-              <w:t xml:space="preserve">10.4.3_Industry_Visits\10.4.3-01_Visit_Permission_Request_Letter.docx</w:t>
+              <w:t xml:space="preserve">10.3_Industry_in_Curriculum\10.3-06_Survey_Analysis_Report.docx</w:t>
             </w:r>
           </w:p>
         </w:tc>
@@ -5675,7 +5717,7 @@
                 <w:sz w:val="16"/>
                 <w:szCs w:val="16"/>
               </w:rPr>
-              <w:t xml:space="preserve">Request with learning objectives and named faculty in charge.</w:t>
+              <w:t xml:space="preserve">Analysis of the employer or alumni survey: response rate, PO/PEO ratings, themes, actions linked to the change trace record.</w:t>
             </w:r>
           </w:p>
         </w:tc>
@@ -5701,7 +5743,7 @@
                 <w:sz w:val="16"/>
                 <w:szCs w:val="16"/>
               </w:rPr>
-              <w:t xml:space="preserve">- File the company's reply with this letter. Every visit in the visit register needs a letter and a reply.</w:t>
+              <w:t xml:space="preserve">- Use only the raw responses on file and give their number. Carry each action into 10.3-03.</w:t>
             </w:r>
           </w:p>
         </w:tc>
@@ -5727,7 +5769,7 @@
                 <w:sz w:val="16"/>
                 <w:szCs w:val="16"/>
               </w:rPr>
-              <w:t xml:space="preserve">Head signs</w:t>
+              <w:t xml:space="preserve">C10 Lead prepares; Head approves</w:t>
             </w:r>
           </w:p>
         </w:tc>
@@ -5753,7 +5795,7 @@
                 <w:sz w:val="16"/>
                 <w:szCs w:val="16"/>
               </w:rPr>
-              <w:t xml:space="preserve">At least 2 weeks before each visit</w:t>
+              <w:t xml:space="preserve">After each survey</w:t>
             </w:r>
           </w:p>
         </w:tc>
@@ -5779,7 +5821,7 @@
                 <w:sz w:val="16"/>
                 <w:szCs w:val="16"/>
               </w:rPr>
-              <w:t xml:space="preserve">IQAC 10.4.3 faculty involvement; visit letters</w:t>
+              <w:t xml:space="preserve">Tracker General (industry feedback); 10.3; SAR 9.3.1-9.3.2</w:t>
             </w:r>
           </w:p>
         </w:tc>
@@ -5811,7 +5853,7 @@
                 <w:sz w:val="16"/>
                 <w:szCs w:val="16"/>
               </w:rPr>
-              <w:t xml:space="preserve">10.4.3_Industry_Visits\10.4.3-02_Visit_Notice_and_Attendance.docx</w:t>
+              <w:t xml:space="preserve">10.3_Industry_in_Curriculum\10.3-07_Syllabus_Before_After_Comparison.docx</w:t>
             </w:r>
           </w:p>
         </w:tc>
@@ -5837,7 +5879,7 @@
                 <w:sz w:val="16"/>
                 <w:szCs w:val="16"/>
               </w:rPr>
-              <w:t xml:space="preserve">Notice to students plus a departure/return attendance sheet.</w:t>
+              <w:t xml:space="preserve">Before/after text of each syllabus change, its source of input and approval reference.</w:t>
             </w:r>
           </w:p>
         </w:tc>
@@ -5863,7 +5905,7 @@
                 <w:sz w:val="16"/>
                 <w:szCs w:val="16"/>
               </w:rPr>
-              <w:t xml:space="preserve">- Students sign in ink at departure and return.</w:t>
+              <w:t xml:space="preserve">- Copy text exactly from the two approved syllabus versions and attach their pages.</w:t>
             </w:r>
           </w:p>
         </w:tc>
@@ -5889,7 +5931,7 @@
                 <w:sz w:val="16"/>
                 <w:szCs w:val="16"/>
               </w:rPr>
-              <w:t xml:space="preserve">Faculty in charge</w:t>
+              <w:t xml:space="preserve">Syllabus Modification Committee</w:t>
             </w:r>
           </w:p>
         </w:tc>
@@ -5915,7 +5957,7 @@
                 <w:sz w:val="16"/>
                 <w:szCs w:val="16"/>
               </w:rPr>
-              <w:t xml:space="preserve">Before and on the visit day</w:t>
+              <w:t xml:space="preserve">After each approved change</w:t>
             </w:r>
           </w:p>
         </w:tc>
@@ -5941,7 +5983,7 @@
                 <w:sz w:val="16"/>
                 <w:szCs w:val="16"/>
               </w:rPr>
-              <w:t xml:space="preserve">10.4.3 nature of visits; supporting documents</w:t>
+              <w:t xml:space="preserve">Tracker 10.3 before/after syllabus; Manual 4.10(i)</w:t>
             </w:r>
           </w:p>
         </w:tc>
@@ -5973,7 +6015,7 @@
                 <w:sz w:val="16"/>
                 <w:szCs w:val="16"/>
               </w:rPr>
-              <w:t xml:space="preserve">10.4.3_Industry_Visits\10.4.3-03_Faculty_Visit_Report.docx</w:t>
+              <w:t xml:space="preserve">10.4.1_Internship_Industrial_Training\10.4.1-01_Industrial_Training_Internship_Guideline_DRAFT.docx</w:t>
             </w:r>
           </w:p>
         </w:tc>
@@ -5999,7 +6041,7 @@
                 <w:sz w:val="16"/>
                 <w:szCs w:val="16"/>
               </w:rPr>
-              <w:t xml:space="preserve">Faculty-signed record of each visit (planning, supervision, documentation).</w:t>
+              <w:t xml:space="preserve">States requirement, nature, duration, supervision and assessment (template 10.4.1).</w:t>
             </w:r>
           </w:p>
         </w:tc>
@@ -6025,7 +6067,21 @@
                 <w:sz w:val="16"/>
                 <w:szCs w:val="16"/>
               </w:rPr>
-              <w:t xml:space="preserve">- Attach the permission letter, the company's reply, the attendance sheet and the photo file names.</w:t>
+              <w:t xml:space="preserve">- Copy course codes, titles, credits and duration exactly from the approved curriculum. Do not change them here.</w:t>
+            </w:r>
+          </w:p>
+          <w:p>
+            <w:pPr>
+              <w:spacing w:after="30" w:before="0" w:line="240"/>
+              <w:jc w:val="left"/>
+            </w:pPr>
+            <w:r>
+              <w:rPr>
+                <w:rFonts w:ascii="Times New Roman" w:cs="Times New Roman" w:eastAsia="Times New Roman" w:hAnsi="Times New Roman"/>
+                <w:sz w:val="16"/>
+                <w:szCs w:val="16"/>
+              </w:rPr>
+              <w:t xml:space="preserve">- Note: IQAC's '4-8 weeks / 8-12 weeks' is IQAC's benchmark, not a BAETE Manual v2.1 rule; state the duration the approved curriculum sets.</w:t>
             </w:r>
           </w:p>
         </w:tc>
@@ -6051,7 +6107,7 @@
                 <w:sz w:val="16"/>
                 <w:szCs w:val="16"/>
               </w:rPr>
-              <w:t xml:space="preserve">Faculty in charge</w:t>
+              <w:t xml:space="preserve">Industrial Convener drafts; department approves</w:t>
             </w:r>
           </w:p>
         </w:tc>
@@ -6077,7 +6133,7 @@
                 <w:sz w:val="16"/>
                 <w:szCs w:val="16"/>
               </w:rPr>
-              <w:t xml:space="preserve">Within 7 days of the visit</w:t>
+              <w:t xml:space="preserve">Approve at the next department meeting</w:t>
             </w:r>
           </w:p>
         </w:tc>
@@ -6103,7 +6159,7 @@
                 <w:sz w:val="16"/>
                 <w:szCs w:val="16"/>
               </w:rPr>
-              <w:t xml:space="preserve">IQAC 10.4.3 'limited involvement of the faculty'</w:t>
+              <w:t xml:space="preserve">IQAC 10.4.1 duration; rubric approval</w:t>
             </w:r>
           </w:p>
         </w:tc>
@@ -6135,7 +6191,7 @@
                 <w:sz w:val="16"/>
                 <w:szCs w:val="16"/>
               </w:rPr>
-              <w:t xml:space="preserve">10.4.3_Industry_Visits\10.4.3-04_Student_Visit_Report_and_Assessment_Rubric.docx</w:t>
+              <w:t xml:space="preserve">10.4.1_Internship_Industrial_Training\10.4.1-02_Industrial_Training_Rubric_CO-PO_DRAFT.docx</w:t>
             </w:r>
           </w:p>
         </w:tc>
@@ -6161,7 +6217,7 @@
                 <w:sz w:val="16"/>
                 <w:szCs w:val="16"/>
               </w:rPr>
-              <w:t xml:space="preserve">Report template plus a marked rubric mapped to POs (how learning is assessed).</w:t>
+              <w:t xml:space="preserve">Existing 50-mark rubric with level descriptors and proposed CO/PO mapping, for approval.</w:t>
             </w:r>
           </w:p>
         </w:tc>
@@ -6187,21 +6243,21 @@
                 <w:sz w:val="16"/>
                 <w:szCs w:val="16"/>
               </w:rPr>
-              <w:t xml:space="preserve">- Students write sections 1-6. Faculty fill in the assessment box. The PO mapping is a PROPOSAL for department approval.</w:t>
-            </w:r>
-          </w:p>
-          <w:p>
-            <w:pPr>
-              <w:spacing w:after="30" w:before="0" w:line="240"/>
-              <w:jc w:val="left"/>
-            </w:pPr>
-            <w:r>
-              <w:rPr>
-                <w:rFonts w:ascii="Times New Roman" w:cs="Times New Roman" w:eastAsia="Times New Roman" w:hAnsi="Times New Roman"/>
-                <w:sz w:val="16"/>
-                <w:szCs w:val="16"/>
-              </w:rPr>
-              <w:t xml:space="preserve">- Do not attach unrelated certificates (e.g. online-course certificates) to visit reports.</w:t>
+              <w:t xml:space="preserve">- Criteria and marks are taken from the existing rubric (A10.4.1-01, total 50). The PO mapping is a PROPOSAL; fill the CO column from the approved course outline.</w:t>
+            </w:r>
+          </w:p>
+          <w:p>
+            <w:pPr>
+              <w:spacing w:after="30" w:before="0" w:line="240"/>
+              <w:jc w:val="left"/>
+            </w:pPr>
+            <w:r>
+              <w:rPr>
+                <w:rFonts w:ascii="Times New Roman" w:cs="Times New Roman" w:eastAsia="Times New Roman" w:hAnsi="Times New Roman"/>
+                <w:sz w:val="16"/>
+                <w:szCs w:val="16"/>
+              </w:rPr>
+              <w:t xml:space="preserve">- Attendance is a condition of eligibility rather than a learning outcome. Consider moving its 10 marks to outcome-based criteria before approval.</w:t>
             </w:r>
           </w:p>
         </w:tc>
@@ -6227,7 +6283,7 @@
                 <w:sz w:val="16"/>
                 <w:szCs w:val="16"/>
               </w:rPr>
-              <w:t xml:space="preserve">Student writes; faculty marks</w:t>
+              <w:t xml:space="preserve">Industrial Convener drafts; department approves</w:t>
             </w:r>
           </w:p>
         </w:tc>
@@ -6253,7 +6309,7 @@
                 <w:sz w:val="16"/>
                 <w:szCs w:val="16"/>
               </w:rPr>
-              <w:t xml:space="preserve">After each visit</w:t>
+              <w:t xml:space="preserve">Approve before the next offering</w:t>
             </w:r>
           </w:p>
         </w:tc>
@@ -6279,7 +6335,7 @@
                 <w:sz w:val="16"/>
                 <w:szCs w:val="16"/>
               </w:rPr>
-              <w:t xml:space="preserve">IQAC 10.4.3 'how student learning and outcome achievement ... are assessed'</w:t>
+              <w:t xml:space="preserve">IQAC 10.4.1 rubric approval; outcome assessment</w:t>
             </w:r>
           </w:p>
         </w:tc>
@@ -6311,6 +6367,2478 @@
                 <w:sz w:val="16"/>
                 <w:szCs w:val="16"/>
               </w:rPr>
+              <w:t xml:space="preserve">10.4.1_Internship_Industrial_Training\10.4.1-03_Host_Organisation_Supervisor_Evaluation_Form.docx</w:t>
+            </w:r>
+          </w:p>
+        </w:tc>
+        <w:tc>
+          <w:tcPr>
+            <w:tcW w:type="dxa" w:w="2704"/>
+            <w:tcMar>
+              <w:top w:type="dxa" w:w="50"/>
+              <w:left w:type="dxa" w:w="90"/>
+              <w:bottom w:type="dxa" w:w="50"/>
+              <w:right w:type="dxa" w:w="90"/>
+            </w:tcMar>
+            <w:vAlign w:val="top"/>
+          </w:tcPr>
+          <w:p>
+            <w:pPr>
+              <w:spacing w:after="30" w:before="0" w:line="240"/>
+              <w:jc w:val="left"/>
+            </w:pPr>
+            <w:r>
+              <w:rPr>
+                <w:rFonts w:ascii="Times New Roman" w:cs="Times New Roman" w:eastAsia="Times New Roman" w:hAnsi="Times New Roman"/>
+                <w:sz w:val="16"/>
+                <w:szCs w:val="16"/>
+              </w:rPr>
+              <w:t xml:space="preserve">Industry supervisor's assessment of each trainee (direct evidence from industry).</w:t>
+            </w:r>
+          </w:p>
+        </w:tc>
+        <w:tc>
+          <w:tcPr>
+            <w:tcW w:type="dxa" w:w="3659"/>
+            <w:tcMar>
+              <w:top w:type="dxa" w:w="50"/>
+              <w:left w:type="dxa" w:w="90"/>
+              <w:bottom w:type="dxa" w:w="50"/>
+              <w:right w:type="dxa" w:w="90"/>
+            </w:tcMar>
+            <w:vAlign w:val="top"/>
+          </w:tcPr>
+          <w:p>
+            <w:pPr>
+              <w:spacing w:after="30" w:before="0" w:line="240"/>
+              <w:jc w:val="left"/>
+            </w:pPr>
+            <w:r>
+              <w:rPr>
+                <w:rFonts w:ascii="Times New Roman" w:cs="Times New Roman" w:eastAsia="Times New Roman" w:hAnsi="Times New Roman"/>
+                <w:sz w:val="16"/>
+                <w:szCs w:val="16"/>
+              </w:rPr>
+              <w:t xml:space="preserve">- The host fills this in, then signs, stamps and dates it. Keep the original; do not complete it on the host's behalf.</w:t>
+            </w:r>
+          </w:p>
+        </w:tc>
+        <w:tc>
+          <w:tcPr>
+            <w:tcW w:type="dxa" w:w="1909"/>
+            <w:tcMar>
+              <w:top w:type="dxa" w:w="50"/>
+              <w:left w:type="dxa" w:w="90"/>
+              <w:bottom w:type="dxa" w:w="50"/>
+              <w:right w:type="dxa" w:w="90"/>
+            </w:tcMar>
+            <w:vAlign w:val="top"/>
+          </w:tcPr>
+          <w:p>
+            <w:pPr>
+              <w:spacing w:after="30" w:before="0" w:line="240"/>
+              <w:jc w:val="left"/>
+            </w:pPr>
+            <w:r>
+              <w:rPr>
+                <w:rFonts w:ascii="Times New Roman" w:cs="Times New Roman" w:eastAsia="Times New Roman" w:hAnsi="Times New Roman"/>
+                <w:sz w:val="16"/>
+                <w:szCs w:val="16"/>
+              </w:rPr>
+              <w:t xml:space="preserve">Host supervisor fills, signs and stamps</w:t>
+            </w:r>
+          </w:p>
+        </w:tc>
+        <w:tc>
+          <w:tcPr>
+            <w:tcW w:type="dxa" w:w="1431"/>
+            <w:tcMar>
+              <w:top w:type="dxa" w:w="50"/>
+              <w:left w:type="dxa" w:w="90"/>
+              <w:bottom w:type="dxa" w:w="50"/>
+              <w:right w:type="dxa" w:w="90"/>
+            </w:tcMar>
+            <w:vAlign w:val="top"/>
+          </w:tcPr>
+          <w:p>
+            <w:pPr>
+              <w:spacing w:after="30" w:before="0" w:line="240"/>
+              <w:jc w:val="left"/>
+            </w:pPr>
+            <w:r>
+              <w:rPr>
+                <w:rFonts w:ascii="Times New Roman" w:cs="Times New Roman" w:eastAsia="Times New Roman" w:hAnsi="Times New Roman"/>
+                <w:sz w:val="16"/>
+                <w:szCs w:val="16"/>
+              </w:rPr>
+              <w:t xml:space="preserve">At the end of each placement</w:t>
+            </w:r>
+          </w:p>
+        </w:tc>
+        <w:tc>
+          <w:tcPr>
+            <w:tcW w:type="dxa" w:w="2072"/>
+            <w:tcMar>
+              <w:top w:type="dxa" w:w="50"/>
+              <w:left w:type="dxa" w:w="90"/>
+              <w:bottom w:type="dxa" w:w="50"/>
+              <w:right w:type="dxa" w:w="90"/>
+            </w:tcMar>
+            <w:vAlign w:val="top"/>
+          </w:tcPr>
+          <w:p>
+            <w:pPr>
+              <w:spacing w:after="30" w:before="0" w:line="240"/>
+              <w:jc w:val="left"/>
+            </w:pPr>
+            <w:r>
+              <w:rPr>
+                <w:rFonts w:ascii="Times New Roman" w:cs="Times New Roman" w:eastAsia="Times New Roman" w:hAnsi="Times New Roman"/>
+                <w:sz w:val="16"/>
+                <w:szCs w:val="16"/>
+              </w:rPr>
+              <w:t xml:space="preserve">10.4.1 performance assessment; Manual 4.10(iii)</w:t>
+            </w:r>
+          </w:p>
+        </w:tc>
+      </w:tr>
+      <w:tr>
+        <w:trPr>
+          <w:cantSplit/>
+          <w:tblHeader w:val="off"/>
+        </w:trPr>
+        <w:tc>
+          <w:tcPr>
+            <w:tcW w:type="dxa" w:w="2863"/>
+            <w:tcMar>
+              <w:top w:type="dxa" w:w="50"/>
+              <w:left w:type="dxa" w:w="90"/>
+              <w:bottom w:type="dxa" w:w="50"/>
+              <w:right w:type="dxa" w:w="90"/>
+            </w:tcMar>
+            <w:vAlign w:val="top"/>
+          </w:tcPr>
+          <w:p>
+            <w:pPr>
+              <w:spacing w:after="30" w:before="0" w:line="240"/>
+              <w:jc w:val="left"/>
+            </w:pPr>
+            <w:r>
+              <w:rPr>
+                <w:rFonts w:ascii="Times New Roman" w:cs="Times New Roman" w:eastAsia="Times New Roman" w:hAnsi="Times New Roman"/>
+                <w:sz w:val="16"/>
+                <w:szCs w:val="16"/>
+              </w:rPr>
+              <w:t xml:space="preserve">10.4.1_Internship_Industrial_Training\10.4.1-04_Placement_Request_Letter.docx</w:t>
+            </w:r>
+          </w:p>
+        </w:tc>
+        <w:tc>
+          <w:tcPr>
+            <w:tcW w:type="dxa" w:w="2704"/>
+            <w:tcMar>
+              <w:top w:type="dxa" w:w="50"/>
+              <w:left w:type="dxa" w:w="90"/>
+              <w:bottom w:type="dxa" w:w="50"/>
+              <w:right w:type="dxa" w:w="90"/>
+            </w:tcMar>
+            <w:vAlign w:val="top"/>
+          </w:tcPr>
+          <w:p>
+            <w:pPr>
+              <w:spacing w:after="30" w:before="0" w:line="240"/>
+              <w:jc w:val="left"/>
+            </w:pPr>
+            <w:r>
+              <w:rPr>
+                <w:rFonts w:ascii="Times New Roman" w:cs="Times New Roman" w:eastAsia="Times New Roman" w:hAnsi="Times New Roman"/>
+                <w:sz w:val="16"/>
+                <w:szCs w:val="16"/>
+              </w:rPr>
+              <w:t xml:space="preserve">Department's request for placements and the host's acceptance (placement evidence).</w:t>
+            </w:r>
+          </w:p>
+        </w:tc>
+        <w:tc>
+          <w:tcPr>
+            <w:tcW w:type="dxa" w:w="3659"/>
+            <w:tcMar>
+              <w:top w:type="dxa" w:w="50"/>
+              <w:left w:type="dxa" w:w="90"/>
+              <w:bottom w:type="dxa" w:w="50"/>
+              <w:right w:type="dxa" w:w="90"/>
+            </w:tcMar>
+            <w:vAlign w:val="top"/>
+          </w:tcPr>
+          <w:p>
+            <w:pPr>
+              <w:spacing w:after="30" w:before="0" w:line="240"/>
+              <w:jc w:val="left"/>
+            </w:pPr>
+            <w:r>
+              <w:rPr>
+                <w:rFonts w:ascii="Times New Roman" w:cs="Times New Roman" w:eastAsia="Times New Roman" w:hAnsi="Times New Roman"/>
+                <w:sz w:val="16"/>
+                <w:szCs w:val="16"/>
+              </w:rPr>
+              <w:t xml:space="preserve">- Attach the list of students (name, ID). File the returned acceptance slip with this letter.</w:t>
+            </w:r>
+          </w:p>
+        </w:tc>
+        <w:tc>
+          <w:tcPr>
+            <w:tcW w:type="dxa" w:w="1909"/>
+            <w:tcMar>
+              <w:top w:type="dxa" w:w="50"/>
+              <w:left w:type="dxa" w:w="90"/>
+              <w:bottom w:type="dxa" w:w="50"/>
+              <w:right w:type="dxa" w:w="90"/>
+            </w:tcMar>
+            <w:vAlign w:val="top"/>
+          </w:tcPr>
+          <w:p>
+            <w:pPr>
+              <w:spacing w:after="30" w:before="0" w:line="240"/>
+              <w:jc w:val="left"/>
+            </w:pPr>
+            <w:r>
+              <w:rPr>
+                <w:rFonts w:ascii="Times New Roman" w:cs="Times New Roman" w:eastAsia="Times New Roman" w:hAnsi="Times New Roman"/>
+                <w:sz w:val="16"/>
+                <w:szCs w:val="16"/>
+              </w:rPr>
+              <w:t xml:space="preserve">Head signs; host returns the acceptance slip</w:t>
+            </w:r>
+          </w:p>
+        </w:tc>
+        <w:tc>
+          <w:tcPr>
+            <w:tcW w:type="dxa" w:w="1431"/>
+            <w:tcMar>
+              <w:top w:type="dxa" w:w="50"/>
+              <w:left w:type="dxa" w:w="90"/>
+              <w:bottom w:type="dxa" w:w="50"/>
+              <w:right w:type="dxa" w:w="90"/>
+            </w:tcMar>
+            <w:vAlign w:val="top"/>
+          </w:tcPr>
+          <w:p>
+            <w:pPr>
+              <w:spacing w:after="30" w:before="0" w:line="240"/>
+              <w:jc w:val="left"/>
+            </w:pPr>
+            <w:r>
+              <w:rPr>
+                <w:rFonts w:ascii="Times New Roman" w:cs="Times New Roman" w:eastAsia="Times New Roman" w:hAnsi="Times New Roman"/>
+                <w:sz w:val="16"/>
+                <w:szCs w:val="16"/>
+              </w:rPr>
+              <w:t xml:space="preserve">Before each placement</w:t>
+            </w:r>
+          </w:p>
+        </w:tc>
+        <w:tc>
+          <w:tcPr>
+            <w:tcW w:type="dxa" w:w="2072"/>
+            <w:tcMar>
+              <w:top w:type="dxa" w:w="50"/>
+              <w:left w:type="dxa" w:w="90"/>
+              <w:bottom w:type="dxa" w:w="50"/>
+              <w:right w:type="dxa" w:w="90"/>
+            </w:tcMar>
+            <w:vAlign w:val="top"/>
+          </w:tcPr>
+          <w:p>
+            <w:pPr>
+              <w:spacing w:after="30" w:before="0" w:line="240"/>
+              <w:jc w:val="left"/>
+            </w:pPr>
+            <w:r>
+              <w:rPr>
+                <w:rFonts w:ascii="Times New Roman" w:cs="Times New Roman" w:eastAsia="Times New Roman" w:hAnsi="Times New Roman"/>
+                <w:sz w:val="16"/>
+                <w:szCs w:val="16"/>
+              </w:rPr>
+              <w:t xml:space="preserve">10.4.1 supporting documents</w:t>
+            </w:r>
+          </w:p>
+        </w:tc>
+      </w:tr>
+      <w:tr>
+        <w:trPr>
+          <w:cantSplit/>
+          <w:tblHeader w:val="off"/>
+        </w:trPr>
+        <w:tc>
+          <w:tcPr>
+            <w:tcW w:type="dxa" w:w="2863"/>
+            <w:tcMar>
+              <w:top w:type="dxa" w:w="50"/>
+              <w:left w:type="dxa" w:w="90"/>
+              <w:bottom w:type="dxa" w:w="50"/>
+              <w:right w:type="dxa" w:w="90"/>
+            </w:tcMar>
+            <w:vAlign w:val="top"/>
+          </w:tcPr>
+          <w:p>
+            <w:pPr>
+              <w:spacing w:after="30" w:before="0" w:line="240"/>
+              <w:jc w:val="left"/>
+            </w:pPr>
+            <w:r>
+              <w:rPr>
+                <w:rFonts w:ascii="Times New Roman" w:cs="Times New Roman" w:eastAsia="Times New Roman" w:hAnsi="Times New Roman"/>
+                <w:sz w:val="16"/>
+                <w:szCs w:val="16"/>
+              </w:rPr>
+              <w:t xml:space="preserve">10.4.1_Internship_Industrial_Training\10.4.1-05_Industrial_Training_Course_Outline_DRAFT.docx</w:t>
+            </w:r>
+          </w:p>
+        </w:tc>
+        <w:tc>
+          <w:tcPr>
+            <w:tcW w:type="dxa" w:w="2704"/>
+            <w:tcMar>
+              <w:top w:type="dxa" w:w="50"/>
+              <w:left w:type="dxa" w:w="90"/>
+              <w:bottom w:type="dxa" w:w="50"/>
+              <w:right w:type="dxa" w:w="90"/>
+            </w:tcMar>
+            <w:vAlign w:val="top"/>
+          </w:tcPr>
+          <w:p>
+            <w:pPr>
+              <w:spacing w:after="30" w:before="0" w:line="240"/>
+              <w:jc w:val="left"/>
+            </w:pPr>
+            <w:r>
+              <w:rPr>
+                <w:rFonts w:ascii="Times New Roman" w:cs="Times New Roman" w:eastAsia="Times New Roman" w:hAnsi="Times New Roman"/>
+                <w:sz w:val="16"/>
+                <w:szCs w:val="16"/>
+              </w:rPr>
+              <w:t xml:space="preserve">Course outline for ICE 496 / ICE 498: credits, duration, COs mapped to POs, activities, assessment.</w:t>
+            </w:r>
+          </w:p>
+        </w:tc>
+        <w:tc>
+          <w:tcPr>
+            <w:tcW w:type="dxa" w:w="3659"/>
+            <w:tcMar>
+              <w:top w:type="dxa" w:w="50"/>
+              <w:left w:type="dxa" w:w="90"/>
+              <w:bottom w:type="dxa" w:w="50"/>
+              <w:right w:type="dxa" w:w="90"/>
+            </w:tcMar>
+            <w:vAlign w:val="top"/>
+          </w:tcPr>
+          <w:p>
+            <w:pPr>
+              <w:spacing w:after="30" w:before="0" w:line="240"/>
+              <w:jc w:val="left"/>
+            </w:pPr>
+            <w:r>
+              <w:rPr>
+                <w:rFonts w:ascii="Times New Roman" w:cs="Times New Roman" w:eastAsia="Times New Roman" w:hAnsi="Times New Roman"/>
+                <w:sz w:val="16"/>
+                <w:szCs w:val="16"/>
+              </w:rPr>
+              <w:t xml:space="preserve">- One outline per course. Copy code, title, credits and duration from the approved curriculum. COs and the PO mapping are PROPOSALS for approval.</w:t>
+            </w:r>
+          </w:p>
+        </w:tc>
+        <w:tc>
+          <w:tcPr>
+            <w:tcW w:type="dxa" w:w="1909"/>
+            <w:tcMar>
+              <w:top w:type="dxa" w:w="50"/>
+              <w:left w:type="dxa" w:w="90"/>
+              <w:bottom w:type="dxa" w:w="50"/>
+              <w:right w:type="dxa" w:w="90"/>
+            </w:tcMar>
+            <w:vAlign w:val="top"/>
+          </w:tcPr>
+          <w:p>
+            <w:pPr>
+              <w:spacing w:after="30" w:before="0" w:line="240"/>
+              <w:jc w:val="left"/>
+            </w:pPr>
+            <w:r>
+              <w:rPr>
+                <w:rFonts w:ascii="Times New Roman" w:cs="Times New Roman" w:eastAsia="Times New Roman" w:hAnsi="Times New Roman"/>
+                <w:sz w:val="16"/>
+                <w:szCs w:val="16"/>
+              </w:rPr>
+              <w:t xml:space="preserve">Industrial Convener drafts; department approves</w:t>
+            </w:r>
+          </w:p>
+        </w:tc>
+        <w:tc>
+          <w:tcPr>
+            <w:tcW w:type="dxa" w:w="1431"/>
+            <w:tcMar>
+              <w:top w:type="dxa" w:w="50"/>
+              <w:left w:type="dxa" w:w="90"/>
+              <w:bottom w:type="dxa" w:w="50"/>
+              <w:right w:type="dxa" w:w="90"/>
+            </w:tcMar>
+            <w:vAlign w:val="top"/>
+          </w:tcPr>
+          <w:p>
+            <w:pPr>
+              <w:spacing w:after="30" w:before="0" w:line="240"/>
+              <w:jc w:val="left"/>
+            </w:pPr>
+            <w:r>
+              <w:rPr>
+                <w:rFonts w:ascii="Times New Roman" w:cs="Times New Roman" w:eastAsia="Times New Roman" w:hAnsi="Times New Roman"/>
+                <w:sz w:val="16"/>
+                <w:szCs w:val="16"/>
+              </w:rPr>
+              <w:t xml:space="preserve">Approve at the next department meeting</w:t>
+            </w:r>
+          </w:p>
+        </w:tc>
+        <w:tc>
+          <w:tcPr>
+            <w:tcW w:type="dxa" w:w="2072"/>
+            <w:tcMar>
+              <w:top w:type="dxa" w:w="50"/>
+              <w:left w:type="dxa" w:w="90"/>
+              <w:bottom w:type="dxa" w:w="50"/>
+              <w:right w:type="dxa" w:w="90"/>
+            </w:tcMar>
+            <w:vAlign w:val="top"/>
+          </w:tcPr>
+          <w:p>
+            <w:pPr>
+              <w:spacing w:after="30" w:before="0" w:line="240"/>
+              <w:jc w:val="left"/>
+            </w:pPr>
+            <w:r>
+              <w:rPr>
+                <w:rFonts w:ascii="Times New Roman" w:cs="Times New Roman" w:eastAsia="Times New Roman" w:hAnsi="Times New Roman"/>
+                <w:sz w:val="16"/>
+                <w:szCs w:val="16"/>
+              </w:rPr>
+              <w:t xml:space="preserve">IQAC 10.4.1 curriculum documents on duration; visit question 10</w:t>
+            </w:r>
+          </w:p>
+        </w:tc>
+      </w:tr>
+      <w:tr>
+        <w:trPr>
+          <w:cantSplit/>
+          <w:tblHeader w:val="off"/>
+        </w:trPr>
+        <w:tc>
+          <w:tcPr>
+            <w:tcW w:type="dxa" w:w="2863"/>
+            <w:tcMar>
+              <w:top w:type="dxa" w:w="50"/>
+              <w:left w:type="dxa" w:w="90"/>
+              <w:bottom w:type="dxa" w:w="50"/>
+              <w:right w:type="dxa" w:w="90"/>
+            </w:tcMar>
+            <w:vAlign w:val="top"/>
+          </w:tcPr>
+          <w:p>
+            <w:pPr>
+              <w:spacing w:after="30" w:before="0" w:line="240"/>
+              <w:jc w:val="left"/>
+            </w:pPr>
+            <w:r>
+              <w:rPr>
+                <w:rFonts w:ascii="Times New Roman" w:cs="Times New Roman" w:eastAsia="Times New Roman" w:hAnsi="Times New Roman"/>
+                <w:sz w:val="16"/>
+                <w:szCs w:val="16"/>
+              </w:rPr>
+              <w:t xml:space="preserve">10.4.1_Internship_Industrial_Training\10.4.1-06_Industrial_Training_Mark_Sheet_and_Attainment.xlsx</w:t>
+            </w:r>
+          </w:p>
+        </w:tc>
+        <w:tc>
+          <w:tcPr>
+            <w:tcW w:type="dxa" w:w="2704"/>
+            <w:tcMar>
+              <w:top w:type="dxa" w:w="50"/>
+              <w:left w:type="dxa" w:w="90"/>
+              <w:bottom w:type="dxa" w:w="50"/>
+              <w:right w:type="dxa" w:w="90"/>
+            </w:tcMar>
+            <w:vAlign w:val="top"/>
+          </w:tcPr>
+          <w:p>
+            <w:pPr>
+              <w:spacing w:after="30" w:before="0" w:line="240"/>
+              <w:jc w:val="left"/>
+            </w:pPr>
+            <w:r>
+              <w:rPr>
+                <w:rFonts w:ascii="Times New Roman" w:cs="Times New Roman" w:eastAsia="Times New Roman" w:hAnsi="Times New Roman"/>
+                <w:sz w:val="16"/>
+                <w:szCs w:val="16"/>
+              </w:rPr>
+              <w:t xml:space="preserve">Marks per rubric criterion for each trainee, with criterion and PO attainment calculated.</w:t>
+            </w:r>
+          </w:p>
+        </w:tc>
+        <w:tc>
+          <w:tcPr>
+            <w:tcW w:type="dxa" w:w="3659"/>
+            <w:tcMar>
+              <w:top w:type="dxa" w:w="50"/>
+              <w:left w:type="dxa" w:w="90"/>
+              <w:bottom w:type="dxa" w:w="50"/>
+              <w:right w:type="dxa" w:w="90"/>
+            </w:tcMar>
+            <w:vAlign w:val="top"/>
+          </w:tcPr>
+          <w:p>
+            <w:pPr>
+              <w:spacing w:after="30" w:before="0" w:line="240"/>
+              <w:jc w:val="left"/>
+            </w:pPr>
+            <w:r>
+              <w:rPr>
+                <w:rFonts w:ascii="Times New Roman" w:cs="Times New Roman" w:eastAsia="Times New Roman" w:hAnsi="Times New Roman"/>
+                <w:sz w:val="16"/>
+                <w:szCs w:val="16"/>
+              </w:rPr>
+              <w:t xml:space="preserve">- Pre-filled with the 8 trainees in the annex folder (marks blank). Enter marks only from real marking, with the actual date of marking.</w:t>
+            </w:r>
+          </w:p>
+        </w:tc>
+        <w:tc>
+          <w:tcPr>
+            <w:tcW w:type="dxa" w:w="1909"/>
+            <w:tcMar>
+              <w:top w:type="dxa" w:w="50"/>
+              <w:left w:type="dxa" w:w="90"/>
+              <w:bottom w:type="dxa" w:w="50"/>
+              <w:right w:type="dxa" w:w="90"/>
+            </w:tcMar>
+            <w:vAlign w:val="top"/>
+          </w:tcPr>
+          <w:p>
+            <w:pPr>
+              <w:spacing w:after="30" w:before="0" w:line="240"/>
+              <w:jc w:val="left"/>
+            </w:pPr>
+            <w:r>
+              <w:rPr>
+                <w:rFonts w:ascii="Times New Roman" w:cs="Times New Roman" w:eastAsia="Times New Roman" w:hAnsi="Times New Roman"/>
+                <w:sz w:val="16"/>
+                <w:szCs w:val="16"/>
+              </w:rPr>
+              <w:t xml:space="preserve">Faculty supervisor / Industrial Convener</w:t>
+            </w:r>
+          </w:p>
+        </w:tc>
+        <w:tc>
+          <w:tcPr>
+            <w:tcW w:type="dxa" w:w="1431"/>
+            <w:tcMar>
+              <w:top w:type="dxa" w:w="50"/>
+              <w:left w:type="dxa" w:w="90"/>
+              <w:bottom w:type="dxa" w:w="50"/>
+              <w:right w:type="dxa" w:w="90"/>
+            </w:tcMar>
+            <w:vAlign w:val="top"/>
+          </w:tcPr>
+          <w:p>
+            <w:pPr>
+              <w:spacing w:after="30" w:before="0" w:line="240"/>
+              <w:jc w:val="left"/>
+            </w:pPr>
+            <w:r>
+              <w:rPr>
+                <w:rFonts w:ascii="Times New Roman" w:cs="Times New Roman" w:eastAsia="Times New Roman" w:hAnsi="Times New Roman"/>
+                <w:sz w:val="16"/>
+                <w:szCs w:val="16"/>
+              </w:rPr>
+              <w:t xml:space="preserve">After each placement</w:t>
+            </w:r>
+          </w:p>
+        </w:tc>
+        <w:tc>
+          <w:tcPr>
+            <w:tcW w:type="dxa" w:w="2072"/>
+            <w:tcMar>
+              <w:top w:type="dxa" w:w="50"/>
+              <w:left w:type="dxa" w:w="90"/>
+              <w:bottom w:type="dxa" w:w="50"/>
+              <w:right w:type="dxa" w:w="90"/>
+            </w:tcMar>
+            <w:vAlign w:val="top"/>
+          </w:tcPr>
+          <w:p>
+            <w:pPr>
+              <w:spacing w:after="30" w:before="0" w:line="240"/>
+              <w:jc w:val="left"/>
+            </w:pPr>
+            <w:r>
+              <w:rPr>
+                <w:rFonts w:ascii="Times New Roman" w:cs="Times New Roman" w:eastAsia="Times New Roman" w:hAnsi="Times New Roman"/>
+                <w:sz w:val="16"/>
+                <w:szCs w:val="16"/>
+              </w:rPr>
+              <w:t xml:space="preserve">IQAC 10.4.1 assessment; tracker 'marked samples'</w:t>
+            </w:r>
+          </w:p>
+        </w:tc>
+      </w:tr>
+      <w:tr>
+        <w:trPr>
+          <w:cantSplit/>
+          <w:tblHeader w:val="off"/>
+        </w:trPr>
+        <w:tc>
+          <w:tcPr>
+            <w:tcW w:type="dxa" w:w="2863"/>
+            <w:tcMar>
+              <w:top w:type="dxa" w:w="50"/>
+              <w:left w:type="dxa" w:w="90"/>
+              <w:bottom w:type="dxa" w:w="50"/>
+              <w:right w:type="dxa" w:w="90"/>
+            </w:tcMar>
+            <w:vAlign w:val="top"/>
+          </w:tcPr>
+          <w:p>
+            <w:pPr>
+              <w:spacing w:after="30" w:before="0" w:line="240"/>
+              <w:jc w:val="left"/>
+            </w:pPr>
+            <w:r>
+              <w:rPr>
+                <w:rFonts w:ascii="Times New Roman" w:cs="Times New Roman" w:eastAsia="Times New Roman" w:hAnsi="Times New Roman"/>
+                <w:sz w:val="16"/>
+                <w:szCs w:val="16"/>
+              </w:rPr>
+              <w:t xml:space="preserve">10.4.2_Final_Year_Design_Project\10.4.2-01_Final_Year_Project_Proposal_Form_ICE.docx</w:t>
+            </w:r>
+          </w:p>
+        </w:tc>
+        <w:tc>
+          <w:tcPr>
+            <w:tcW w:type="dxa" w:w="2704"/>
+            <w:tcMar>
+              <w:top w:type="dxa" w:w="50"/>
+              <w:left w:type="dxa" w:w="90"/>
+              <w:bottom w:type="dxa" w:w="50"/>
+              <w:right w:type="dxa" w:w="90"/>
+            </w:tcMar>
+            <w:vAlign w:val="top"/>
+          </w:tcPr>
+          <w:p>
+            <w:pPr>
+              <w:spacing w:after="30" w:before="0" w:line="240"/>
+              <w:jc w:val="left"/>
+            </w:pPr>
+            <w:r>
+              <w:rPr>
+                <w:rFonts w:ascii="Times New Roman" w:cs="Times New Roman" w:eastAsia="Times New Roman" w:hAnsi="Times New Roman"/>
+                <w:sz w:val="16"/>
+                <w:szCs w:val="16"/>
+              </w:rPr>
+              <w:t xml:space="preserve">Same layout as the department's existing proposal form (Capstone Project/Thesis/Internship Proposal Form), with industry partner, co-supervisor and complex-problem fields added; no ETE headings.</w:t>
+            </w:r>
+          </w:p>
+        </w:tc>
+        <w:tc>
+          <w:tcPr>
+            <w:tcW w:type="dxa" w:w="3659"/>
+            <w:tcMar>
+              <w:top w:type="dxa" w:w="50"/>
+              <w:left w:type="dxa" w:w="90"/>
+              <w:bottom w:type="dxa" w:w="50"/>
+              <w:right w:type="dxa" w:w="90"/>
+            </w:tcMar>
+            <w:vAlign w:val="top"/>
+          </w:tcPr>
+          <w:p>
+            <w:pPr>
+              <w:spacing w:after="30" w:before="0" w:line="240"/>
+              <w:jc w:val="left"/>
+            </w:pPr>
+            <w:r>
+              <w:rPr>
+                <w:rFonts w:ascii="Times New Roman" w:cs="Times New Roman" w:eastAsia="Times New Roman" w:hAnsi="Times New Roman"/>
+                <w:sz w:val="16"/>
+                <w:szCs w:val="16"/>
+              </w:rPr>
+              <w:t xml:space="preserve">- Program: B.Sc. in Information and Communication Engineering. Use for new proposals only; do not refill or re-sign old forms.</w:t>
+            </w:r>
+          </w:p>
+          <w:p>
+            <w:pPr>
+              <w:spacing w:after="30" w:before="0" w:line="240"/>
+              <w:jc w:val="left"/>
+            </w:pPr>
+            <w:r>
+              <w:rPr>
+                <w:rFonts w:ascii="Times New Roman" w:cs="Times New Roman" w:eastAsia="Times New Roman" w:hAnsi="Times New Roman"/>
+                <w:sz w:val="16"/>
+                <w:szCs w:val="16"/>
+              </w:rPr>
+              <w:t xml:space="preserve">- Keep the existing serial-number system (e.g. SP25001).</w:t>
+            </w:r>
+          </w:p>
+        </w:tc>
+        <w:tc>
+          <w:tcPr>
+            <w:tcW w:type="dxa" w:w="1909"/>
+            <w:tcMar>
+              <w:top w:type="dxa" w:w="50"/>
+              <w:left w:type="dxa" w:w="90"/>
+              <w:bottom w:type="dxa" w:w="50"/>
+              <w:right w:type="dxa" w:w="90"/>
+            </w:tcMar>
+            <w:vAlign w:val="top"/>
+          </w:tcPr>
+          <w:p>
+            <w:pPr>
+              <w:spacing w:after="30" w:before="0" w:line="240"/>
+              <w:jc w:val="left"/>
+            </w:pPr>
+            <w:r>
+              <w:rPr>
+                <w:rFonts w:ascii="Times New Roman" w:cs="Times New Roman" w:eastAsia="Times New Roman" w:hAnsi="Times New Roman"/>
+                <w:sz w:val="16"/>
+                <w:szCs w:val="16"/>
+              </w:rPr>
+              <w:t xml:space="preserve">Students fill; supervisor, committee and Head sign</w:t>
+            </w:r>
+          </w:p>
+        </w:tc>
+        <w:tc>
+          <w:tcPr>
+            <w:tcW w:type="dxa" w:w="1431"/>
+            <w:tcMar>
+              <w:top w:type="dxa" w:w="50"/>
+              <w:left w:type="dxa" w:w="90"/>
+              <w:bottom w:type="dxa" w:w="50"/>
+              <w:right w:type="dxa" w:w="90"/>
+            </w:tcMar>
+            <w:vAlign w:val="top"/>
+          </w:tcPr>
+          <w:p>
+            <w:pPr>
+              <w:spacing w:after="30" w:before="0" w:line="240"/>
+              <w:jc w:val="left"/>
+            </w:pPr>
+            <w:r>
+              <w:rPr>
+                <w:rFonts w:ascii="Times New Roman" w:cs="Times New Roman" w:eastAsia="Times New Roman" w:hAnsi="Times New Roman"/>
+                <w:sz w:val="16"/>
+                <w:szCs w:val="16"/>
+              </w:rPr>
+              <w:t xml:space="preserve">From the next semester</w:t>
+            </w:r>
+          </w:p>
+        </w:tc>
+        <w:tc>
+          <w:tcPr>
+            <w:tcW w:type="dxa" w:w="2072"/>
+            <w:tcMar>
+              <w:top w:type="dxa" w:w="50"/>
+              <w:left w:type="dxa" w:w="90"/>
+              <w:bottom w:type="dxa" w:w="50"/>
+              <w:right w:type="dxa" w:w="90"/>
+            </w:tcMar>
+            <w:vAlign w:val="top"/>
+          </w:tcPr>
+          <w:p>
+            <w:pPr>
+              <w:spacing w:after="30" w:before="0" w:line="240"/>
+              <w:jc w:val="left"/>
+            </w:pPr>
+            <w:r>
+              <w:rPr>
+                <w:rFonts w:ascii="Times New Roman" w:cs="Times New Roman" w:eastAsia="Times New Roman" w:hAnsi="Times New Roman"/>
+                <w:sz w:val="16"/>
+                <w:szCs w:val="16"/>
+              </w:rPr>
+              <w:t xml:space="preserve">IQAC 10.4.2 topic selection / supervision; ETE leftovers</w:t>
+            </w:r>
+          </w:p>
+        </w:tc>
+      </w:tr>
+      <w:tr>
+        <w:trPr>
+          <w:cantSplit/>
+          <w:tblHeader w:val="off"/>
+        </w:trPr>
+        <w:tc>
+          <w:tcPr>
+            <w:tcW w:type="dxa" w:w="2863"/>
+            <w:tcMar>
+              <w:top w:type="dxa" w:w="50"/>
+              <w:left w:type="dxa" w:w="90"/>
+              <w:bottom w:type="dxa" w:w="50"/>
+              <w:right w:type="dxa" w:w="90"/>
+            </w:tcMar>
+            <w:vAlign w:val="top"/>
+          </w:tcPr>
+          <w:p>
+            <w:pPr>
+              <w:spacing w:after="30" w:before="0" w:line="240"/>
+              <w:jc w:val="left"/>
+            </w:pPr>
+            <w:r>
+              <w:rPr>
+                <w:rFonts w:ascii="Times New Roman" w:cs="Times New Roman" w:eastAsia="Times New Roman" w:hAnsi="Times New Roman"/>
+                <w:sz w:val="16"/>
+                <w:szCs w:val="16"/>
+              </w:rPr>
+              <w:t xml:space="preserve">10.4.2_Final_Year_Design_Project\10.4.2-02_Industry_Topic_Proposal_Form.docx</w:t>
+            </w:r>
+          </w:p>
+        </w:tc>
+        <w:tc>
+          <w:tcPr>
+            <w:tcW w:type="dxa" w:w="2704"/>
+            <w:tcMar>
+              <w:top w:type="dxa" w:w="50"/>
+              <w:left w:type="dxa" w:w="90"/>
+              <w:bottom w:type="dxa" w:w="50"/>
+              <w:right w:type="dxa" w:w="90"/>
+            </w:tcMar>
+            <w:vAlign w:val="top"/>
+          </w:tcPr>
+          <w:p>
+            <w:pPr>
+              <w:spacing w:after="30" w:before="0" w:line="240"/>
+              <w:jc w:val="left"/>
+            </w:pPr>
+            <w:r>
+              <w:rPr>
+                <w:rFonts w:ascii="Times New Roman" w:cs="Times New Roman" w:eastAsia="Times New Roman" w:hAnsi="Times New Roman"/>
+                <w:sz w:val="16"/>
+                <w:szCs w:val="16"/>
+              </w:rPr>
+              <w:t xml:space="preserve">Evidence that a company proposed a project topic.</w:t>
+            </w:r>
+          </w:p>
+        </w:tc>
+        <w:tc>
+          <w:tcPr>
+            <w:tcW w:type="dxa" w:w="3659"/>
+            <w:tcMar>
+              <w:top w:type="dxa" w:w="50"/>
+              <w:left w:type="dxa" w:w="90"/>
+              <w:bottom w:type="dxa" w:w="50"/>
+              <w:right w:type="dxa" w:w="90"/>
+            </w:tcMar>
+            <w:vAlign w:val="top"/>
+          </w:tcPr>
+          <w:p>
+            <w:pPr>
+              <w:spacing w:after="30" w:before="0" w:line="240"/>
+              <w:jc w:val="left"/>
+            </w:pPr>
+            <w:r>
+              <w:rPr>
+                <w:rFonts w:ascii="Times New Roman" w:cs="Times New Roman" w:eastAsia="Times New Roman" w:hAnsi="Times New Roman"/>
+                <w:sz w:val="16"/>
+                <w:szCs w:val="16"/>
+              </w:rPr>
+              <w:t xml:space="preserve">- Filled and signed by the company. File with the student group's proposal form.</w:t>
+            </w:r>
+          </w:p>
+        </w:tc>
+        <w:tc>
+          <w:tcPr>
+            <w:tcW w:type="dxa" w:w="1909"/>
+            <w:tcMar>
+              <w:top w:type="dxa" w:w="50"/>
+              <w:left w:type="dxa" w:w="90"/>
+              <w:bottom w:type="dxa" w:w="50"/>
+              <w:right w:type="dxa" w:w="90"/>
+            </w:tcMar>
+            <w:vAlign w:val="top"/>
+          </w:tcPr>
+          <w:p>
+            <w:pPr>
+              <w:spacing w:after="30" w:before="0" w:line="240"/>
+              <w:jc w:val="left"/>
+            </w:pPr>
+            <w:r>
+              <w:rPr>
+                <w:rFonts w:ascii="Times New Roman" w:cs="Times New Roman" w:eastAsia="Times New Roman" w:hAnsi="Times New Roman"/>
+                <w:sz w:val="16"/>
+                <w:szCs w:val="16"/>
+              </w:rPr>
+              <w:t xml:space="preserve">Company representative signs and stamps</w:t>
+            </w:r>
+          </w:p>
+        </w:tc>
+        <w:tc>
+          <w:tcPr>
+            <w:tcW w:type="dxa" w:w="1431"/>
+            <w:tcMar>
+              <w:top w:type="dxa" w:w="50"/>
+              <w:left w:type="dxa" w:w="90"/>
+              <w:bottom w:type="dxa" w:w="50"/>
+              <w:right w:type="dxa" w:w="90"/>
+            </w:tcMar>
+            <w:vAlign w:val="top"/>
+          </w:tcPr>
+          <w:p>
+            <w:pPr>
+              <w:spacing w:after="30" w:before="0" w:line="240"/>
+              <w:jc w:val="left"/>
+            </w:pPr>
+            <w:r>
+              <w:rPr>
+                <w:rFonts w:ascii="Times New Roman" w:cs="Times New Roman" w:eastAsia="Times New Roman" w:hAnsi="Times New Roman"/>
+                <w:sz w:val="16"/>
+                <w:szCs w:val="16"/>
+              </w:rPr>
+              <w:t xml:space="preserve">Before topic allocation</w:t>
+            </w:r>
+          </w:p>
+        </w:tc>
+        <w:tc>
+          <w:tcPr>
+            <w:tcW w:type="dxa" w:w="2072"/>
+            <w:tcMar>
+              <w:top w:type="dxa" w:w="50"/>
+              <w:left w:type="dxa" w:w="90"/>
+              <w:bottom w:type="dxa" w:w="50"/>
+              <w:right w:type="dxa" w:w="90"/>
+            </w:tcMar>
+            <w:vAlign w:val="top"/>
+          </w:tcPr>
+          <w:p>
+            <w:pPr>
+              <w:spacing w:after="30" w:before="0" w:line="240"/>
+              <w:jc w:val="left"/>
+            </w:pPr>
+            <w:r>
+              <w:rPr>
+                <w:rFonts w:ascii="Times New Roman" w:cs="Times New Roman" w:eastAsia="Times New Roman" w:hAnsi="Times New Roman"/>
+                <w:sz w:val="16"/>
+                <w:szCs w:val="16"/>
+              </w:rPr>
+              <w:t xml:space="preserve">IQAC 10.4.2 'project topic selection'</w:t>
+            </w:r>
+          </w:p>
+        </w:tc>
+      </w:tr>
+      <w:tr>
+        <w:trPr>
+          <w:cantSplit/>
+          <w:tblHeader w:val="off"/>
+        </w:trPr>
+        <w:tc>
+          <w:tcPr>
+            <w:tcW w:type="dxa" w:w="2863"/>
+            <w:tcMar>
+              <w:top w:type="dxa" w:w="50"/>
+              <w:left w:type="dxa" w:w="90"/>
+              <w:bottom w:type="dxa" w:w="50"/>
+              <w:right w:type="dxa" w:w="90"/>
+            </w:tcMar>
+            <w:vAlign w:val="top"/>
+          </w:tcPr>
+          <w:p>
+            <w:pPr>
+              <w:spacing w:after="30" w:before="0" w:line="240"/>
+              <w:jc w:val="left"/>
+            </w:pPr>
+            <w:r>
+              <w:rPr>
+                <w:rFonts w:ascii="Times New Roman" w:cs="Times New Roman" w:eastAsia="Times New Roman" w:hAnsi="Times New Roman"/>
+                <w:sz w:val="16"/>
+                <w:szCs w:val="16"/>
+              </w:rPr>
+              <w:t xml:space="preserve">10.4.2_Final_Year_Design_Project\10.4.2-03_Industry_Co-Supervisor_Appointment_Letter.docx</w:t>
+            </w:r>
+          </w:p>
+        </w:tc>
+        <w:tc>
+          <w:tcPr>
+            <w:tcW w:type="dxa" w:w="2704"/>
+            <w:tcMar>
+              <w:top w:type="dxa" w:w="50"/>
+              <w:left w:type="dxa" w:w="90"/>
+              <w:bottom w:type="dxa" w:w="50"/>
+              <w:right w:type="dxa" w:w="90"/>
+            </w:tcMar>
+            <w:vAlign w:val="top"/>
+          </w:tcPr>
+          <w:p>
+            <w:pPr>
+              <w:spacing w:after="30" w:before="0" w:line="240"/>
+              <w:jc w:val="left"/>
+            </w:pPr>
+            <w:r>
+              <w:rPr>
+                <w:rFonts w:ascii="Times New Roman" w:cs="Times New Roman" w:eastAsia="Times New Roman" w:hAnsi="Times New Roman"/>
+                <w:sz w:val="16"/>
+                <w:szCs w:val="16"/>
+              </w:rPr>
+              <w:t xml:space="preserve">Formal appointment, consent and meeting log for industry co-supervision.</w:t>
+            </w:r>
+          </w:p>
+        </w:tc>
+        <w:tc>
+          <w:tcPr>
+            <w:tcW w:type="dxa" w:w="3659"/>
+            <w:tcMar>
+              <w:top w:type="dxa" w:w="50"/>
+              <w:left w:type="dxa" w:w="90"/>
+              <w:bottom w:type="dxa" w:w="50"/>
+              <w:right w:type="dxa" w:w="90"/>
+            </w:tcMar>
+            <w:vAlign w:val="top"/>
+          </w:tcPr>
+          <w:p>
+            <w:pPr>
+              <w:spacing w:after="30" w:before="0" w:line="240"/>
+              <w:jc w:val="left"/>
+            </w:pPr>
+            <w:r>
+              <w:rPr>
+                <w:rFonts w:ascii="Times New Roman" w:cs="Times New Roman" w:eastAsia="Times New Roman" w:hAnsi="Times New Roman"/>
+                <w:sz w:val="16"/>
+                <w:szCs w:val="16"/>
+              </w:rPr>
+              <w:t xml:space="preserve">- Keep the signed consent and the meeting log with the project file.</w:t>
+            </w:r>
+          </w:p>
+        </w:tc>
+        <w:tc>
+          <w:tcPr>
+            <w:tcW w:type="dxa" w:w="1909"/>
+            <w:tcMar>
+              <w:top w:type="dxa" w:w="50"/>
+              <w:left w:type="dxa" w:w="90"/>
+              <w:bottom w:type="dxa" w:w="50"/>
+              <w:right w:type="dxa" w:w="90"/>
+            </w:tcMar>
+            <w:vAlign w:val="top"/>
+          </w:tcPr>
+          <w:p>
+            <w:pPr>
+              <w:spacing w:after="30" w:before="0" w:line="240"/>
+              <w:jc w:val="left"/>
+            </w:pPr>
+            <w:r>
+              <w:rPr>
+                <w:rFonts w:ascii="Times New Roman" w:cs="Times New Roman" w:eastAsia="Times New Roman" w:hAnsi="Times New Roman"/>
+                <w:sz w:val="16"/>
+                <w:szCs w:val="16"/>
+              </w:rPr>
+              <w:t xml:space="preserve">Head signs; co-supervisor accepts</w:t>
+            </w:r>
+          </w:p>
+        </w:tc>
+        <w:tc>
+          <w:tcPr>
+            <w:tcW w:type="dxa" w:w="1431"/>
+            <w:tcMar>
+              <w:top w:type="dxa" w:w="50"/>
+              <w:left w:type="dxa" w:w="90"/>
+              <w:bottom w:type="dxa" w:w="50"/>
+              <w:right w:type="dxa" w:w="90"/>
+            </w:tcMar>
+            <w:vAlign w:val="top"/>
+          </w:tcPr>
+          <w:p>
+            <w:pPr>
+              <w:spacing w:after="30" w:before="0" w:line="240"/>
+              <w:jc w:val="left"/>
+            </w:pPr>
+            <w:r>
+              <w:rPr>
+                <w:rFonts w:ascii="Times New Roman" w:cs="Times New Roman" w:eastAsia="Times New Roman" w:hAnsi="Times New Roman"/>
+                <w:sz w:val="16"/>
+                <w:szCs w:val="16"/>
+              </w:rPr>
+              <w:t xml:space="preserve">At project start</w:t>
+            </w:r>
+          </w:p>
+        </w:tc>
+        <w:tc>
+          <w:tcPr>
+            <w:tcW w:type="dxa" w:w="2072"/>
+            <w:tcMar>
+              <w:top w:type="dxa" w:w="50"/>
+              <w:left w:type="dxa" w:w="90"/>
+              <w:bottom w:type="dxa" w:w="50"/>
+              <w:right w:type="dxa" w:w="90"/>
+            </w:tcMar>
+            <w:vAlign w:val="top"/>
+          </w:tcPr>
+          <w:p>
+            <w:pPr>
+              <w:spacing w:after="30" w:before="0" w:line="240"/>
+              <w:jc w:val="left"/>
+            </w:pPr>
+            <w:r>
+              <w:rPr>
+                <w:rFonts w:ascii="Times New Roman" w:cs="Times New Roman" w:eastAsia="Times New Roman" w:hAnsi="Times New Roman"/>
+                <w:sz w:val="16"/>
+                <w:szCs w:val="16"/>
+              </w:rPr>
+              <w:t xml:space="preserve">IQAC 10.4.2 'supervision of project activities'</w:t>
+            </w:r>
+          </w:p>
+        </w:tc>
+      </w:tr>
+      <w:tr>
+        <w:trPr>
+          <w:cantSplit/>
+          <w:tblHeader w:val="off"/>
+        </w:trPr>
+        <w:tc>
+          <w:tcPr>
+            <w:tcW w:type="dxa" w:w="2863"/>
+            <w:tcMar>
+              <w:top w:type="dxa" w:w="50"/>
+              <w:left w:type="dxa" w:w="90"/>
+              <w:bottom w:type="dxa" w:w="50"/>
+              <w:right w:type="dxa" w:w="90"/>
+            </w:tcMar>
+            <w:vAlign w:val="top"/>
+          </w:tcPr>
+          <w:p>
+            <w:pPr>
+              <w:spacing w:after="30" w:before="0" w:line="240"/>
+              <w:jc w:val="left"/>
+            </w:pPr>
+            <w:r>
+              <w:rPr>
+                <w:rFonts w:ascii="Times New Roman" w:cs="Times New Roman" w:eastAsia="Times New Roman" w:hAnsi="Times New Roman"/>
+                <w:sz w:val="16"/>
+                <w:szCs w:val="16"/>
+              </w:rPr>
+              <w:t xml:space="preserve">10.4.2_Final_Year_Design_Project\10.4.2-04_Capstone_Rubric_Full_CO-PO_DRAFT.docx</w:t>
+            </w:r>
+          </w:p>
+        </w:tc>
+        <w:tc>
+          <w:tcPr>
+            <w:tcW w:type="dxa" w:w="2704"/>
+            <w:tcMar>
+              <w:top w:type="dxa" w:w="50"/>
+              <w:left w:type="dxa" w:w="90"/>
+              <w:bottom w:type="dxa" w:w="50"/>
+              <w:right w:type="dxa" w:w="90"/>
+            </w:tcMar>
+            <w:vAlign w:val="top"/>
+          </w:tcPr>
+          <w:p>
+            <w:pPr>
+              <w:spacing w:after="30" w:before="0" w:line="240"/>
+              <w:jc w:val="left"/>
+            </w:pPr>
+            <w:r>
+              <w:rPr>
+                <w:rFonts w:ascii="Times New Roman" w:cs="Times New Roman" w:eastAsia="Times New Roman" w:hAnsi="Times New Roman"/>
+                <w:sz w:val="16"/>
+                <w:szCs w:val="16"/>
+              </w:rPr>
+              <w:t xml:space="preserve">Completes the existing 30/30/40 split with rubrics for the report and defence, a proposed PO mapping and an industry examiner role.</w:t>
+            </w:r>
+          </w:p>
+        </w:tc>
+        <w:tc>
+          <w:tcPr>
+            <w:tcW w:type="dxa" w:w="3659"/>
+            <w:tcMar>
+              <w:top w:type="dxa" w:w="50"/>
+              <w:left w:type="dxa" w:w="90"/>
+              <w:bottom w:type="dxa" w:w="50"/>
+              <w:right w:type="dxa" w:w="90"/>
+            </w:tcMar>
+            <w:vAlign w:val="top"/>
+          </w:tcPr>
+          <w:p>
+            <w:pPr>
+              <w:spacing w:after="30" w:before="0" w:line="240"/>
+              <w:jc w:val="left"/>
+            </w:pPr>
+            <w:r>
+              <w:rPr>
+                <w:rFonts w:ascii="Times New Roman" w:cs="Times New Roman" w:eastAsia="Times New Roman" w:hAnsi="Times New Roman"/>
+                <w:sz w:val="16"/>
+                <w:szCs w:val="16"/>
+              </w:rPr>
+              <w:t xml:space="preserve">- Part A keeps the existing supervisor rubric (A10.4.2-01: Teamwork 10, Communication 10, Time Management 10). Parts B and C, and all PO mappings, are PROPOSALS to approve or edit.</w:t>
+            </w:r>
+          </w:p>
+          <w:p>
+            <w:pPr>
+              <w:spacing w:after="30" w:before="0" w:line="240"/>
+              <w:jc w:val="left"/>
+            </w:pPr>
+            <w:r>
+              <w:rPr>
+                <w:rFonts w:ascii="Times New Roman" w:cs="Times New Roman" w:eastAsia="Times New Roman" w:hAnsi="Times New Roman"/>
+                <w:sz w:val="16"/>
+                <w:szCs w:val="16"/>
+              </w:rPr>
+              <w:t xml:space="preserve">- Where the board includes an industry examiner, that examiner scores Part C on the evaluation sheet 10.4.2-05.</w:t>
+            </w:r>
+          </w:p>
+        </w:tc>
+        <w:tc>
+          <w:tcPr>
+            <w:tcW w:type="dxa" w:w="1909"/>
+            <w:tcMar>
+              <w:top w:type="dxa" w:w="50"/>
+              <w:left w:type="dxa" w:w="90"/>
+              <w:bottom w:type="dxa" w:w="50"/>
+              <w:right w:type="dxa" w:w="90"/>
+            </w:tcMar>
+            <w:vAlign w:val="top"/>
+          </w:tcPr>
+          <w:p>
+            <w:pPr>
+              <w:spacing w:after="30" w:before="0" w:line="240"/>
+              <w:jc w:val="left"/>
+            </w:pPr>
+            <w:r>
+              <w:rPr>
+                <w:rFonts w:ascii="Times New Roman" w:cs="Times New Roman" w:eastAsia="Times New Roman" w:hAnsi="Times New Roman"/>
+                <w:sz w:val="16"/>
+                <w:szCs w:val="16"/>
+              </w:rPr>
+              <w:t xml:space="preserve">Capstone Coordinator drafts; department approves</w:t>
+            </w:r>
+          </w:p>
+        </w:tc>
+        <w:tc>
+          <w:tcPr>
+            <w:tcW w:type="dxa" w:w="1431"/>
+            <w:tcMar>
+              <w:top w:type="dxa" w:w="50"/>
+              <w:left w:type="dxa" w:w="90"/>
+              <w:bottom w:type="dxa" w:w="50"/>
+              <w:right w:type="dxa" w:w="90"/>
+            </w:tcMar>
+            <w:vAlign w:val="top"/>
+          </w:tcPr>
+          <w:p>
+            <w:pPr>
+              <w:spacing w:after="30" w:before="0" w:line="240"/>
+              <w:jc w:val="left"/>
+            </w:pPr>
+            <w:r>
+              <w:rPr>
+                <w:rFonts w:ascii="Times New Roman" w:cs="Times New Roman" w:eastAsia="Times New Roman" w:hAnsi="Times New Roman"/>
+                <w:sz w:val="16"/>
+                <w:szCs w:val="16"/>
+              </w:rPr>
+              <w:t xml:space="preserve">Approve before the next defence</w:t>
+            </w:r>
+          </w:p>
+        </w:tc>
+        <w:tc>
+          <w:tcPr>
+            <w:tcW w:type="dxa" w:w="2072"/>
+            <w:tcMar>
+              <w:top w:type="dxa" w:w="50"/>
+              <w:left w:type="dxa" w:w="90"/>
+              <w:bottom w:type="dxa" w:w="50"/>
+              <w:right w:type="dxa" w:w="90"/>
+            </w:tcMar>
+            <w:vAlign w:val="top"/>
+          </w:tcPr>
+          <w:p>
+            <w:pPr>
+              <w:spacing w:after="30" w:before="0" w:line="240"/>
+              <w:jc w:val="left"/>
+            </w:pPr>
+            <w:r>
+              <w:rPr>
+                <w:rFonts w:ascii="Times New Roman" w:cs="Times New Roman" w:eastAsia="Times New Roman" w:hAnsi="Times New Roman"/>
+                <w:sz w:val="16"/>
+                <w:szCs w:val="16"/>
+              </w:rPr>
+              <w:t xml:space="preserve">IQAC 10.4.2 'project assessment'; capstone rubric gaps</w:t>
+            </w:r>
+          </w:p>
+        </w:tc>
+      </w:tr>
+      <w:tr>
+        <w:trPr>
+          <w:cantSplit/>
+          <w:tblHeader w:val="off"/>
+        </w:trPr>
+        <w:tc>
+          <w:tcPr>
+            <w:tcW w:type="dxa" w:w="2863"/>
+            <w:tcMar>
+              <w:top w:type="dxa" w:w="50"/>
+              <w:left w:type="dxa" w:w="90"/>
+              <w:bottom w:type="dxa" w:w="50"/>
+              <w:right w:type="dxa" w:w="90"/>
+            </w:tcMar>
+            <w:vAlign w:val="top"/>
+          </w:tcPr>
+          <w:p>
+            <w:pPr>
+              <w:spacing w:after="30" w:before="0" w:line="240"/>
+              <w:jc w:val="left"/>
+            </w:pPr>
+            <w:r>
+              <w:rPr>
+                <w:rFonts w:ascii="Times New Roman" w:cs="Times New Roman" w:eastAsia="Times New Roman" w:hAnsi="Times New Roman"/>
+                <w:sz w:val="16"/>
+                <w:szCs w:val="16"/>
+              </w:rPr>
+              <w:t xml:space="preserve">10.4.2_Final_Year_Design_Project\10.4.2-05_Defence_Evaluation_Sheet.docx</w:t>
+            </w:r>
+          </w:p>
+        </w:tc>
+        <w:tc>
+          <w:tcPr>
+            <w:tcW w:type="dxa" w:w="2704"/>
+            <w:tcMar>
+              <w:top w:type="dxa" w:w="50"/>
+              <w:left w:type="dxa" w:w="90"/>
+              <w:bottom w:type="dxa" w:w="50"/>
+              <w:right w:type="dxa" w:w="90"/>
+            </w:tcMar>
+            <w:vAlign w:val="top"/>
+          </w:tcPr>
+          <w:p>
+            <w:pPr>
+              <w:spacing w:after="30" w:before="0" w:line="240"/>
+              <w:jc w:val="left"/>
+            </w:pPr>
+            <w:r>
+              <w:rPr>
+                <w:rFonts w:ascii="Times New Roman" w:cs="Times New Roman" w:eastAsia="Times New Roman" w:hAnsi="Times New Roman"/>
+                <w:sz w:val="16"/>
+                <w:szCs w:val="16"/>
+              </w:rPr>
+              <w:t xml:space="preserve">Dated, signed board record with examiner names, roles and marks (replaces undated, unsigned sheets).</w:t>
+            </w:r>
+          </w:p>
+        </w:tc>
+        <w:tc>
+          <w:tcPr>
+            <w:tcW w:type="dxa" w:w="3659"/>
+            <w:tcMar>
+              <w:top w:type="dxa" w:w="50"/>
+              <w:left w:type="dxa" w:w="90"/>
+              <w:bottom w:type="dxa" w:w="50"/>
+              <w:right w:type="dxa" w:w="90"/>
+            </w:tcMar>
+            <w:vAlign w:val="top"/>
+          </w:tcPr>
+          <w:p>
+            <w:pPr>
+              <w:spacing w:after="30" w:before="0" w:line="240"/>
+              <w:jc w:val="left"/>
+            </w:pPr>
+            <w:r>
+              <w:rPr>
+                <w:rFonts w:ascii="Times New Roman" w:cs="Times New Roman" w:eastAsia="Times New Roman" w:hAnsi="Times New Roman"/>
+                <w:sz w:val="16"/>
+                <w:szCs w:val="16"/>
+              </w:rPr>
+              <w:t xml:space="preserve">- Write examiner names and roles in full. Each examiner signs and dates on the day. Students sign their own attendance.</w:t>
+            </w:r>
+          </w:p>
+        </w:tc>
+        <w:tc>
+          <w:tcPr>
+            <w:tcW w:type="dxa" w:w="1909"/>
+            <w:tcMar>
+              <w:top w:type="dxa" w:w="50"/>
+              <w:left w:type="dxa" w:w="90"/>
+              <w:bottom w:type="dxa" w:w="50"/>
+              <w:right w:type="dxa" w:w="90"/>
+            </w:tcMar>
+            <w:vAlign w:val="top"/>
+          </w:tcPr>
+          <w:p>
+            <w:pPr>
+              <w:spacing w:after="30" w:before="0" w:line="240"/>
+              <w:jc w:val="left"/>
+            </w:pPr>
+            <w:r>
+              <w:rPr>
+                <w:rFonts w:ascii="Times New Roman" w:cs="Times New Roman" w:eastAsia="Times New Roman" w:hAnsi="Times New Roman"/>
+                <w:sz w:val="16"/>
+                <w:szCs w:val="16"/>
+              </w:rPr>
+              <w:t xml:space="preserve">Each board member signs; coordinator files</w:t>
+            </w:r>
+          </w:p>
+        </w:tc>
+        <w:tc>
+          <w:tcPr>
+            <w:tcW w:type="dxa" w:w="1431"/>
+            <w:tcMar>
+              <w:top w:type="dxa" w:w="50"/>
+              <w:left w:type="dxa" w:w="90"/>
+              <w:bottom w:type="dxa" w:w="50"/>
+              <w:right w:type="dxa" w:w="90"/>
+            </w:tcMar>
+            <w:vAlign w:val="top"/>
+          </w:tcPr>
+          <w:p>
+            <w:pPr>
+              <w:spacing w:after="30" w:before="0" w:line="240"/>
+              <w:jc w:val="left"/>
+            </w:pPr>
+            <w:r>
+              <w:rPr>
+                <w:rFonts w:ascii="Times New Roman" w:cs="Times New Roman" w:eastAsia="Times New Roman" w:hAnsi="Times New Roman"/>
+                <w:sz w:val="16"/>
+                <w:szCs w:val="16"/>
+              </w:rPr>
+              <w:t xml:space="preserve">At each pre-defence/defence</w:t>
+            </w:r>
+          </w:p>
+        </w:tc>
+        <w:tc>
+          <w:tcPr>
+            <w:tcW w:type="dxa" w:w="2072"/>
+            <w:tcMar>
+              <w:top w:type="dxa" w:w="50"/>
+              <w:left w:type="dxa" w:w="90"/>
+              <w:bottom w:type="dxa" w:w="50"/>
+              <w:right w:type="dxa" w:w="90"/>
+            </w:tcMar>
+            <w:vAlign w:val="top"/>
+          </w:tcPr>
+          <w:p>
+            <w:pPr>
+              <w:spacing w:after="30" w:before="0" w:line="240"/>
+              <w:jc w:val="left"/>
+            </w:pPr>
+            <w:r>
+              <w:rPr>
+                <w:rFonts w:ascii="Times New Roman" w:cs="Times New Roman" w:eastAsia="Times New Roman" w:hAnsi="Times New Roman"/>
+                <w:sz w:val="16"/>
+                <w:szCs w:val="16"/>
+              </w:rPr>
+              <w:t xml:space="preserve">IQAC 10.4.2 assessment; integrity findings on pre-defence sheets</w:t>
+            </w:r>
+          </w:p>
+        </w:tc>
+      </w:tr>
+      <w:tr>
+        <w:trPr>
+          <w:cantSplit/>
+          <w:tblHeader w:val="off"/>
+        </w:trPr>
+        <w:tc>
+          <w:tcPr>
+            <w:tcW w:type="dxa" w:w="2863"/>
+            <w:tcMar>
+              <w:top w:type="dxa" w:w="50"/>
+              <w:left w:type="dxa" w:w="90"/>
+              <w:bottom w:type="dxa" w:w="50"/>
+              <w:right w:type="dxa" w:w="90"/>
+            </w:tcMar>
+            <w:vAlign w:val="top"/>
+          </w:tcPr>
+          <w:p>
+            <w:pPr>
+              <w:spacing w:after="30" w:before="0" w:line="240"/>
+              <w:jc w:val="left"/>
+            </w:pPr>
+            <w:r>
+              <w:rPr>
+                <w:rFonts w:ascii="Times New Roman" w:cs="Times New Roman" w:eastAsia="Times New Roman" w:hAnsi="Times New Roman"/>
+                <w:sz w:val="16"/>
+                <w:szCs w:val="16"/>
+              </w:rPr>
+              <w:t xml:space="preserve">10.4.2_Final_Year_Design_Project\10.4.2-06_Project_List_Spring2023-Fall2025.xlsx</w:t>
+            </w:r>
+          </w:p>
+        </w:tc>
+        <w:tc>
+          <w:tcPr>
+            <w:tcW w:type="dxa" w:w="2704"/>
+            <w:tcMar>
+              <w:top w:type="dxa" w:w="50"/>
+              <w:left w:type="dxa" w:w="90"/>
+              <w:bottom w:type="dxa" w:w="50"/>
+              <w:right w:type="dxa" w:w="90"/>
+            </w:tcMar>
+            <w:vAlign w:val="top"/>
+          </w:tcPr>
+          <w:p>
+            <w:pPr>
+              <w:spacing w:after="30" w:before="0" w:line="240"/>
+              <w:jc w:val="left"/>
+            </w:pPr>
+            <w:r>
+              <w:rPr>
+                <w:rFonts w:ascii="Times New Roman" w:cs="Times New Roman" w:eastAsia="Times New Roman" w:hAnsi="Times New Roman"/>
+                <w:sz w:val="16"/>
+                <w:szCs w:val="16"/>
+              </w:rPr>
+              <w:t xml:space="preserve">Semester-wise list of final-year projects in SAR 6.3 format, with industry involvement.</w:t>
+            </w:r>
+          </w:p>
+        </w:tc>
+        <w:tc>
+          <w:tcPr>
+            <w:tcW w:type="dxa" w:w="3659"/>
+            <w:tcMar>
+              <w:top w:type="dxa" w:w="50"/>
+              <w:left w:type="dxa" w:w="90"/>
+              <w:bottom w:type="dxa" w:w="50"/>
+              <w:right w:type="dxa" w:w="90"/>
+            </w:tcMar>
+            <w:vAlign w:val="top"/>
+          </w:tcPr>
+          <w:p>
+            <w:pPr>
+              <w:spacing w:after="30" w:before="0" w:line="240"/>
+              <w:jc w:val="left"/>
+            </w:pPr>
+            <w:r>
+              <w:rPr>
+                <w:rFonts w:ascii="Times New Roman" w:cs="Times New Roman" w:eastAsia="Times New Roman" w:hAnsi="Times New Roman"/>
+                <w:sz w:val="16"/>
+                <w:szCs w:val="16"/>
+              </w:rPr>
+              <w:t xml:space="preserve">- Two rows are pre-filled from the reports in the annex folder; fill the rest from registration and result records.</w:t>
+            </w:r>
+          </w:p>
+        </w:tc>
+        <w:tc>
+          <w:tcPr>
+            <w:tcW w:type="dxa" w:w="1909"/>
+            <w:tcMar>
+              <w:top w:type="dxa" w:w="50"/>
+              <w:left w:type="dxa" w:w="90"/>
+              <w:bottom w:type="dxa" w:w="50"/>
+              <w:right w:type="dxa" w:w="90"/>
+            </w:tcMar>
+            <w:vAlign w:val="top"/>
+          </w:tcPr>
+          <w:p>
+            <w:pPr>
+              <w:spacing w:after="30" w:before="0" w:line="240"/>
+              <w:jc w:val="left"/>
+            </w:pPr>
+            <w:r>
+              <w:rPr>
+                <w:rFonts w:ascii="Times New Roman" w:cs="Times New Roman" w:eastAsia="Times New Roman" w:hAnsi="Times New Roman"/>
+                <w:sz w:val="16"/>
+                <w:szCs w:val="16"/>
+              </w:rPr>
+              <w:t xml:space="preserve">Capstone Coordinator (from registration records)</w:t>
+            </w:r>
+          </w:p>
+        </w:tc>
+        <w:tc>
+          <w:tcPr>
+            <w:tcW w:type="dxa" w:w="1431"/>
+            <w:tcMar>
+              <w:top w:type="dxa" w:w="50"/>
+              <w:left w:type="dxa" w:w="90"/>
+              <w:bottom w:type="dxa" w:w="50"/>
+              <w:right w:type="dxa" w:w="90"/>
+            </w:tcMar>
+            <w:vAlign w:val="top"/>
+          </w:tcPr>
+          <w:p>
+            <w:pPr>
+              <w:spacing w:after="30" w:before="0" w:line="240"/>
+              <w:jc w:val="left"/>
+            </w:pPr>
+            <w:r>
+              <w:rPr>
+                <w:rFonts w:ascii="Times New Roman" w:cs="Times New Roman" w:eastAsia="Times New Roman" w:hAnsi="Times New Roman"/>
+                <w:sz w:val="16"/>
+                <w:szCs w:val="16"/>
+              </w:rPr>
+              <w:t xml:space="preserve">Now</w:t>
+            </w:r>
+          </w:p>
+        </w:tc>
+        <w:tc>
+          <w:tcPr>
+            <w:tcW w:type="dxa" w:w="2072"/>
+            <w:tcMar>
+              <w:top w:type="dxa" w:w="50"/>
+              <w:left w:type="dxa" w:w="90"/>
+              <w:bottom w:type="dxa" w:w="50"/>
+              <w:right w:type="dxa" w:w="90"/>
+            </w:tcMar>
+            <w:vAlign w:val="top"/>
+          </w:tcPr>
+          <w:p>
+            <w:pPr>
+              <w:spacing w:after="30" w:before="0" w:line="240"/>
+              <w:jc w:val="left"/>
+            </w:pPr>
+            <w:r>
+              <w:rPr>
+                <w:rFonts w:ascii="Times New Roman" w:cs="Times New Roman" w:eastAsia="Times New Roman" w:hAnsi="Times New Roman"/>
+                <w:sz w:val="16"/>
+                <w:szCs w:val="16"/>
+              </w:rPr>
+              <w:t xml:space="preserve">SAR 6.3; 10.4.2 numbers per semester</w:t>
+            </w:r>
+          </w:p>
+        </w:tc>
+      </w:tr>
+      <w:tr>
+        <w:trPr>
+          <w:cantSplit/>
+          <w:tblHeader w:val="off"/>
+        </w:trPr>
+        <w:tc>
+          <w:tcPr>
+            <w:tcW w:type="dxa" w:w="2863"/>
+            <w:tcMar>
+              <w:top w:type="dxa" w:w="50"/>
+              <w:left w:type="dxa" w:w="90"/>
+              <w:bottom w:type="dxa" w:w="50"/>
+              <w:right w:type="dxa" w:w="90"/>
+            </w:tcMar>
+            <w:vAlign w:val="top"/>
+          </w:tcPr>
+          <w:p>
+            <w:pPr>
+              <w:spacing w:after="30" w:before="0" w:line="240"/>
+              <w:jc w:val="left"/>
+            </w:pPr>
+            <w:r>
+              <w:rPr>
+                <w:rFonts w:ascii="Times New Roman" w:cs="Times New Roman" w:eastAsia="Times New Roman" w:hAnsi="Times New Roman"/>
+                <w:sz w:val="16"/>
+                <w:szCs w:val="16"/>
+              </w:rPr>
+              <w:t xml:space="preserve">10.4.2_Final_Year_Design_Project\10.4.2-07_Industry_Examiner_Invitation_and_Declaration.docx</w:t>
+            </w:r>
+          </w:p>
+        </w:tc>
+        <w:tc>
+          <w:tcPr>
+            <w:tcW w:type="dxa" w:w="2704"/>
+            <w:tcMar>
+              <w:top w:type="dxa" w:w="50"/>
+              <w:left w:type="dxa" w:w="90"/>
+              <w:bottom w:type="dxa" w:w="50"/>
+              <w:right w:type="dxa" w:w="90"/>
+            </w:tcMar>
+            <w:vAlign w:val="top"/>
+          </w:tcPr>
+          <w:p>
+            <w:pPr>
+              <w:spacing w:after="30" w:before="0" w:line="240"/>
+              <w:jc w:val="left"/>
+            </w:pPr>
+            <w:r>
+              <w:rPr>
+                <w:rFonts w:ascii="Times New Roman" w:cs="Times New Roman" w:eastAsia="Times New Roman" w:hAnsi="Times New Roman"/>
+                <w:sz w:val="16"/>
+                <w:szCs w:val="16"/>
+              </w:rPr>
+              <w:t xml:space="preserve">Invitation to an industry examiner, acceptance with conflict-of-interest declaration, and participation record.</w:t>
+            </w:r>
+          </w:p>
+        </w:tc>
+        <w:tc>
+          <w:tcPr>
+            <w:tcW w:type="dxa" w:w="3659"/>
+            <w:tcMar>
+              <w:top w:type="dxa" w:w="50"/>
+              <w:left w:type="dxa" w:w="90"/>
+              <w:bottom w:type="dxa" w:w="50"/>
+              <w:right w:type="dxa" w:w="90"/>
+            </w:tcMar>
+            <w:vAlign w:val="top"/>
+          </w:tcPr>
+          <w:p>
+            <w:pPr>
+              <w:spacing w:after="30" w:before="0" w:line="240"/>
+              <w:jc w:val="left"/>
+            </w:pPr>
+            <w:r>
+              <w:rPr>
+                <w:rFonts w:ascii="Times New Roman" w:cs="Times New Roman" w:eastAsia="Times New Roman" w:hAnsi="Times New Roman"/>
+                <w:sz w:val="16"/>
+                <w:szCs w:val="16"/>
+              </w:rPr>
+              <w:t xml:space="preserve">- The examiner signs the evaluation sheet 10.4.2-05 on the day. File this letter with it.</w:t>
+            </w:r>
+          </w:p>
+        </w:tc>
+        <w:tc>
+          <w:tcPr>
+            <w:tcW w:type="dxa" w:w="1909"/>
+            <w:tcMar>
+              <w:top w:type="dxa" w:w="50"/>
+              <w:left w:type="dxa" w:w="90"/>
+              <w:bottom w:type="dxa" w:w="50"/>
+              <w:right w:type="dxa" w:w="90"/>
+            </w:tcMar>
+            <w:vAlign w:val="top"/>
+          </w:tcPr>
+          <w:p>
+            <w:pPr>
+              <w:spacing w:after="30" w:before="0" w:line="240"/>
+              <w:jc w:val="left"/>
+            </w:pPr>
+            <w:r>
+              <w:rPr>
+                <w:rFonts w:ascii="Times New Roman" w:cs="Times New Roman" w:eastAsia="Times New Roman" w:hAnsi="Times New Roman"/>
+                <w:sz w:val="16"/>
+                <w:szCs w:val="16"/>
+              </w:rPr>
+              <w:t xml:space="preserve">Head signs; examiner accepts; Capstone Coordinator records</w:t>
+            </w:r>
+          </w:p>
+        </w:tc>
+        <w:tc>
+          <w:tcPr>
+            <w:tcW w:type="dxa" w:w="1431"/>
+            <w:tcMar>
+              <w:top w:type="dxa" w:w="50"/>
+              <w:left w:type="dxa" w:w="90"/>
+              <w:bottom w:type="dxa" w:w="50"/>
+              <w:right w:type="dxa" w:w="90"/>
+            </w:tcMar>
+            <w:vAlign w:val="top"/>
+          </w:tcPr>
+          <w:p>
+            <w:pPr>
+              <w:spacing w:after="30" w:before="0" w:line="240"/>
+              <w:jc w:val="left"/>
+            </w:pPr>
+            <w:r>
+              <w:rPr>
+                <w:rFonts w:ascii="Times New Roman" w:cs="Times New Roman" w:eastAsia="Times New Roman" w:hAnsi="Times New Roman"/>
+                <w:sz w:val="16"/>
+                <w:szCs w:val="16"/>
+              </w:rPr>
+              <w:t xml:space="preserve">Before each defence</w:t>
+            </w:r>
+          </w:p>
+        </w:tc>
+        <w:tc>
+          <w:tcPr>
+            <w:tcW w:type="dxa" w:w="2072"/>
+            <w:tcMar>
+              <w:top w:type="dxa" w:w="50"/>
+              <w:left w:type="dxa" w:w="90"/>
+              <w:bottom w:type="dxa" w:w="50"/>
+              <w:right w:type="dxa" w:w="90"/>
+            </w:tcMar>
+            <w:vAlign w:val="top"/>
+          </w:tcPr>
+          <w:p>
+            <w:pPr>
+              <w:spacing w:after="30" w:before="0" w:line="240"/>
+              <w:jc w:val="left"/>
+            </w:pPr>
+            <w:r>
+              <w:rPr>
+                <w:rFonts w:ascii="Times New Roman" w:cs="Times New Roman" w:eastAsia="Times New Roman" w:hAnsi="Times New Roman"/>
+                <w:sz w:val="16"/>
+                <w:szCs w:val="16"/>
+              </w:rPr>
+              <w:t xml:space="preserve">IQAC 10.4.2 'assessing project work'</w:t>
+            </w:r>
+          </w:p>
+        </w:tc>
+      </w:tr>
+      <w:tr>
+        <w:trPr>
+          <w:cantSplit/>
+          <w:tblHeader w:val="off"/>
+        </w:trPr>
+        <w:tc>
+          <w:tcPr>
+            <w:tcW w:type="dxa" w:w="2863"/>
+            <w:tcMar>
+              <w:top w:type="dxa" w:w="50"/>
+              <w:left w:type="dxa" w:w="90"/>
+              <w:bottom w:type="dxa" w:w="50"/>
+              <w:right w:type="dxa" w:w="90"/>
+            </w:tcMar>
+            <w:vAlign w:val="top"/>
+          </w:tcPr>
+          <w:p>
+            <w:pPr>
+              <w:spacing w:after="30" w:before="0" w:line="240"/>
+              <w:jc w:val="left"/>
+            </w:pPr>
+            <w:r>
+              <w:rPr>
+                <w:rFonts w:ascii="Times New Roman" w:cs="Times New Roman" w:eastAsia="Times New Roman" w:hAnsi="Times New Roman"/>
+                <w:sz w:val="16"/>
+                <w:szCs w:val="16"/>
+              </w:rPr>
+              <w:t xml:space="preserve">10.4.3_Industry_Visits\10.4.3-01_Visit_Permission_Request_Letter.docx</w:t>
+            </w:r>
+          </w:p>
+        </w:tc>
+        <w:tc>
+          <w:tcPr>
+            <w:tcW w:type="dxa" w:w="2704"/>
+            <w:tcMar>
+              <w:top w:type="dxa" w:w="50"/>
+              <w:left w:type="dxa" w:w="90"/>
+              <w:bottom w:type="dxa" w:w="50"/>
+              <w:right w:type="dxa" w:w="90"/>
+            </w:tcMar>
+            <w:vAlign w:val="top"/>
+          </w:tcPr>
+          <w:p>
+            <w:pPr>
+              <w:spacing w:after="30" w:before="0" w:line="240"/>
+              <w:jc w:val="left"/>
+            </w:pPr>
+            <w:r>
+              <w:rPr>
+                <w:rFonts w:ascii="Times New Roman" w:cs="Times New Roman" w:eastAsia="Times New Roman" w:hAnsi="Times New Roman"/>
+                <w:sz w:val="16"/>
+                <w:szCs w:val="16"/>
+              </w:rPr>
+              <w:t xml:space="preserve">Request with learning objectives and named faculty in charge.</w:t>
+            </w:r>
+          </w:p>
+        </w:tc>
+        <w:tc>
+          <w:tcPr>
+            <w:tcW w:type="dxa" w:w="3659"/>
+            <w:tcMar>
+              <w:top w:type="dxa" w:w="50"/>
+              <w:left w:type="dxa" w:w="90"/>
+              <w:bottom w:type="dxa" w:w="50"/>
+              <w:right w:type="dxa" w:w="90"/>
+            </w:tcMar>
+            <w:vAlign w:val="top"/>
+          </w:tcPr>
+          <w:p>
+            <w:pPr>
+              <w:spacing w:after="30" w:before="0" w:line="240"/>
+              <w:jc w:val="left"/>
+            </w:pPr>
+            <w:r>
+              <w:rPr>
+                <w:rFonts w:ascii="Times New Roman" w:cs="Times New Roman" w:eastAsia="Times New Roman" w:hAnsi="Times New Roman"/>
+                <w:sz w:val="16"/>
+                <w:szCs w:val="16"/>
+              </w:rPr>
+              <w:t xml:space="preserve">- File the company's reply with this letter. Every visit in the visit register needs a letter and a reply.</w:t>
+            </w:r>
+          </w:p>
+        </w:tc>
+        <w:tc>
+          <w:tcPr>
+            <w:tcW w:type="dxa" w:w="1909"/>
+            <w:tcMar>
+              <w:top w:type="dxa" w:w="50"/>
+              <w:left w:type="dxa" w:w="90"/>
+              <w:bottom w:type="dxa" w:w="50"/>
+              <w:right w:type="dxa" w:w="90"/>
+            </w:tcMar>
+            <w:vAlign w:val="top"/>
+          </w:tcPr>
+          <w:p>
+            <w:pPr>
+              <w:spacing w:after="30" w:before="0" w:line="240"/>
+              <w:jc w:val="left"/>
+            </w:pPr>
+            <w:r>
+              <w:rPr>
+                <w:rFonts w:ascii="Times New Roman" w:cs="Times New Roman" w:eastAsia="Times New Roman" w:hAnsi="Times New Roman"/>
+                <w:sz w:val="16"/>
+                <w:szCs w:val="16"/>
+              </w:rPr>
+              <w:t xml:space="preserve">Head signs</w:t>
+            </w:r>
+          </w:p>
+        </w:tc>
+        <w:tc>
+          <w:tcPr>
+            <w:tcW w:type="dxa" w:w="1431"/>
+            <w:tcMar>
+              <w:top w:type="dxa" w:w="50"/>
+              <w:left w:type="dxa" w:w="90"/>
+              <w:bottom w:type="dxa" w:w="50"/>
+              <w:right w:type="dxa" w:w="90"/>
+            </w:tcMar>
+            <w:vAlign w:val="top"/>
+          </w:tcPr>
+          <w:p>
+            <w:pPr>
+              <w:spacing w:after="30" w:before="0" w:line="240"/>
+              <w:jc w:val="left"/>
+            </w:pPr>
+            <w:r>
+              <w:rPr>
+                <w:rFonts w:ascii="Times New Roman" w:cs="Times New Roman" w:eastAsia="Times New Roman" w:hAnsi="Times New Roman"/>
+                <w:sz w:val="16"/>
+                <w:szCs w:val="16"/>
+              </w:rPr>
+              <w:t xml:space="preserve">At least 2 weeks before each visit</w:t>
+            </w:r>
+          </w:p>
+        </w:tc>
+        <w:tc>
+          <w:tcPr>
+            <w:tcW w:type="dxa" w:w="2072"/>
+            <w:tcMar>
+              <w:top w:type="dxa" w:w="50"/>
+              <w:left w:type="dxa" w:w="90"/>
+              <w:bottom w:type="dxa" w:w="50"/>
+              <w:right w:type="dxa" w:w="90"/>
+            </w:tcMar>
+            <w:vAlign w:val="top"/>
+          </w:tcPr>
+          <w:p>
+            <w:pPr>
+              <w:spacing w:after="30" w:before="0" w:line="240"/>
+              <w:jc w:val="left"/>
+            </w:pPr>
+            <w:r>
+              <w:rPr>
+                <w:rFonts w:ascii="Times New Roman" w:cs="Times New Roman" w:eastAsia="Times New Roman" w:hAnsi="Times New Roman"/>
+                <w:sz w:val="16"/>
+                <w:szCs w:val="16"/>
+              </w:rPr>
+              <w:t xml:space="preserve">IQAC 10.4.3 faculty involvement; visit letters</w:t>
+            </w:r>
+          </w:p>
+        </w:tc>
+      </w:tr>
+      <w:tr>
+        <w:trPr>
+          <w:cantSplit/>
+          <w:tblHeader w:val="off"/>
+        </w:trPr>
+        <w:tc>
+          <w:tcPr>
+            <w:tcW w:type="dxa" w:w="2863"/>
+            <w:tcMar>
+              <w:top w:type="dxa" w:w="50"/>
+              <w:left w:type="dxa" w:w="90"/>
+              <w:bottom w:type="dxa" w:w="50"/>
+              <w:right w:type="dxa" w:w="90"/>
+            </w:tcMar>
+            <w:vAlign w:val="top"/>
+          </w:tcPr>
+          <w:p>
+            <w:pPr>
+              <w:spacing w:after="30" w:before="0" w:line="240"/>
+              <w:jc w:val="left"/>
+            </w:pPr>
+            <w:r>
+              <w:rPr>
+                <w:rFonts w:ascii="Times New Roman" w:cs="Times New Roman" w:eastAsia="Times New Roman" w:hAnsi="Times New Roman"/>
+                <w:sz w:val="16"/>
+                <w:szCs w:val="16"/>
+              </w:rPr>
+              <w:t xml:space="preserve">10.4.3_Industry_Visits\10.4.3-02_Visit_Notice_and_Attendance.docx</w:t>
+            </w:r>
+          </w:p>
+        </w:tc>
+        <w:tc>
+          <w:tcPr>
+            <w:tcW w:type="dxa" w:w="2704"/>
+            <w:tcMar>
+              <w:top w:type="dxa" w:w="50"/>
+              <w:left w:type="dxa" w:w="90"/>
+              <w:bottom w:type="dxa" w:w="50"/>
+              <w:right w:type="dxa" w:w="90"/>
+            </w:tcMar>
+            <w:vAlign w:val="top"/>
+          </w:tcPr>
+          <w:p>
+            <w:pPr>
+              <w:spacing w:after="30" w:before="0" w:line="240"/>
+              <w:jc w:val="left"/>
+            </w:pPr>
+            <w:r>
+              <w:rPr>
+                <w:rFonts w:ascii="Times New Roman" w:cs="Times New Roman" w:eastAsia="Times New Roman" w:hAnsi="Times New Roman"/>
+                <w:sz w:val="16"/>
+                <w:szCs w:val="16"/>
+              </w:rPr>
+              <w:t xml:space="preserve">Notice to students plus a departure/return attendance sheet.</w:t>
+            </w:r>
+          </w:p>
+        </w:tc>
+        <w:tc>
+          <w:tcPr>
+            <w:tcW w:type="dxa" w:w="3659"/>
+            <w:tcMar>
+              <w:top w:type="dxa" w:w="50"/>
+              <w:left w:type="dxa" w:w="90"/>
+              <w:bottom w:type="dxa" w:w="50"/>
+              <w:right w:type="dxa" w:w="90"/>
+            </w:tcMar>
+            <w:vAlign w:val="top"/>
+          </w:tcPr>
+          <w:p>
+            <w:pPr>
+              <w:spacing w:after="30" w:before="0" w:line="240"/>
+              <w:jc w:val="left"/>
+            </w:pPr>
+            <w:r>
+              <w:rPr>
+                <w:rFonts w:ascii="Times New Roman" w:cs="Times New Roman" w:eastAsia="Times New Roman" w:hAnsi="Times New Roman"/>
+                <w:sz w:val="16"/>
+                <w:szCs w:val="16"/>
+              </w:rPr>
+              <w:t xml:space="preserve">- Students sign in ink at departure and return.</w:t>
+            </w:r>
+          </w:p>
+        </w:tc>
+        <w:tc>
+          <w:tcPr>
+            <w:tcW w:type="dxa" w:w="1909"/>
+            <w:tcMar>
+              <w:top w:type="dxa" w:w="50"/>
+              <w:left w:type="dxa" w:w="90"/>
+              <w:bottom w:type="dxa" w:w="50"/>
+              <w:right w:type="dxa" w:w="90"/>
+            </w:tcMar>
+            <w:vAlign w:val="top"/>
+          </w:tcPr>
+          <w:p>
+            <w:pPr>
+              <w:spacing w:after="30" w:before="0" w:line="240"/>
+              <w:jc w:val="left"/>
+            </w:pPr>
+            <w:r>
+              <w:rPr>
+                <w:rFonts w:ascii="Times New Roman" w:cs="Times New Roman" w:eastAsia="Times New Roman" w:hAnsi="Times New Roman"/>
+                <w:sz w:val="16"/>
+                <w:szCs w:val="16"/>
+              </w:rPr>
+              <w:t xml:space="preserve">Faculty in charge</w:t>
+            </w:r>
+          </w:p>
+        </w:tc>
+        <w:tc>
+          <w:tcPr>
+            <w:tcW w:type="dxa" w:w="1431"/>
+            <w:tcMar>
+              <w:top w:type="dxa" w:w="50"/>
+              <w:left w:type="dxa" w:w="90"/>
+              <w:bottom w:type="dxa" w:w="50"/>
+              <w:right w:type="dxa" w:w="90"/>
+            </w:tcMar>
+            <w:vAlign w:val="top"/>
+          </w:tcPr>
+          <w:p>
+            <w:pPr>
+              <w:spacing w:after="30" w:before="0" w:line="240"/>
+              <w:jc w:val="left"/>
+            </w:pPr>
+            <w:r>
+              <w:rPr>
+                <w:rFonts w:ascii="Times New Roman" w:cs="Times New Roman" w:eastAsia="Times New Roman" w:hAnsi="Times New Roman"/>
+                <w:sz w:val="16"/>
+                <w:szCs w:val="16"/>
+              </w:rPr>
+              <w:t xml:space="preserve">Before and on the visit day</w:t>
+            </w:r>
+          </w:p>
+        </w:tc>
+        <w:tc>
+          <w:tcPr>
+            <w:tcW w:type="dxa" w:w="2072"/>
+            <w:tcMar>
+              <w:top w:type="dxa" w:w="50"/>
+              <w:left w:type="dxa" w:w="90"/>
+              <w:bottom w:type="dxa" w:w="50"/>
+              <w:right w:type="dxa" w:w="90"/>
+            </w:tcMar>
+            <w:vAlign w:val="top"/>
+          </w:tcPr>
+          <w:p>
+            <w:pPr>
+              <w:spacing w:after="30" w:before="0" w:line="240"/>
+              <w:jc w:val="left"/>
+            </w:pPr>
+            <w:r>
+              <w:rPr>
+                <w:rFonts w:ascii="Times New Roman" w:cs="Times New Roman" w:eastAsia="Times New Roman" w:hAnsi="Times New Roman"/>
+                <w:sz w:val="16"/>
+                <w:szCs w:val="16"/>
+              </w:rPr>
+              <w:t xml:space="preserve">10.4.3 nature of visits; supporting documents</w:t>
+            </w:r>
+          </w:p>
+        </w:tc>
+      </w:tr>
+      <w:tr>
+        <w:trPr>
+          <w:cantSplit/>
+          <w:tblHeader w:val="off"/>
+        </w:trPr>
+        <w:tc>
+          <w:tcPr>
+            <w:tcW w:type="dxa" w:w="2863"/>
+            <w:tcMar>
+              <w:top w:type="dxa" w:w="50"/>
+              <w:left w:type="dxa" w:w="90"/>
+              <w:bottom w:type="dxa" w:w="50"/>
+              <w:right w:type="dxa" w:w="90"/>
+            </w:tcMar>
+            <w:vAlign w:val="top"/>
+          </w:tcPr>
+          <w:p>
+            <w:pPr>
+              <w:spacing w:after="30" w:before="0" w:line="240"/>
+              <w:jc w:val="left"/>
+            </w:pPr>
+            <w:r>
+              <w:rPr>
+                <w:rFonts w:ascii="Times New Roman" w:cs="Times New Roman" w:eastAsia="Times New Roman" w:hAnsi="Times New Roman"/>
+                <w:sz w:val="16"/>
+                <w:szCs w:val="16"/>
+              </w:rPr>
+              <w:t xml:space="preserve">10.4.3_Industry_Visits\10.4.3-03_Faculty_Visit_Report.docx</w:t>
+            </w:r>
+          </w:p>
+        </w:tc>
+        <w:tc>
+          <w:tcPr>
+            <w:tcW w:type="dxa" w:w="2704"/>
+            <w:tcMar>
+              <w:top w:type="dxa" w:w="50"/>
+              <w:left w:type="dxa" w:w="90"/>
+              <w:bottom w:type="dxa" w:w="50"/>
+              <w:right w:type="dxa" w:w="90"/>
+            </w:tcMar>
+            <w:vAlign w:val="top"/>
+          </w:tcPr>
+          <w:p>
+            <w:pPr>
+              <w:spacing w:after="30" w:before="0" w:line="240"/>
+              <w:jc w:val="left"/>
+            </w:pPr>
+            <w:r>
+              <w:rPr>
+                <w:rFonts w:ascii="Times New Roman" w:cs="Times New Roman" w:eastAsia="Times New Roman" w:hAnsi="Times New Roman"/>
+                <w:sz w:val="16"/>
+                <w:szCs w:val="16"/>
+              </w:rPr>
+              <w:t xml:space="preserve">Faculty-signed record of each visit (planning, supervision, documentation).</w:t>
+            </w:r>
+          </w:p>
+        </w:tc>
+        <w:tc>
+          <w:tcPr>
+            <w:tcW w:type="dxa" w:w="3659"/>
+            <w:tcMar>
+              <w:top w:type="dxa" w:w="50"/>
+              <w:left w:type="dxa" w:w="90"/>
+              <w:bottom w:type="dxa" w:w="50"/>
+              <w:right w:type="dxa" w:w="90"/>
+            </w:tcMar>
+            <w:vAlign w:val="top"/>
+          </w:tcPr>
+          <w:p>
+            <w:pPr>
+              <w:spacing w:after="30" w:before="0" w:line="240"/>
+              <w:jc w:val="left"/>
+            </w:pPr>
+            <w:r>
+              <w:rPr>
+                <w:rFonts w:ascii="Times New Roman" w:cs="Times New Roman" w:eastAsia="Times New Roman" w:hAnsi="Times New Roman"/>
+                <w:sz w:val="16"/>
+                <w:szCs w:val="16"/>
+              </w:rPr>
+              <w:t xml:space="preserve">- Attach the permission letter, the company's reply, the attendance sheet and the photo file names.</w:t>
+            </w:r>
+          </w:p>
+        </w:tc>
+        <w:tc>
+          <w:tcPr>
+            <w:tcW w:type="dxa" w:w="1909"/>
+            <w:tcMar>
+              <w:top w:type="dxa" w:w="50"/>
+              <w:left w:type="dxa" w:w="90"/>
+              <w:bottom w:type="dxa" w:w="50"/>
+              <w:right w:type="dxa" w:w="90"/>
+            </w:tcMar>
+            <w:vAlign w:val="top"/>
+          </w:tcPr>
+          <w:p>
+            <w:pPr>
+              <w:spacing w:after="30" w:before="0" w:line="240"/>
+              <w:jc w:val="left"/>
+            </w:pPr>
+            <w:r>
+              <w:rPr>
+                <w:rFonts w:ascii="Times New Roman" w:cs="Times New Roman" w:eastAsia="Times New Roman" w:hAnsi="Times New Roman"/>
+                <w:sz w:val="16"/>
+                <w:szCs w:val="16"/>
+              </w:rPr>
+              <w:t xml:space="preserve">Faculty in charge</w:t>
+            </w:r>
+          </w:p>
+        </w:tc>
+        <w:tc>
+          <w:tcPr>
+            <w:tcW w:type="dxa" w:w="1431"/>
+            <w:tcMar>
+              <w:top w:type="dxa" w:w="50"/>
+              <w:left w:type="dxa" w:w="90"/>
+              <w:bottom w:type="dxa" w:w="50"/>
+              <w:right w:type="dxa" w:w="90"/>
+            </w:tcMar>
+            <w:vAlign w:val="top"/>
+          </w:tcPr>
+          <w:p>
+            <w:pPr>
+              <w:spacing w:after="30" w:before="0" w:line="240"/>
+              <w:jc w:val="left"/>
+            </w:pPr>
+            <w:r>
+              <w:rPr>
+                <w:rFonts w:ascii="Times New Roman" w:cs="Times New Roman" w:eastAsia="Times New Roman" w:hAnsi="Times New Roman"/>
+                <w:sz w:val="16"/>
+                <w:szCs w:val="16"/>
+              </w:rPr>
+              <w:t xml:space="preserve">Within 7 days of the visit</w:t>
+            </w:r>
+          </w:p>
+        </w:tc>
+        <w:tc>
+          <w:tcPr>
+            <w:tcW w:type="dxa" w:w="2072"/>
+            <w:tcMar>
+              <w:top w:type="dxa" w:w="50"/>
+              <w:left w:type="dxa" w:w="90"/>
+              <w:bottom w:type="dxa" w:w="50"/>
+              <w:right w:type="dxa" w:w="90"/>
+            </w:tcMar>
+            <w:vAlign w:val="top"/>
+          </w:tcPr>
+          <w:p>
+            <w:pPr>
+              <w:spacing w:after="30" w:before="0" w:line="240"/>
+              <w:jc w:val="left"/>
+            </w:pPr>
+            <w:r>
+              <w:rPr>
+                <w:rFonts w:ascii="Times New Roman" w:cs="Times New Roman" w:eastAsia="Times New Roman" w:hAnsi="Times New Roman"/>
+                <w:sz w:val="16"/>
+                <w:szCs w:val="16"/>
+              </w:rPr>
+              <w:t xml:space="preserve">IQAC 10.4.3 'limited involvement of the faculty'</w:t>
+            </w:r>
+          </w:p>
+        </w:tc>
+      </w:tr>
+      <w:tr>
+        <w:trPr>
+          <w:cantSplit/>
+          <w:tblHeader w:val="off"/>
+        </w:trPr>
+        <w:tc>
+          <w:tcPr>
+            <w:tcW w:type="dxa" w:w="2863"/>
+            <w:tcMar>
+              <w:top w:type="dxa" w:w="50"/>
+              <w:left w:type="dxa" w:w="90"/>
+              <w:bottom w:type="dxa" w:w="50"/>
+              <w:right w:type="dxa" w:w="90"/>
+            </w:tcMar>
+            <w:vAlign w:val="top"/>
+          </w:tcPr>
+          <w:p>
+            <w:pPr>
+              <w:spacing w:after="30" w:before="0" w:line="240"/>
+              <w:jc w:val="left"/>
+            </w:pPr>
+            <w:r>
+              <w:rPr>
+                <w:rFonts w:ascii="Times New Roman" w:cs="Times New Roman" w:eastAsia="Times New Roman" w:hAnsi="Times New Roman"/>
+                <w:sz w:val="16"/>
+                <w:szCs w:val="16"/>
+              </w:rPr>
+              <w:t xml:space="preserve">10.4.3_Industry_Visits\10.4.3-04_Student_Visit_Report_and_Assessment_Rubric.docx</w:t>
+            </w:r>
+          </w:p>
+        </w:tc>
+        <w:tc>
+          <w:tcPr>
+            <w:tcW w:type="dxa" w:w="2704"/>
+            <w:tcMar>
+              <w:top w:type="dxa" w:w="50"/>
+              <w:left w:type="dxa" w:w="90"/>
+              <w:bottom w:type="dxa" w:w="50"/>
+              <w:right w:type="dxa" w:w="90"/>
+            </w:tcMar>
+            <w:vAlign w:val="top"/>
+          </w:tcPr>
+          <w:p>
+            <w:pPr>
+              <w:spacing w:after="30" w:before="0" w:line="240"/>
+              <w:jc w:val="left"/>
+            </w:pPr>
+            <w:r>
+              <w:rPr>
+                <w:rFonts w:ascii="Times New Roman" w:cs="Times New Roman" w:eastAsia="Times New Roman" w:hAnsi="Times New Roman"/>
+                <w:sz w:val="16"/>
+                <w:szCs w:val="16"/>
+              </w:rPr>
+              <w:t xml:space="preserve">Report template plus a marked rubric mapped to POs (how learning is assessed).</w:t>
+            </w:r>
+          </w:p>
+        </w:tc>
+        <w:tc>
+          <w:tcPr>
+            <w:tcW w:type="dxa" w:w="3659"/>
+            <w:tcMar>
+              <w:top w:type="dxa" w:w="50"/>
+              <w:left w:type="dxa" w:w="90"/>
+              <w:bottom w:type="dxa" w:w="50"/>
+              <w:right w:type="dxa" w:w="90"/>
+            </w:tcMar>
+            <w:vAlign w:val="top"/>
+          </w:tcPr>
+          <w:p>
+            <w:pPr>
+              <w:spacing w:after="30" w:before="0" w:line="240"/>
+              <w:jc w:val="left"/>
+            </w:pPr>
+            <w:r>
+              <w:rPr>
+                <w:rFonts w:ascii="Times New Roman" w:cs="Times New Roman" w:eastAsia="Times New Roman" w:hAnsi="Times New Roman"/>
+                <w:sz w:val="16"/>
+                <w:szCs w:val="16"/>
+              </w:rPr>
+              <w:t xml:space="preserve">- Students write sections 1-6. Faculty fill in the assessment box. The PO mapping is a PROPOSAL for department approval.</w:t>
+            </w:r>
+          </w:p>
+          <w:p>
+            <w:pPr>
+              <w:spacing w:after="30" w:before="0" w:line="240"/>
+              <w:jc w:val="left"/>
+            </w:pPr>
+            <w:r>
+              <w:rPr>
+                <w:rFonts w:ascii="Times New Roman" w:cs="Times New Roman" w:eastAsia="Times New Roman" w:hAnsi="Times New Roman"/>
+                <w:sz w:val="16"/>
+                <w:szCs w:val="16"/>
+              </w:rPr>
+              <w:t xml:space="preserve">- Do not attach unrelated certificates (e.g. online-course certificates) to visit reports.</w:t>
+            </w:r>
+          </w:p>
+        </w:tc>
+        <w:tc>
+          <w:tcPr>
+            <w:tcW w:type="dxa" w:w="1909"/>
+            <w:tcMar>
+              <w:top w:type="dxa" w:w="50"/>
+              <w:left w:type="dxa" w:w="90"/>
+              <w:bottom w:type="dxa" w:w="50"/>
+              <w:right w:type="dxa" w:w="90"/>
+            </w:tcMar>
+            <w:vAlign w:val="top"/>
+          </w:tcPr>
+          <w:p>
+            <w:pPr>
+              <w:spacing w:after="30" w:before="0" w:line="240"/>
+              <w:jc w:val="left"/>
+            </w:pPr>
+            <w:r>
+              <w:rPr>
+                <w:rFonts w:ascii="Times New Roman" w:cs="Times New Roman" w:eastAsia="Times New Roman" w:hAnsi="Times New Roman"/>
+                <w:sz w:val="16"/>
+                <w:szCs w:val="16"/>
+              </w:rPr>
+              <w:t xml:space="preserve">Student writes; faculty marks</w:t>
+            </w:r>
+          </w:p>
+        </w:tc>
+        <w:tc>
+          <w:tcPr>
+            <w:tcW w:type="dxa" w:w="1431"/>
+            <w:tcMar>
+              <w:top w:type="dxa" w:w="50"/>
+              <w:left w:type="dxa" w:w="90"/>
+              <w:bottom w:type="dxa" w:w="50"/>
+              <w:right w:type="dxa" w:w="90"/>
+            </w:tcMar>
+            <w:vAlign w:val="top"/>
+          </w:tcPr>
+          <w:p>
+            <w:pPr>
+              <w:spacing w:after="30" w:before="0" w:line="240"/>
+              <w:jc w:val="left"/>
+            </w:pPr>
+            <w:r>
+              <w:rPr>
+                <w:rFonts w:ascii="Times New Roman" w:cs="Times New Roman" w:eastAsia="Times New Roman" w:hAnsi="Times New Roman"/>
+                <w:sz w:val="16"/>
+                <w:szCs w:val="16"/>
+              </w:rPr>
+              <w:t xml:space="preserve">After each visit</w:t>
+            </w:r>
+          </w:p>
+        </w:tc>
+        <w:tc>
+          <w:tcPr>
+            <w:tcW w:type="dxa" w:w="2072"/>
+            <w:tcMar>
+              <w:top w:type="dxa" w:w="50"/>
+              <w:left w:type="dxa" w:w="90"/>
+              <w:bottom w:type="dxa" w:w="50"/>
+              <w:right w:type="dxa" w:w="90"/>
+            </w:tcMar>
+            <w:vAlign w:val="top"/>
+          </w:tcPr>
+          <w:p>
+            <w:pPr>
+              <w:spacing w:after="30" w:before="0" w:line="240"/>
+              <w:jc w:val="left"/>
+            </w:pPr>
+            <w:r>
+              <w:rPr>
+                <w:rFonts w:ascii="Times New Roman" w:cs="Times New Roman" w:eastAsia="Times New Roman" w:hAnsi="Times New Roman"/>
+                <w:sz w:val="16"/>
+                <w:szCs w:val="16"/>
+              </w:rPr>
+              <w:t xml:space="preserve">IQAC 10.4.3 'how student learning and outcome achievement ... are assessed'</w:t>
+            </w:r>
+          </w:p>
+        </w:tc>
+      </w:tr>
+      <w:tr>
+        <w:trPr>
+          <w:cantSplit/>
+          <w:tblHeader w:val="off"/>
+        </w:trPr>
+        <w:tc>
+          <w:tcPr>
+            <w:tcW w:type="dxa" w:w="2863"/>
+            <w:tcMar>
+              <w:top w:type="dxa" w:w="50"/>
+              <w:left w:type="dxa" w:w="90"/>
+              <w:bottom w:type="dxa" w:w="50"/>
+              <w:right w:type="dxa" w:w="90"/>
+            </w:tcMar>
+            <w:vAlign w:val="top"/>
+          </w:tcPr>
+          <w:p>
+            <w:pPr>
+              <w:spacing w:after="30" w:before="0" w:line="240"/>
+              <w:jc w:val="left"/>
+            </w:pPr>
+            <w:r>
+              <w:rPr>
+                <w:rFonts w:ascii="Times New Roman" w:cs="Times New Roman" w:eastAsia="Times New Roman" w:hAnsi="Times New Roman"/>
+                <w:sz w:val="16"/>
+                <w:szCs w:val="16"/>
+              </w:rPr>
               <w:t xml:space="preserve">10.4.3_Industry_Visits\10.4.3-05_Industry_Visit_Register_Spring2023-Fall2025.xlsx</w:t>
             </w:r>
           </w:p>
@@ -6442,6 +8970,168 @@
                 <w:szCs w:val="16"/>
               </w:rPr>
               <w:t xml:space="preserve">10.4.3 nature of visits; faculty involvement</w:t>
+            </w:r>
+          </w:p>
+        </w:tc>
+      </w:tr>
+      <w:tr>
+        <w:trPr>
+          <w:cantSplit/>
+          <w:tblHeader w:val="off"/>
+        </w:trPr>
+        <w:tc>
+          <w:tcPr>
+            <w:tcW w:type="dxa" w:w="2863"/>
+            <w:tcMar>
+              <w:top w:type="dxa" w:w="50"/>
+              <w:left w:type="dxa" w:w="90"/>
+              <w:bottom w:type="dxa" w:w="50"/>
+              <w:right w:type="dxa" w:w="90"/>
+            </w:tcMar>
+            <w:vAlign w:val="top"/>
+          </w:tcPr>
+          <w:p>
+            <w:pPr>
+              <w:spacing w:after="30" w:before="0" w:line="240"/>
+              <w:jc w:val="left"/>
+            </w:pPr>
+            <w:r>
+              <w:rPr>
+                <w:rFonts w:ascii="Times New Roman" w:cs="Times New Roman" w:eastAsia="Times New Roman" w:hAnsi="Times New Roman"/>
+                <w:sz w:val="16"/>
+                <w:szCs w:val="16"/>
+              </w:rPr>
+              <w:t xml:space="preserve">10.4.3_Industry_Visits\10.4.3-06_Visit_Assessment_Mark_Sheet_and_Attainment.xlsx</w:t>
+            </w:r>
+          </w:p>
+        </w:tc>
+        <w:tc>
+          <w:tcPr>
+            <w:tcW w:type="dxa" w:w="2704"/>
+            <w:tcMar>
+              <w:top w:type="dxa" w:w="50"/>
+              <w:left w:type="dxa" w:w="90"/>
+              <w:bottom w:type="dxa" w:w="50"/>
+              <w:right w:type="dxa" w:w="90"/>
+            </w:tcMar>
+            <w:vAlign w:val="top"/>
+          </w:tcPr>
+          <w:p>
+            <w:pPr>
+              <w:spacing w:after="30" w:before="0" w:line="240"/>
+              <w:jc w:val="left"/>
+            </w:pPr>
+            <w:r>
+              <w:rPr>
+                <w:rFonts w:ascii="Times New Roman" w:cs="Times New Roman" w:eastAsia="Times New Roman" w:hAnsi="Times New Roman"/>
+                <w:sz w:val="16"/>
+                <w:szCs w:val="16"/>
+              </w:rPr>
+              <w:t xml:space="preserve">Marks of each student per visit (rubric 10.4.3-04) with criterion and PO attainment calculated.</w:t>
+            </w:r>
+          </w:p>
+        </w:tc>
+        <w:tc>
+          <w:tcPr>
+            <w:tcW w:type="dxa" w:w="3659"/>
+            <w:tcMar>
+              <w:top w:type="dxa" w:w="50"/>
+              <w:left w:type="dxa" w:w="90"/>
+              <w:bottom w:type="dxa" w:w="50"/>
+              <w:right w:type="dxa" w:w="90"/>
+            </w:tcMar>
+            <w:vAlign w:val="top"/>
+          </w:tcPr>
+          <w:p>
+            <w:pPr>
+              <w:spacing w:after="30" w:before="0" w:line="240"/>
+              <w:jc w:val="left"/>
+            </w:pPr>
+            <w:r>
+              <w:rPr>
+                <w:rFonts w:ascii="Times New Roman" w:cs="Times New Roman" w:eastAsia="Times New Roman" w:hAnsi="Times New Roman"/>
+                <w:sz w:val="16"/>
+                <w:szCs w:val="16"/>
+              </w:rPr>
+              <w:t xml:space="preserve">- One row per student per visit. Every visit must also be in the register 10.4.3-05.</w:t>
+            </w:r>
+          </w:p>
+        </w:tc>
+        <w:tc>
+          <w:tcPr>
+            <w:tcW w:type="dxa" w:w="1909"/>
+            <w:tcMar>
+              <w:top w:type="dxa" w:w="50"/>
+              <w:left w:type="dxa" w:w="90"/>
+              <w:bottom w:type="dxa" w:w="50"/>
+              <w:right w:type="dxa" w:w="90"/>
+            </w:tcMar>
+            <w:vAlign w:val="top"/>
+          </w:tcPr>
+          <w:p>
+            <w:pPr>
+              <w:spacing w:after="30" w:before="0" w:line="240"/>
+              <w:jc w:val="left"/>
+            </w:pPr>
+            <w:r>
+              <w:rPr>
+                <w:rFonts w:ascii="Times New Roman" w:cs="Times New Roman" w:eastAsia="Times New Roman" w:hAnsi="Times New Roman"/>
+                <w:sz w:val="16"/>
+                <w:szCs w:val="16"/>
+              </w:rPr>
+              <w:t xml:space="preserve">Faculty in charge</w:t>
+            </w:r>
+          </w:p>
+        </w:tc>
+        <w:tc>
+          <w:tcPr>
+            <w:tcW w:type="dxa" w:w="1431"/>
+            <w:tcMar>
+              <w:top w:type="dxa" w:w="50"/>
+              <w:left w:type="dxa" w:w="90"/>
+              <w:bottom w:type="dxa" w:w="50"/>
+              <w:right w:type="dxa" w:w="90"/>
+            </w:tcMar>
+            <w:vAlign w:val="top"/>
+          </w:tcPr>
+          <w:p>
+            <w:pPr>
+              <w:spacing w:after="30" w:before="0" w:line="240"/>
+              <w:jc w:val="left"/>
+            </w:pPr>
+            <w:r>
+              <w:rPr>
+                <w:rFonts w:ascii="Times New Roman" w:cs="Times New Roman" w:eastAsia="Times New Roman" w:hAnsi="Times New Roman"/>
+                <w:sz w:val="16"/>
+                <w:szCs w:val="16"/>
+              </w:rPr>
+              <w:t xml:space="preserve">After each visit</w:t>
+            </w:r>
+          </w:p>
+        </w:tc>
+        <w:tc>
+          <w:tcPr>
+            <w:tcW w:type="dxa" w:w="2072"/>
+            <w:tcMar>
+              <w:top w:type="dxa" w:w="50"/>
+              <w:left w:type="dxa" w:w="90"/>
+              <w:bottom w:type="dxa" w:w="50"/>
+              <w:right w:type="dxa" w:w="90"/>
+            </w:tcMar>
+            <w:vAlign w:val="top"/>
+          </w:tcPr>
+          <w:p>
+            <w:pPr>
+              <w:spacing w:after="30" w:before="0" w:line="240"/>
+              <w:jc w:val="left"/>
+            </w:pPr>
+            <w:r>
+              <w:rPr>
+                <w:rFonts w:ascii="Times New Roman" w:cs="Times New Roman" w:eastAsia="Times New Roman" w:hAnsi="Times New Roman"/>
+                <w:sz w:val="16"/>
+                <w:szCs w:val="16"/>
+              </w:rPr>
+              <w:t xml:space="preserve">IQAC 10.4.3 how learning from visits is assessed</w:t>
             </w:r>
           </w:p>
         </w:tc>

</xml_diff>